<commit_message>
feat(contracts): complete 14-clause bilingual contract template with exact rates and 8-page PDF formatting
</commit_message>
<xml_diff>
--- a/template_contract.docx
+++ b/template_contract.docx
@@ -48,7 +48,7 @@
       <w:r>
         <w:rPr>
           <w:b/>
-          <w:sz w:val="48"/>
+          <w:sz w:val="44"/>
         </w:rPr>
         <w:t>Mietvertrag</w:t>
         <w:br/>
@@ -56,230 +56,9 @@
       <w:r>
         <w:rPr>
           <w:color w:val="475569"/>
-          <w:sz w:val="26"/>
+          <w:sz w:val="24"/>
         </w:rPr>
         <w:t>Residential Lease Agreement &amp; House Rules (AGB)</w:t>
-      </w:r>
-    </w:p>
-    <w:p>
-      <w:pPr>
-        <w:spacing w:after="200"/>
-      </w:pPr>
-    </w:p>
-    <w:tbl>
-      <w:tblPr>
-        <w:tblW w:type="auto" w:w="0"/>
-        <w:jc w:val="center"/>
-        <w:tblLook w:firstColumn="1" w:firstRow="1" w:lastColumn="0" w:lastRow="0" w:noHBand="0" w:noVBand="1" w:val="04A0"/>
-      </w:tblPr>
-      <w:tblGrid>
-        <w:gridCol w:w="5162"/>
-        <w:gridCol w:w="5162"/>
-      </w:tblGrid>
-      <w:tr>
-        <w:tc>
-          <w:tcPr>
-            <w:tcW w:type="dxa" w:w="5040"/>
-          </w:tcPr>
-          <w:p>
-            <w:r>
-              <w:rPr>
-                <w:b/>
-              </w:rPr>
-              <w:t xml:space="preserve">Vermieter / Landlord: </w:t>
-            </w:r>
-            <w:r>
-              <w:t>Kylasam Nallagoundanpalayam Arruchamy</w:t>
-              <w:br/>
-              <w:t>Forckenbeckstraße 64, 14199 Berlin, Deutschland</w:t>
-            </w:r>
-          </w:p>
-        </w:tc>
-        <w:tc>
-          <w:tcPr>
-            <w:tcW w:type="dxa" w:w="5040"/>
-          </w:tcPr>
-          <w:p>
-            <w:r>
-              <w:rPr>
-                <w:b/>
-              </w:rPr>
-              <w:t xml:space="preserve">Mieter / Tenant: </w:t>
-            </w:r>
-            <w:r>
-              <w:t>Ajithkumar Velasseril Sreenivasan</w:t>
-              <w:br/>
-              <w:t>Gemäß Personalausweis / Passdokument</w:t>
-              <w:br/>
-              <w:t>ajithkmvs123@gmail.com | +91 8606817191</w:t>
-            </w:r>
-          </w:p>
-        </w:tc>
-      </w:tr>
-      <w:tr>
-        <w:tc>
-          <w:tcPr>
-            <w:tcW w:type="dxa" w:w="5040"/>
-          </w:tcPr>
-          <w:p>
-            <w:r>
-              <w:rPr>
-                <w:b/>
-              </w:rPr>
-              <w:t>Mietsache / Premises:</w:t>
-              <w:br/>
-            </w:r>
-            <w:r>
-              <w:t>Zimmer KE2 (ca. 23.92 m²)</w:t>
-              <w:br/>
-              <w:t>Lichtenrader Damm 80, 12305 Berlin</w:t>
-              <w:br/>
-              <w:t>Geschoss: 2. OG, Whg. WE-11</w:t>
-            </w:r>
-          </w:p>
-        </w:tc>
-        <w:tc>
-          <w:tcPr>
-            <w:tcW w:type="dxa" w:w="5040"/>
-          </w:tcPr>
-          <w:p>
-            <w:r>
-              <w:rPr>
-                <w:b/>
-              </w:rPr>
-              <w:t>Mietdauer &amp; Zweck / Term:</w:t>
-              <w:br/>
-            </w:r>
-            <w:r>
-              <w:t>2 Nov, 2026 bis 30 Apr, 2027</w:t>
-              <w:br/>
-              <w:t>Befristet gem. § 549 Abs. 2 BGB:</w:t>
-              <w:br/>
-              <w:t>Aufgrund eines Studien-, Praktikums- oder Erwerbsaufenthalts in Berlin</w:t>
-            </w:r>
-          </w:p>
-        </w:tc>
-      </w:tr>
-      <w:tr>
-        <w:tc>
-          <w:tcPr>
-            <w:tcW w:type="dxa" w:w="5040"/>
-          </w:tcPr>
-          <w:p>
-            <w:r>
-              <w:rPr>
-                <w:b/>
-              </w:rPr>
-              <w:t>Miete &amp; Nebenkosten:</w:t>
-              <w:br/>
-            </w:r>
-            <w:r>
-              <w:t>Monatlich 649 € (Sechshundertneunundvierzig EURO)</w:t>
-              <w:br/>
-              <w:t>Inkl. Nebenkosten &amp; 1000 Mbit/s WLAN</w:t>
-              <w:br/>
-              <w:t>Endreinigung: 70 €</w:t>
-              <w:br/>
-              <w:t>ARD-Rundfunkbeitrag: Von WG zu tragen</w:t>
-            </w:r>
-          </w:p>
-        </w:tc>
-        <w:tc>
-          <w:tcPr>
-            <w:tcW w:type="dxa" w:w="5040"/>
-          </w:tcPr>
-          <w:p>
-            <w:r>
-              <w:rPr>
-                <w:b/>
-              </w:rPr>
-              <w:t>Rent &amp; Utilities:</w:t>
-              <w:br/>
-            </w:r>
-            <w:r>
-              <w:t>Monthly €649 (Six hundred forty-nine EURO)</w:t>
-              <w:br/>
-              <w:t>Incl. utilities &amp; 1000 Mbps Wi-Fi</w:t>
-              <w:br/>
-              <w:t>Final cleaning: €70</w:t>
-              <w:br/>
-              <w:t>ARD public license fee: Paid by flatmates</w:t>
-            </w:r>
-          </w:p>
-        </w:tc>
-      </w:tr>
-      <w:tr>
-        <w:tc>
-          <w:tcPr>
-            <w:tcW w:type="dxa" w:w="5040"/>
-          </w:tcPr>
-          <w:p>
-            <w:r>
-              <w:rPr>
-                <w:b/>
-              </w:rPr>
-              <w:t>Kaution &amp; Bankkonto:</w:t>
-              <w:br/>
-            </w:r>
-            <w:r>
-              <w:t>Kaution: 1.000 € (Zahlung vor Einzug)</w:t>
-              <w:br/>
-              <w:t>IBAN: DE87100110012624542768</w:t>
-              <w:br/>
-              <w:t>BIC: NTSBDEB1XXX</w:t>
-              <w:br/>
-              <w:t>Inhaber: Kylasam Nallagoundanpalayam Arruchamy</w:t>
-            </w:r>
-          </w:p>
-        </w:tc>
-        <w:tc>
-          <w:tcPr>
-            <w:tcW w:type="dxa" w:w="5040"/>
-          </w:tcPr>
-          <w:p>
-            <w:r>
-              <w:rPr>
-                <w:b/>
-              </w:rPr>
-              <w:t>Deposit &amp; Bank Account:</w:t>
-              <w:br/>
-            </w:r>
-            <w:r>
-              <w:t>Deposit: €1.000 (credited prior to move-in)</w:t>
-              <w:br/>
-              <w:t>IBAN: DE87100110012624542768</w:t>
-              <w:br/>
-              <w:t>BIC: NTSBDEB1XXX</w:t>
-              <w:br/>
-              <w:t>Holder: Kylasam Nallagoundanpalayam Arruchamy</w:t>
-            </w:r>
-          </w:p>
-        </w:tc>
-      </w:tr>
-    </w:tbl>
-    <w:p>
-      <w:r>
-        <w:br w:type="page"/>
-      </w:r>
-    </w:p>
-    <w:p>
-      <w:pPr>
-        <w:jc w:val="center"/>
-      </w:pPr>
-      <w:r>
-        <w:rPr>
-          <w:b/>
-          <w:sz w:val="28"/>
-        </w:rPr>
-        <w:t>Allgemeine Mietvertragsbestimmungen &amp; Hausordnung (§ 1 – § 14)</w:t>
-        <w:br/>
-      </w:r>
-      <w:r>
-        <w:rPr>
-          <w:color w:val="475569"/>
-          <w:sz w:val="22"/>
-        </w:rPr>
-        <w:t>General Lease Terms &amp; House Rules (AGB § 1 – § 14)</w:t>
       </w:r>
     </w:p>
     <w:p>
@@ -294,8 +73,8 @@
         <w:tblLook w:firstColumn="1" w:firstRow="1" w:lastColumn="0" w:lastRow="0" w:noHBand="0" w:noVBand="1" w:val="04A0"/>
       </w:tblPr>
       <w:tblGrid>
-        <w:gridCol w:w="5162"/>
-        <w:gridCol w:w="5162"/>
+        <w:gridCol w:w="5234"/>
+        <w:gridCol w:w="5234"/>
       </w:tblGrid>
       <w:tr>
         <w:tc>
@@ -306,20 +85,11 @@
             <w:r>
               <w:rPr>
                 <w:b/>
-                <w:sz w:val="19"/>
               </w:rPr>
-              <w:t>§ 1 Mietdauer &amp; Befristungszweck (§ 549 Abs. 2 / § 575 BGB)</w:t>
-              <w:br/>
+              <w:t xml:space="preserve">Mieter / Tenant: </w:t>
             </w:r>
             <w:r>
-              <w:rPr>
-                <w:sz w:val="17"/>
-              </w:rPr>
-              <w:t>(1) Mietzeitraum: Das Mietverhältnis beginnt am 2 Nov, 2026 und endet am 30 Apr, 2027. Das Mietverhältnis ist befristet. Eine stillschweigende Verlängerung nach § 545 BGB ist ausdrücklich ausgeschlossen.</w:t>
-              <w:br/>
-              <w:t>(2) Zweck der Befristung: Die Vermietung erfolgt zum vorübergehenden Gebrauch gem. § 549 Abs. 2 Nr. 1 BGB (Aufgrund eines Studien-, Praktikums- oder Erwerbsaufenthalts in Berlin).</w:t>
-              <w:br/>
-              <w:t>(3) Mindestmietdauer: Die Mindestmietdauer beträgt sechs (6) Monate (bzw. die vereinbarte feste Vertragslaufzeit).</w:t>
+              <w:t>Ajithkumar Velasseril Sreenivasan</w:t>
             </w:r>
           </w:p>
         </w:tc>
@@ -331,21 +101,11 @@
             <w:r>
               <w:rPr>
                 <w:b/>
-                <w:color w:val="475569"/>
-                <w:sz w:val="19"/>
               </w:rPr>
-              <w:t>§ 1 Lease Term &amp; Temporary Purpose (§ 549 (2) / § 575 BGB)</w:t>
-              <w:br/>
+              <w:t xml:space="preserve">Mietobjekt / Room: </w:t>
             </w:r>
             <w:r>
-              <w:rPr>
-                <w:sz w:val="17"/>
-              </w:rPr>
-              <w:t>(1) Rental Term: Tenancy commences on 2 Nov, 2026 and terminates on 30 Apr, 2027. The lease is for a fixed term. Tacit renewal pursuant to Section 545 BGB is expressly excluded.</w:t>
-              <w:br/>
-              <w:t>(2) Purpose of Limitation: Concluded strictly for temporary living pursuant to Section 549 (2) No. 1 BGB (Due to an academic, internship, or professional stay in Berlin).</w:t>
-              <w:br/>
-              <w:t>(3) Minimum Term: The minimum rental term is six (6) months (or the agreed contract period).</w:t>
+              <w:t>Zimmer KE2 (Sonnige Balkon-Suite / Private Balcony Suite)</w:t>
             </w:r>
           </w:p>
         </w:tc>
@@ -359,20 +119,11 @@
             <w:r>
               <w:rPr>
                 <w:b/>
-                <w:sz w:val="19"/>
               </w:rPr>
-              <w:t>§ 2 Miethöhe, Pauschale &amp; Nebenkosten</w:t>
-              <w:br/>
+              <w:t xml:space="preserve">Liegenschaft / Address: </w:t>
             </w:r>
             <w:r>
-              <w:rPr>
-                <w:sz w:val="17"/>
-              </w:rPr>
-              <w:t>(1) Monatliche Gesamtmiete: Die monatliche Warmmiete beträgt pauschal 649 € (Sechshundertneunundvierzig EURO).</w:t>
-              <w:br/>
-              <w:t>(2) Inklusivleistungen: In der Pauschalmiete enthalten sind alle kalten und warmen Betriebskosten (Heizung, Warm-/Kaltwasser, Strom, Müllabfuhr, Gebäudeversicherung) sowie Vodafone 1000 Mbit/s Highspeed-WLAN in verbrauchsüblichem Maße (Fair-Use-Regelung).</w:t>
-              <w:br/>
-              <w:t>(3) ARD-Rundfunkbeitrag &amp; Endreinigung: Der Rundfunkbeitrag (GEZ) ist NICHT in der Miete enthalten und wird von der WG eigenständig getragen. Für die Endreinigung bei Auszug wird eine einmalige Pauschale von 70 € fällig.</w:t>
+              <w:t>Lichtenrader Damm 80, 12305 Berlin (2. OG, WE-11)</w:t>
             </w:r>
           </w:p>
         </w:tc>
@@ -384,21 +135,11 @@
             <w:r>
               <w:rPr>
                 <w:b/>
-                <w:color w:val="475569"/>
-                <w:sz w:val="19"/>
               </w:rPr>
-              <w:t>§ 2 Rent, Utilities &amp; Public License Fee</w:t>
-              <w:br/>
+              <w:t xml:space="preserve">Mietzeit / Rental Term: </w:t>
             </w:r>
             <w:r>
-              <w:rPr>
-                <w:sz w:val="17"/>
-              </w:rPr>
-              <w:t>(1) Monthly Flat Rent: Monthly warm rent is an all-inclusive flat rate of €649 (Six hundred forty-nine EURO).</w:t>
-              <w:br/>
-              <w:t>(2) Inclusions: Includes all operating costs (heating, hot/cold water, electricity, waste disposal, insurance) and Vodafone 1000 Mbps Wi-Fi subject to customary fair use.</w:t>
-              <w:br/>
-              <w:t>(3) ARD License &amp; Cleaning: Public broadcasting license (GEZ) is NOT included and must be settled by tenants. A one-time final checkout cleaning fee of €70 applies upon departure.</w:t>
+              <w:t>02.11.2026 bis 30.04.2027</w:t>
             </w:r>
           </w:p>
         </w:tc>
@@ -412,20 +153,11 @@
             <w:r>
               <w:rPr>
                 <w:b/>
-                <w:sz w:val="19"/>
               </w:rPr>
-              <w:t>§ 3 Kaution &amp; Mietsicherheit (§ 551 BGB)</w:t>
-              <w:br/>
+              <w:t xml:space="preserve">Warmmiete / Warm Rent: </w:t>
             </w:r>
             <w:r>
-              <w:rPr>
-                <w:sz w:val="17"/>
-              </w:rPr>
-              <w:t>(1) Kaution: Der Mieter leistet eine Kaution von 1.000 € (Eintausend EURO) zur Sicherung aller Ansprüche.</w:t>
-              <w:br/>
-              <w:t>(2) Fälligkeit vor Einzug: Kaution und 1. Monatsmiete müssen vor dem Einzugstermin (2 Nov, 2026) vollständig auf dem Vermieterkonto eingegangen sein. Ohne Geldeingang erfolgt keine Schlüsselübergabe.</w:t>
-              <w:br/>
-              <w:t>(3) Rückerstattung: Treuhänderische Verwahrung gem. § 551 BGB. Erstattung innerhalb von 30 Tagen nach Auszug und unterzeichnetem Protokoll abzüglich berechtigter Forderungen. Aufrechnung gegen die letzte Miete ist ausgeschlossen.</w:t>
+              <w:t>649 € / Monat (Sechshundertneunundvierzig Euro)</w:t>
             </w:r>
           </w:p>
         </w:tc>
@@ -437,21 +169,11 @@
             <w:r>
               <w:rPr>
                 <w:b/>
-                <w:color w:val="475569"/>
-                <w:sz w:val="19"/>
               </w:rPr>
-              <w:t>§ 3 Security Deposit &amp; Escrow (§ 551 BGB)</w:t>
-              <w:br/>
+              <w:t xml:space="preserve">Rent &amp; Inclusions: </w:t>
             </w:r>
             <w:r>
-              <w:rPr>
-                <w:sz w:val="17"/>
-              </w:rPr>
-              <w:t>(1) Deposit: Tenant renders a deposit of €1.000 (One thousand EURO) to secure all landlord claims.</w:t>
-              <w:br/>
-              <w:t>(2) Due Prior to Move-In: Deposit and 1st month's rent must be fully credited before move-in date (2 Nov, 2026). Handover of keys is denied without full receipt.</w:t>
-              <w:br/>
-              <w:t>(3) Escrow &amp; Refund: Held in escrow pursuant to Section 551 BGB. Refunded within 30 days after checkout protocol less verified claims. Setting off deposit against ongoing rent is prohibited.</w:t>
+              <w:t>€649 / month (incl. utilities &amp; 1000 Mbps Wi-Fi)</w:t>
             </w:r>
           </w:p>
         </w:tc>
@@ -465,20 +187,11 @@
             <w:r>
               <w:rPr>
                 <w:b/>
-                <w:sz w:val="19"/>
               </w:rPr>
-              <w:t>§ 4 Zahlungsbedingungen, Fälligkeit &amp; Verzug</w:t>
-              <w:br/>
+              <w:t xml:space="preserve">Kaution / Security Deposit: </w:t>
             </w:r>
             <w:r>
-              <w:rPr>
-                <w:sz w:val="17"/>
-              </w:rPr>
-              <w:t>(1) Fälligkeit: Miete ist monatlich im Voraus bis spätestens zum 3. Werktag kostenfrei zu überweisen.</w:t>
-              <w:br/>
-              <w:t>(2) Bankverbindung: Inhaber: Kylasam Nallagoundanpalayam Arruchamy | IBAN: DE87100110012624542768 | BIC: NTSBDEB1XXX.</w:t>
-              <w:br/>
-              <w:t>(3) Verzug: Mahngebühr von 5,00 € je Mahnung. Rückstand von zwei Monatsmieten berechtigt zur fristlosen Kündigung gem. § 543 Abs. 2 BGB.</w:t>
+              <w:t>1.000 € (vor Einzug fällig)</w:t>
             </w:r>
           </w:p>
         </w:tc>
@@ -490,21 +203,11 @@
             <w:r>
               <w:rPr>
                 <w:b/>
-                <w:color w:val="475569"/>
-                <w:sz w:val="19"/>
               </w:rPr>
-              <w:t>§ 4 Payment Terms, Due Dates &amp; Late Fees</w:t>
-              <w:br/>
+              <w:t xml:space="preserve">Deposit Terms: </w:t>
             </w:r>
             <w:r>
-              <w:rPr>
-                <w:sz w:val="17"/>
-              </w:rPr>
-              <w:t>(1) Due Date: Rent is due in advance on or before the 3rd business day of each month via wire transfer.</w:t>
-              <w:br/>
-              <w:t>(2) Account: Holder: Kylasam Nallagoundanpalayam Arruchamy | IBAN: DE87100110012624542768 | BIC: NTSBDEB1XXX.</w:t>
-              <w:br/>
-              <w:t>(3) Default: Overdue reminder fee of €5.00 per notice. Rent arrears of two months permit immediate cancellation under § 543 (2) BGB.</w:t>
+              <w:t>€1.000 (held in escrow, payable prior to move-in)</w:t>
             </w:r>
           </w:p>
         </w:tc>
@@ -518,20 +221,70 @@
             <w:r>
               <w:rPr>
                 <w:b/>
-                <w:sz w:val="19"/>
               </w:rPr>
-              <w:t>§ 5 Zusammenleben in der WG, Lärm &amp; Ruhezeiten</w:t>
+              <w:t xml:space="preserve">Endreinigung / Cleaning: </w:t>
+            </w:r>
+            <w:r>
+              <w:t>70,00 € einmalig bei Auszug</w:t>
+            </w:r>
+          </w:p>
+        </w:tc>
+        <w:tc>
+          <w:tcPr>
+            <w:tcW w:type="dxa" w:w="5184"/>
+          </w:tcPr>
+          <w:p>
+            <w:r>
+              <w:rPr>
+                <w:b/>
+              </w:rPr>
+              <w:t xml:space="preserve">Final Cleaning Fee: </w:t>
+            </w:r>
+            <w:r>
+              <w:t>€70,00 one-time checkout fee</w:t>
+            </w:r>
+          </w:p>
+        </w:tc>
+      </w:tr>
+    </w:tbl>
+    <w:p>
+      <w:r>
+        <w:br w:type="page"/>
+      </w:r>
+    </w:p>
+    <w:tbl>
+      <w:tblPr>
+        <w:tblW w:type="auto" w:w="0"/>
+        <w:jc w:val="center"/>
+        <w:tblLook w:firstColumn="1" w:firstRow="1" w:lastColumn="0" w:lastRow="0" w:noHBand="0" w:noVBand="1" w:val="04A0"/>
+      </w:tblPr>
+      <w:tblGrid>
+        <w:gridCol w:w="5234"/>
+        <w:gridCol w:w="5234"/>
+      </w:tblGrid>
+      <w:tr>
+        <w:tc>
+          <w:tcPr>
+            <w:tcW w:type="dxa" w:w="5184"/>
+          </w:tcPr>
+          <w:p>
+            <w:r>
+              <w:rPr>
+                <w:b/>
+                <w:sz w:val="18"/>
+              </w:rPr>
+              <w:t>§ 1 Mietdauer &amp; Befristungszweck (§ 549 Abs. 2 / § 575 BGB)</w:t>
               <w:br/>
             </w:r>
             <w:r>
               <w:rPr>
-                <w:sz w:val="17"/>
+                <w:sz w:val="16"/>
               </w:rPr>
-              <w:t>(1) Gegenseitige Rücksichtnahme: Die WG regelt das Zusammenleben partnerschaftlich und eigenverantwortlich.</w:t>
+              <w:t>(1) Mietzeit: Beginn am 02.11.2026, befristetes Ende am 30.04.2027. Mindestmietdauer beträgt sechs (6) Monate.</w:t>
               <w:br/>
-              <w:t>(2) Ruhezeiten: Gesetzliche Ruhezeiten sind strikt einzuhalten: 13:00–15:00 Uhr sowie 22:00–08:00 Uhr. An Sonn- und Feiertagen absolute Ruhe. Audiogeräte nur auf Zimmerlautstärke.</w:t>
+              <w:t>(2) Zweck: Vorübergehender Gebrauch gem. § 549 Abs. 2 Nr. 1 BGB (Aufgrund eines Studien-, Praktikums- oder Erwerbsaufenthalts in Berlin).</w:t>
               <w:br/>
-              <w:t>(3) Partys: Störende Partys sind verboten. Geselliges Beisammensein ist ab 22:00 Uhr auf Zimmerlautstärke zu senken.</w:t>
+              <w:t>(3) Ausschluss: Stillschweigende Verlängerung (§ 545 BGB) ist ausgeschlossen.</w:t>
             </w:r>
           </w:p>
         </w:tc>
@@ -544,20 +297,20 @@
               <w:rPr>
                 <w:b/>
                 <w:color w:val="475569"/>
-                <w:sz w:val="19"/>
+                <w:sz w:val="18"/>
               </w:rPr>
-              <w:t>§ 5 Flatshare Cohabitation, Quiet Hours &amp; Noise Control</w:t>
+              <w:t>§ 1 Lease Term &amp; Temporary Purpose (§ 549 (2) / § 575 BGB)</w:t>
               <w:br/>
             </w:r>
             <w:r>
               <w:rPr>
-                <w:sz w:val="17"/>
+                <w:sz w:val="16"/>
               </w:rPr>
-              <w:t>(1) Mutual Courtesy: Flatmates manage everyday co-living respectfully and independently.</w:t>
+              <w:t>(1) Term: Commences on 2 Nov, 2026, terminates on 30 Apr, 2027. Minimum lease term is six (6) months.</w:t>
               <w:br/>
-              <w:t>(2) Quiet Hours: Mandatory quiet hours: 1:00pm–3:00pm and 10:00pm–8:00am. Full silence on Sundays and public holidays. Media devices at room volume only.</w:t>
+              <w:t>(2) Purpose: Temporary living pursuant to Section 549 (2) No. 1 BGB (Due to an academic, internship, or professional stay in Berlin).</w:t>
               <w:br/>
-              <w:t>(3) Parties: Disruptive parties are prohibited. Gatherings must be quiet by 10:00pm.</w:t>
+              <w:t>(3) Tacit Renewal: Section 545 BGB is strictly excluded.</w:t>
             </w:r>
           </w:p>
         </w:tc>
@@ -571,20 +324,20 @@
             <w:r>
               <w:rPr>
                 <w:b/>
-                <w:sz w:val="19"/>
+                <w:sz w:val="18"/>
               </w:rPr>
-              <w:t>§ 6 Wohnungsnutzung, Lüften &amp; Heizen</w:t>
+              <w:t>§ 2 Miethöhe, Pauschale &amp; Nebenkosten</w:t>
               <w:br/>
             </w:r>
             <w:r>
               <w:rPr>
-                <w:sz w:val="17"/>
+                <w:sz w:val="16"/>
               </w:rPr>
-              <w:t>(1) Wohnzweck: Ausschließlich zu privaten Wohnzwecken gestattet. Keine gewerbliche Untervermietung.</w:t>
+              <w:t>(1) Warmmiete: 649 € monatlich (Sechshundertneunundvierzig Euro).</w:t>
               <w:br/>
-              <w:t>(2) Lüften &amp; Schimmelschutz: Zur Vermeidung von Schimmel ist die Wohnung ganzjährig mind. 2x täglich für 5–10 Min. per Stoßlüften zu lüften. Dauerkippstellung im Winter ist unzulässig.</w:t>
+              <w:t>(2) Inklusivleistungen: Kalte &amp; warme Betriebskosten, Strom, Heizung und Vodafone 1000 Mbit/s WLAN in verbrauchsüblichem Maße (Fair Use).</w:t>
               <w:br/>
-              <w:t>(3) Heizen: Thermostate beim Lüften herunterdrehen; in der Heizperiode ausreichende Mindesttemperatur halten.</w:t>
+              <w:t>(3) ARD-Beitrag &amp; Endreinigung: GEZ ist nicht enthalten (von WG eigenständig getragen). Endreinigungspauschale bei Auszug: 70,00 €.</w:t>
             </w:r>
           </w:p>
         </w:tc>
@@ -597,20 +350,20 @@
               <w:rPr>
                 <w:b/>
                 <w:color w:val="475569"/>
-                <w:sz w:val="19"/>
+                <w:sz w:val="18"/>
               </w:rPr>
-              <w:t>§ 6 Apartment Care, Ventilation &amp; Heating</w:t>
+              <w:t>§ 2 Rent, Utilities &amp; Public License Fee</w:t>
               <w:br/>
             </w:r>
             <w:r>
               <w:rPr>
-                <w:sz w:val="17"/>
+                <w:sz w:val="16"/>
               </w:rPr>
-              <w:t>(1) Residential Use: Exclusively for living purposes. Commercial activity or short-term subletting prohibited.</w:t>
+              <w:t>(1) Rent: Flat monthly rate of €649 (Six hundred forty-nine euros).</w:t>
               <w:br/>
-              <w:t>(2) Ventilation: To prevent mold, cross-ventilate windows fully 2x daily for 5–10 minutes. Leaving windows tilted continuously in winter is forbidden.</w:t>
+              <w:t>(2) Inclusions: Heating, water, electricity, operating costs and Vodafone 1000 Mbps Wi-Fi based on customary fair use.</w:t>
               <w:br/>
-              <w:t>(3) Heating: Turn down thermostats during airing; keep adequate baseline warmth in cold months.</w:t>
+              <w:t>(3) ARD License &amp; Cleaning: Broadcasting fee (GEZ) settled directly by WG. Final cleaning fee upon checkout: €70,00.</w:t>
             </w:r>
           </w:p>
         </w:tc>
@@ -624,20 +377,20 @@
             <w:r>
               <w:rPr>
                 <w:b/>
-                <w:sz w:val="19"/>
+                <w:sz w:val="18"/>
               </w:rPr>
-              <w:t>§ 7 Rauchverbot, Drogenverbot &amp; Brandschutz</w:t>
+              <w:t>§ 3 Kaution &amp; Mietsicherheit (§ 551 BGB)</w:t>
               <w:br/>
             </w:r>
             <w:r>
               <w:rPr>
-                <w:sz w:val="17"/>
+                <w:sz w:val="16"/>
               </w:rPr>
-              <w:t>(1) Rauchverbot: Absolutes Rauchverbot in allen Innenräumen, Fluren und auf den Balkonen (inkl. E-Zigaretten).</w:t>
+              <w:t>(1) Kaution: 1.000 € (Eintausend Euro).</w:t>
               <w:br/>
-              <w:t>(2) Drogenverbot: Besitz, Konsum oder Handel illegaler Betäubungsmittel führt zur sofortigen Anzeige und fristlosen Kündigung.</w:t>
+              <w:t>(2) Fälligkeit: Vor Einzug am 02.11.2026 vollständig auf das Vermieterkonto zu zahlen. Keine Schlüssel ohne Geldeingang.</w:t>
               <w:br/>
-              <w:t>(3) Brandschutz: Offenes Feuer, unbeaufsichtigte Kerzen und Grillen auf dem Balkon sind untersagt.</w:t>
+              <w:t>(3) Erstattung: Treuhandverwahrung gem. § 551 BGB; Erstattung innerhalb von 30 Tagen nach Auszug abzüglich berechtigter Forderungen. Kein Aufrechnen gegen Miete.</w:t>
             </w:r>
           </w:p>
         </w:tc>
@@ -650,20 +403,20 @@
               <w:rPr>
                 <w:b/>
                 <w:color w:val="475569"/>
-                <w:sz w:val="19"/>
+                <w:sz w:val="18"/>
               </w:rPr>
-              <w:t>§ 7 Strict Non-Smoking, Drug Ban &amp; Fire Safety</w:t>
+              <w:t>§ 3 Security Deposit &amp; Escrow (§ 551 BGB)</w:t>
               <w:br/>
             </w:r>
             <w:r>
               <w:rPr>
-                <w:sz w:val="17"/>
+                <w:sz w:val="16"/>
               </w:rPr>
-              <w:t>(1) Non-Smoking: Strictly forbidden throughout all interior rooms, corridors, and balconies (including vapes).</w:t>
+              <w:t>(1) Deposit: €1.000 (One thousand euros).</w:t>
               <w:br/>
-              <w:t>(2) Narcotics Ban: Illegal substances result in immediate police report and termination without notice.</w:t>
+              <w:t>(2) Due Date: Payable in full before move-in on 2 Nov, 2026. Key handover denied without receipt.</w:t>
               <w:br/>
-              <w:t>(3) Fire Safety: Open flames, unattended candles, and balcony barbecues are forbidden.</w:t>
+              <w:t>(3) Refund: Escrow under § 551 BGB; refunded within 30 days after move-out protocol less proven claims. No set-off against ongoing rent.</w:t>
             </w:r>
           </w:p>
         </w:tc>
@@ -677,18 +430,20 @@
             <w:r>
               <w:rPr>
                 <w:b/>
-                <w:sz w:val="19"/>
+                <w:sz w:val="18"/>
               </w:rPr>
-              <w:t>§ 8 Haustiere &amp; Beherbergung von Gästen</w:t>
+              <w:t>§ 4 Zahlungsbedingungen, Fälligkeit &amp; Verzug</w:t>
               <w:br/>
             </w:r>
             <w:r>
               <w:rPr>
-                <w:sz w:val="17"/>
+                <w:sz w:val="16"/>
               </w:rPr>
-              <w:t>(1) Haustiere: Die Haltung von Haustieren jeglicher Art ist nicht gestattet.</w:t>
+              <w:t>(1) Fälligkeit: Bis spätestens zum 3. Werktag des Monats im Voraus kostenfrei zu überweisen.</w:t>
               <w:br/>
-              <w:t>(2) Gäste: Übernachtungsbesuch ist nur bei Anwesenheit des Mieters und maximal 5 Tage pro Kalendermonat zulässig. Dauerhafte Aufnahme dritter Personen gilt als unzulässige Gebrauchsüberlassung.</w:t>
+              <w:t>(2) Bank: N26 Bank AG, Berlin | Inhaber: Kylasam Nallagoundanpalayam Arruchamy | IBAN: DE87100110012624542768 | BIC: NTSBDEB1XXX.</w:t>
+              <w:br/>
+              <w:t>(3) Verzug: Mahngebühr 5,00 € je Mahnung. Kündigung gem. § 543 Abs. 2 BGB bei Verzug von 2 Monatsmieten.</w:t>
             </w:r>
           </w:p>
         </w:tc>
@@ -701,18 +456,20 @@
               <w:rPr>
                 <w:b/>
                 <w:color w:val="475569"/>
-                <w:sz w:val="19"/>
+                <w:sz w:val="18"/>
               </w:rPr>
-              <w:t>§ 8 Pets Prohibition &amp; Overnight Guest Policy</w:t>
+              <w:t>§ 4 Payment Terms, Due Dates &amp; Late Fees</w:t>
               <w:br/>
             </w:r>
             <w:r>
               <w:rPr>
-                <w:sz w:val="17"/>
+                <w:sz w:val="16"/>
               </w:rPr>
-              <w:t>(1) Pets: Keeping pets of any kind is prohibited.</w:t>
+              <w:t>(1) Due Date: Payable in advance on or before the 3rd business day of each month via wire transfer.</w:t>
               <w:br/>
-              <w:t>(2) Guests: Overnight visitors allowed only while tenant is present, capped at maximum 5 days per calendar month. Permanent third-party accommodation is unauthorized subletting.</w:t>
+              <w:t>(2) Account: N26 Bank AG, Berlin | Holder: Kylasam Nallagoundanpalayam Arruchamy | IBAN: DE87100110012624542768 | BIC: NTSBDEB1XXX.</w:t>
+              <w:br/>
+              <w:t>(3) Default: Reminder charge of €5,00 per notice. Cancellation under § 543 (2) BGB for 2 months arrears.</w:t>
             </w:r>
           </w:p>
         </w:tc>
@@ -726,20 +483,20 @@
             <w:r>
               <w:rPr>
                 <w:b/>
-                <w:sz w:val="19"/>
+                <w:sz w:val="18"/>
               </w:rPr>
-              <w:t>§ 9 Internetnutzung, Haftungsfreistellung &amp; Urheberrecht</w:t>
+              <w:t>§ 5 Kündigung &amp; Nachmieterstellung</w:t>
               <w:br/>
             </w:r>
             <w:r>
               <w:rPr>
-                <w:sz w:val="17"/>
+                <w:sz w:val="16"/>
               </w:rPr>
-              <w:t>(1) Bereitstellung: Highspeed-WLAN wird bereitgestellt. Mieter trägt alleinige zivil- und strafrechtliche Verantwortung für jegliche Online-Aktivitäten.</w:t>
+              <w:t>(1) Ordentliche Kündigung: Während der festen Mietdauer ausgeschlossen.</w:t>
               <w:br/>
-              <w:t>(2) Urheberrecht: Peer-to-Peer, BitTorrent und illegale Downloads sind strengstens verboten.</w:t>
+              <w:t>(2) Nachmieter: Vorzeitige Entlassung mit 3 Monaten Frist zum Monatsende bei Gestellung eines solventen, für die WG zumutbaren Nachmieters.</w:t>
               <w:br/>
-              <w:t>(3) Freistellung: Mieter stellt Vermieter von Abmahn- und Anwaltskosten vollumfänglich frei. Bei Missbrauch erfolgt sofortige Internetsperre und Weitergabe der Mieterdaten an Behörden.</w:t>
+              <w:t>(3) Außerordentliche Kündigung: Gesetzliche Kündigung aus wichtigem Grund (§§ 543, 569 BGB) bleibt unberührt.</w:t>
             </w:r>
           </w:p>
         </w:tc>
@@ -752,20 +509,20 @@
               <w:rPr>
                 <w:b/>
                 <w:color w:val="475569"/>
-                <w:sz w:val="19"/>
+                <w:sz w:val="18"/>
               </w:rPr>
-              <w:t>§ 9 Internet Policy, Torrent Ban &amp; Indemnification</w:t>
+              <w:t>§ 5 Termination &amp; Replacement Tenant Release</w:t>
               <w:br/>
             </w:r>
             <w:r>
               <w:rPr>
-                <w:sz w:val="17"/>
+                <w:sz w:val="16"/>
               </w:rPr>
-              <w:t>(1) Access: Highspeed Wi-Fi provided. Tenant assumes sole civil and criminal liability for all online traffic.</w:t>
+              <w:t>(1) Ordinary Notice: Excluded during the fixed lease term.</w:t>
               <w:br/>
-              <w:t>(2) Copyright Ban: BitTorrent, P2P file-sharing, and illegal downloads are strictly prohibited.</w:t>
+              <w:t>(2) Replacement Tenant: Early release with 3 months' notice to month-end upon presenting an accepted solvent replacement tenant who executes a contract.</w:t>
               <w:br/>
-              <w:t>(3) Indemnification: Tenant fully indemnifies landlord against legal claims. Access is revoked upon violation and logs forwarded to police.</w:t>
+              <w:t>(3) Cause: Extraordinary termination for good cause (§§ 543, 569 BGB) unaffected.</w:t>
             </w:r>
           </w:p>
         </w:tc>
@@ -779,20 +536,16 @@
             <w:r>
               <w:rPr>
                 <w:b/>
-                <w:sz w:val="19"/>
+                <w:sz w:val="18"/>
               </w:rPr>
-              <w:t>§ 10 Obhutspflichten, Wände &amp; Mülltrennung</w:t>
+              <w:t>§ 6 AGB &amp; Anlagen als Vertragsbestandteil</w:t>
               <w:br/>
             </w:r>
             <w:r>
               <w:rPr>
-                <w:sz w:val="17"/>
+                <w:sz w:val="16"/>
               </w:rPr>
-              <w:t>(1) Wände: Wandbohrungen, Dübel, Nägel und klebende Folien, die den Putz beschädigen, sind untersagt.</w:t>
-              <w:br/>
-              <w:t>(2) Abflüsse: Keine Speisereste, Fette, Öle oder Hygieneartikel in Spülbecken, Dusche oder WC entsorgen.</w:t>
-              <w:br/>
-              <w:t>(3) Mülltrennung: Konsequente Mülltrennung gem. Berliner Stadtreinigung (BSR) (Gelbe Tonne, Papier, Bio, Restmüll).</w:t>
+              <w:t>Anlage 1 (Inventar) und Anlage 2 (AGB § 1 bis § 8) werden mit Unterschrift anerkannt. Übergabeprotokoll, Schlüsselquittung und Wohnungsgeberbestätigung (§ 19 BMG) werden bei Einzug ausgehändigt.</w:t>
             </w:r>
           </w:p>
         </w:tc>
@@ -805,20 +558,16 @@
               <w:rPr>
                 <w:b/>
                 <w:color w:val="475569"/>
-                <w:sz w:val="19"/>
+                <w:sz w:val="18"/>
               </w:rPr>
-              <w:t>§ 10 Duty of Care, Wall Treatment &amp; Waste Sorting</w:t>
+              <w:t>§ 6 Terms &amp; Attachments</w:t>
               <w:br/>
             </w:r>
             <w:r>
               <w:rPr>
-                <w:sz w:val="17"/>
+                <w:sz w:val="16"/>
               </w:rPr>
-              <w:t>(1) Walls: Drilling holes, inserting wall plugs/nails, or adhesive tapes damaging plaster is prohibited.</w:t>
-              <w:br/>
-              <w:t>(2) Plumbing: No food scraps, cooking grease, oils, or sanitary items down kitchen or bathroom drains.</w:t>
-              <w:br/>
-              <w:t>(3) Waste Sorting: Systematic recycling per Berlin BSR standards (packaging, paper, bio, residual).</w:t>
+              <w:t>Attachment 1 (Inventory) and Attachment 2 (GTC § 1 to § 8) are integral binding parts. Handover protocol, keys acknowledgement, and landlord confirmation (§ 19 BMG) provided upon move-in.</w:t>
             </w:r>
           </w:p>
         </w:tc>
@@ -832,20 +581,16 @@
             <w:r>
               <w:rPr>
                 <w:b/>
-                <w:sz w:val="19"/>
+                <w:sz w:val="18"/>
               </w:rPr>
-              <w:t>§ 11 Übergabe und Rückgabe der Mietsache</w:t>
+              <w:t>AGB § 1 Zusammenleben in der WG / mit den Nachbarn</w:t>
               <w:br/>
             </w:r>
             <w:r>
               <w:rPr>
-                <w:sz w:val="17"/>
+                <w:sz w:val="16"/>
               </w:rPr>
-              <w:t>(1) Einzug: Übergabe erfolgt nach Geldeingang von Kaution und 1. Miete anhand eines detaillierten Übergabeprotokolls.</w:t>
-              <w:br/>
-              <w:t>(2) Auszug: Rückgabe am letzten Vertragstag bis spätestens 11:00 Uhr im geräumten, besenreinen Zustand samt aller Schlüssel.</w:t>
-              <w:br/>
-              <w:t>(3) Hinterlassene Sachen: Zurückgelassene Gegenstände werden auf Mieterkosten entsorgt oder eingelagert.</w:t>
+              <w:t>Rücksichtnahme in der WG. Ruhezeiten: 13:00–15:00 Uhr sowie 22:00–08:00 Uhr (Sonn-/Feiertage ganztägig). TV/Audio auf Zimmerlautstärke. Störende Partys verboten. Reinigung eigenverantwortlich nach Putzplan; bei Säumnis Vergabe an Fremdfirma auf WG-Kosten. Striktes Rauch- und Drogenverbot (Strafanzeige). Keine Haustiere. Gäste max. 5 Tage/Monat.</w:t>
             </w:r>
           </w:p>
         </w:tc>
@@ -858,20 +603,16 @@
               <w:rPr>
                 <w:b/>
                 <w:color w:val="475569"/>
-                <w:sz w:val="19"/>
+                <w:sz w:val="18"/>
               </w:rPr>
-              <w:t>§ 11 Handover Protocol &amp; Return of Premises</w:t>
+              <w:t>GTC § 1 Cohabitation in Flat Share / Neighbours</w:t>
               <w:br/>
             </w:r>
             <w:r>
               <w:rPr>
-                <w:sz w:val="17"/>
+                <w:sz w:val="16"/>
               </w:rPr>
-              <w:t>(1) Move-In: Keys transferred after full receipt of deposit and 1st rent via signed handover protocol.</w:t>
-              <w:br/>
-              <w:t>(2) Move-Out: Room returned swept clean, fully cleared, and with all keys by 11:00am on final lease day.</w:t>
-              <w:br/>
-              <w:t>(3) Left Belongings: Disposed of or stored at tenant's expense.</w:t>
+              <w:t>Mutual courtesy. Quiet hours: 1:00pm–3:00pm and 10:00pm–8:00am (Sundays/holidays full quiet). Media at room volume. Disruptive parties prohibited. Shared cleaning rota; default results in professional cleaning at tenants' equal cost. Strict non-smoking and drug ban (police report). No pets. Overnight guests max 5 days/month.</w:t>
             </w:r>
           </w:p>
         </w:tc>
@@ -885,20 +626,16 @@
             <w:r>
               <w:rPr>
                 <w:b/>
-                <w:sz w:val="19"/>
+                <w:sz w:val="18"/>
               </w:rPr>
-              <w:t>§ 12 Schäden, Kleinreparaturen &amp; Schlüsselersatz</w:t>
+              <w:t>AGB § 2 Regelungen zur Wohnung</w:t>
               <w:br/>
             </w:r>
             <w:r>
               <w:rPr>
-                <w:sz w:val="17"/>
+                <w:sz w:val="16"/>
               </w:rPr>
-              <w:t>(1) Mängelmeldung: Schäden sind dem Vermieter unverzüglich anzuzeigen.</w:t>
-              <w:br/>
-              <w:t>(2) Kleinreparaturen: Kleinere Instandhaltungen bis 100,00 € im Einzelfall (max. 8% der Jahresmiete bzw. 350,00 € jährlich) trägt der Mieter.</w:t>
-              <w:br/>
-              <w:t>(3) Schlüsselverlust-Pauschalen: Haustür: 680,00 € | Wohnung: 120,00 € | Zimmer: 90,00 € | Briefkasten: 70,00 € zzgl. ggf. Austausch der Zentralschließanlage.</w:t>
+              <w:t>Ausschließlich Wohnzwecke. Stoßlüften mind. 2x täglich für 5–10 Min. (kein Dauerkippen im Winter). WLAN bereitgestellt; P2P/Torrents verboten; Mieter haftet und stellt Vermieter frei. Wandbohrungen, Nägel, Dübel und klebende Folien untersagt. Abflüsse vor Fett/Abfall schützen. Mülltrennung nach BSR (Gelb, Papier, Bio, Rest). Türen 22:00–06:00 Uhr geschlossen. Zutrittsrecht des Vermieters werktags 09–12 &amp; 15–20h nach Vorankündigung (letzte 4 Wochen mind. 5 Termine) und bei Gefahr im Verzug.</w:t>
             </w:r>
           </w:p>
         </w:tc>
@@ -911,20 +648,16 @@
               <w:rPr>
                 <w:b/>
                 <w:color w:val="475569"/>
-                <w:sz w:val="19"/>
+                <w:sz w:val="18"/>
               </w:rPr>
-              <w:t>§ 12 Damages, Minor Repairs &amp; Lost Keys Schedule</w:t>
+              <w:t>GTC § 2 Apartment Regulations</w:t>
               <w:br/>
             </w:r>
             <w:r>
               <w:rPr>
-                <w:sz w:val="17"/>
+                <w:sz w:val="16"/>
               </w:rPr>
-              <w:t>(1) Defect Notice: Damages must be reported immediately.</w:t>
-              <w:br/>
-              <w:t>(2) Minor Repairs: Repairs on fixtures up to €100.00 per instance (annual cap: 8% of rent or €350.00) borne by tenant.</w:t>
-              <w:br/>
-              <w:t>(3) Lost Keys Schedule: Building door: €680.00 | Apartment: €120.00 | Room: €90.00 | Mailbox: €70.00 plus master lock system replacement if required.</w:t>
+              <w:t>Residential use only. Air out 2x daily 5–10 min (no tilting in winter). Wi-Fi provided; P2P/torrents prohibited; tenant fully indemnifies landlord. No drilling, nails, screws or wall plugs. Drains kept free of grease/solids. Waste sorting per Berlin BSR. Doors closed 10:00pm–6:00am. Landlord access workdays 9am–12pm &amp; 3pm–8pm upon notice (at least 5 viewings in last 4 weeks) and anytime during emergencies.</w:t>
             </w:r>
           </w:p>
         </w:tc>
@@ -938,20 +671,16 @@
             <w:r>
               <w:rPr>
                 <w:b/>
-                <w:sz w:val="19"/>
+                <w:sz w:val="18"/>
               </w:rPr>
-              <w:t>§ 13 Betretungsrecht des Vermieters</w:t>
+              <w:t>AGB § 3 Zahlungsvereinbarungen</w:t>
               <w:br/>
             </w:r>
             <w:r>
               <w:rPr>
-                <w:sz w:val="17"/>
+                <w:sz w:val="16"/>
               </w:rPr>
-              <w:t>(1) Vorankündigung: Zutritt werktags (09:00–12:00 und 15:00–20:00 Uhr) nach angemessener Ankündigung (24–48 Std.) zur Prüfung des Zustands oder für Handwerker.</w:t>
-              <w:br/>
-              <w:t>(2) Nachmieterbesichtigungen: In den letzten 4 Wochen der Mietzeit hat der Mieter bis zu 5 Besichtigungstermine nach Vorankündigung zu dulden.</w:t>
-              <w:br/>
-              <w:t>(3) Notfälle: Bei Gefahr im Verzug ist der Zutritt jederzeit ohne Vorankündigung gestattet.</w:t>
+              <w:t>Rechtzeitigkeit nach Geldeingang. Kaution sichert alle Ansprüche; kein Aufrechnen vor Mietende. Miete im Voraus bis 3. Werktag. Kautionsabrechnung binnen 30 Tagen nach Auszug. Fair Usage der Nebenkosten (&gt; 25% Mehraufwand wird umgelegt). Mahngebühr 5,00 € je Mahnung. Mieterhöhung nach BGB. Aufrechnung nur mit 1 Monat Vorankündigung.</w:t>
             </w:r>
           </w:p>
         </w:tc>
@@ -964,20 +693,16 @@
               <w:rPr>
                 <w:b/>
                 <w:color w:val="475569"/>
-                <w:sz w:val="19"/>
+                <w:sz w:val="18"/>
               </w:rPr>
-              <w:t>§ 13 Landlord Right of Inspection &amp; Access</w:t>
+              <w:t>GTC § 3 Payment Agreements</w:t>
               <w:br/>
             </w:r>
             <w:r>
               <w:rPr>
-                <w:sz w:val="17"/>
+                <w:sz w:val="16"/>
               </w:rPr>
-              <w:t>(1) Advance Notice: Access on workdays (9:00am–12:00pm &amp; 3:00pm–8:00pm) upon 24–48h notice for inspections or maintenance.</w:t>
-              <w:br/>
-              <w:t>(2) Viewings: Tenant permits up to 5 prospective tenant viewings during the final 4 weeks of stay.</w:t>
-              <w:br/>
-              <w:t>(3) Emergencies: Immediate access permitted anytime in case of imminent danger.</w:t>
+              <w:t>Punctuality determined by account credit date. Deposit secures all claims; no set-off against ongoing rent. Rent in advance by 3rd business day. Deposit refund within 30 days after move-out. Fair usage (&gt; 25% excess billed). Overdue fine €5.00 per notice. Rent adjustments per statutory law. Set-off requires 1 month notice.</w:t>
             </w:r>
           </w:p>
         </w:tc>
@@ -991,22 +716,22 @@
             <w:r>
               <w:rPr>
                 <w:b/>
-                <w:sz w:val="19"/>
+                <w:sz w:val="18"/>
               </w:rPr>
-              <w:t>§ 14 Kündigung, Vorzeitige Entlassung, Schriftform &amp; Salvatorische Klausel</w:t>
+              <w:t>AGB § 4 Übergabe und Rückgabe &amp; Schlüsselgebühren</w:t>
               <w:br/>
             </w:r>
             <w:r>
               <w:rPr>
-                <w:sz w:val="17"/>
+                <w:sz w:val="16"/>
               </w:rPr>
-              <w:t>(1) Ausschluss ordentlicher Kündigung: Während der festen Mietdauer ist die ordentliche Kündigung ausgeschlossen.</w:t>
+              <w:t>Übergabe nach Zahlungseingang per Protokoll. Bei Auszug geräumt und besenrein bis 11:00 Uhr mit allen Schlüsseln. Schlüsselersatzpauschalen:</w:t>
               <w:br/>
-              <w:t>(2) Nachmieterstellung: Vorzeitige Entlassung mit 3 Monaten Frist zum Monatsende bei Gestellung eines akzeptierten, solventen Nachmieters.</w:t>
+              <w:t>• Haustür (Schließanlage): 680,00 € | Wohnung: 120,00 €</w:t>
               <w:br/>
-              <w:t>(3) Fristlose Kündigung (§ 543 BGB): Zulässig bei Verzug von 2 Monatsmieten, schwerer Pflichtverletzung, Drogen, Reinigungssäumung oder Erhalt von 2 Abmahnungen.</w:t>
+              <w:t>• Zimmer: 90,00 € | Briefkasten: 70,00 €</w:t>
               <w:br/>
-              <w:t>(4) Schriftform &amp; Salvatorische Klausel: Mündliche Nebenabreden ungültig. Änderungen nur schriftlich. Sollten Klauseln unwirksam sein, bleibt Restvertrag gültig. Erfüllungsort Berlin.</w:t>
+              <w:t>Zusätzliche Haftung für Schlossaustausch der Schließanlage.</w:t>
             </w:r>
           </w:p>
         </w:tc>
@@ -1019,22 +744,202 @@
               <w:rPr>
                 <w:b/>
                 <w:color w:val="475569"/>
-                <w:sz w:val="19"/>
+                <w:sz w:val="18"/>
               </w:rPr>
-              <w:t>§ 14 Termination, Replacement Tenant, Written Form &amp; Severability</w:t>
+              <w:t>GTC § 4 Handover, Departure &amp; Key Replacement Schedule</w:t>
               <w:br/>
             </w:r>
             <w:r>
               <w:rPr>
-                <w:sz w:val="17"/>
+                <w:sz w:val="16"/>
               </w:rPr>
-              <w:t>(1) No Ordinary Notice: Ordinary early termination excluded during the fixed lease.</w:t>
+              <w:t>Handover after payment receipt with protocol. Departure by 11:00am cleared, swept-clean with all keys. Key replacement schedule:</w:t>
               <w:br/>
-              <w:t>(2) Replacement Tenant: Early release with 3 months' notice to month-end upon providing an accepted solvent successor tenant.</w:t>
+              <w:t>• Building entrance (master system): €680.00 | Flat: €120.00</w:t>
               <w:br/>
-              <w:t>(3) Extraordinary Cancellation (§ 543 BGB): Applicable for 2 months rent arrears, severe contract breach, drugs, cleaning neglect, or 2 written warnings.</w:t>
+              <w:t>• Room: €90.00 | Mailbox: €70.00</w:t>
               <w:br/>
-              <w:t>(4) Written Form &amp; Severability: No verbal side agreements. Invalid provisions do not invalidate agreement. Jurisdiction Berlin.</w:t>
+              <w:t>Tenant additionally liable for lock cylinder replacement.</w:t>
+            </w:r>
+          </w:p>
+        </w:tc>
+      </w:tr>
+      <w:tr>
+        <w:tc>
+          <w:tcPr>
+            <w:tcW w:type="dxa" w:w="5184"/>
+          </w:tcPr>
+          <w:p>
+            <w:r>
+              <w:rPr>
+                <w:b/>
+                <w:sz w:val="18"/>
+              </w:rPr>
+              <w:t>AGB § 5 Schäden an der Wohnung &amp; Kleinreparaturen</w:t>
+              <w:br/>
+            </w:r>
+            <w:r>
+              <w:rPr>
+                <w:sz w:val="16"/>
+              </w:rPr>
+              <w:t>Schäden unverzüglich melden (4 Wochen Abhilfefrist). Mieter haftet für Sorgfaltspflichtverletzung und Besucher; Beweislast beim Mieter. Keine Schönheitsreparaturen geschuldet. Kleinreparaturen bis 100,00 € je Einzelfall (max. 8% der Jahresmiete bzw. 350,00 € jährlich) trägt der Mieter.</w:t>
+            </w:r>
+          </w:p>
+        </w:tc>
+        <w:tc>
+          <w:tcPr>
+            <w:tcW w:type="dxa" w:w="5184"/>
+          </w:tcPr>
+          <w:p>
+            <w:r>
+              <w:rPr>
+                <w:b/>
+                <w:color w:val="475569"/>
+                <w:sz w:val="18"/>
+              </w:rPr>
+              <w:t>GTC § 5 Damages to Property &amp; Minor Repairs</w:t>
+              <w:br/>
+            </w:r>
+            <w:r>
+              <w:rPr>
+                <w:sz w:val="16"/>
+              </w:rPr>
+              <w:t>Report defects immediately (4 weeks remedy period). Tenant liable for neglect and visitors; burden of proof rests with tenant. No general cosmetic repairs. Minor repairs up to €100.00 per instance (annual cap: 8% of rent or €350.00) borne by tenant.</w:t>
+            </w:r>
+          </w:p>
+        </w:tc>
+      </w:tr>
+      <w:tr>
+        <w:tc>
+          <w:tcPr>
+            <w:tcW w:type="dxa" w:w="5184"/>
+          </w:tcPr>
+          <w:p>
+            <w:r>
+              <w:rPr>
+                <w:b/>
+                <w:sz w:val="18"/>
+              </w:rPr>
+              <w:t>AGB § 6 Kündigungsbedingungen</w:t>
+              <w:br/>
+            </w:r>
+            <w:r>
+              <w:rPr>
+                <w:sz w:val="16"/>
+              </w:rPr>
+              <w:t>Kündigungsfrist 3 Monate zum Monatsende. Vorzeitiges Ausscheiden bei akzeptiertem Nachmieter ab Übergabe. Stillschweigende Verlängerung gem. § 545 BGB ausgeschlossen. Fristlose Kündigung gem. § 543 BGB zulässig bei: Verzug von 2 Monatsmieten, AGB-Verstoß nach Abmahnung, Schäden &gt; 50,00 € unbeglichen, unerlaubter Dritter, Drogen oder Reinigungsverweigerung.</w:t>
+            </w:r>
+          </w:p>
+        </w:tc>
+        <w:tc>
+          <w:tcPr>
+            <w:tcW w:type="dxa" w:w="5184"/>
+          </w:tcPr>
+          <w:p>
+            <w:r>
+              <w:rPr>
+                <w:b/>
+                <w:color w:val="475569"/>
+                <w:sz w:val="18"/>
+              </w:rPr>
+              <w:t>GTC § 6 Conditions of Termination</w:t>
+              <w:br/>
+            </w:r>
+            <w:r>
+              <w:rPr>
+                <w:sz w:val="16"/>
+              </w:rPr>
+              <w:t>Notice period 3 months to month-end. Early release upon accepted replacement tenant. Tacit renewal excluded under § 545 BGB. Termination without notice under § 543 BGB for: 2 months rent arrears, GTC breach after warning, damages &gt; €50.00 unpaid, unauthorized guests, drugs, or persistent cleaning refusal.</w:t>
+            </w:r>
+          </w:p>
+        </w:tc>
+      </w:tr>
+      <w:tr>
+        <w:tc>
+          <w:tcPr>
+            <w:tcW w:type="dxa" w:w="5184"/>
+          </w:tcPr>
+          <w:p>
+            <w:r>
+              <w:rPr>
+                <w:b/>
+                <w:sz w:val="18"/>
+              </w:rPr>
+              <w:t>AGB § 7 Schriftform</w:t>
+              <w:br/>
+            </w:r>
+            <w:r>
+              <w:rPr>
+                <w:sz w:val="16"/>
+              </w:rPr>
+              <w:t>Mündliche Nebenabreden bestehen nicht. Änderungen und Ergänzungen bedürfen der Schriftform; dies gilt auch für die Aufhebung dieses Schriftformerfordernisses.</w:t>
+            </w:r>
+          </w:p>
+        </w:tc>
+        <w:tc>
+          <w:tcPr>
+            <w:tcW w:type="dxa" w:w="5184"/>
+          </w:tcPr>
+          <w:p>
+            <w:r>
+              <w:rPr>
+                <w:b/>
+                <w:color w:val="475569"/>
+                <w:sz w:val="18"/>
+              </w:rPr>
+              <w:t>GTC § 7 Written Form</w:t>
+              <w:br/>
+            </w:r>
+            <w:r>
+              <w:rPr>
+                <w:sz w:val="16"/>
+              </w:rPr>
+              <w:t>No oral side agreements exist. Modifications and amendments must be executed in writing; this also applies to waiving this written-form requirement.</w:t>
+            </w:r>
+          </w:p>
+        </w:tc>
+      </w:tr>
+      <w:tr>
+        <w:tc>
+          <w:tcPr>
+            <w:tcW w:type="dxa" w:w="5184"/>
+          </w:tcPr>
+          <w:p>
+            <w:r>
+              <w:rPr>
+                <w:b/>
+                <w:sz w:val="18"/>
+              </w:rPr>
+              <w:t>AGB § 8 Salvatorische Klausel &amp; Gerichtsstand</w:t>
+              <w:br/>
+            </w:r>
+            <w:r>
+              <w:rPr>
+                <w:sz w:val="16"/>
+              </w:rPr>
+              <w:t>Unwirksamkeit einzelner Bestimmungen berührt die übrigen Klauseln nicht. Es gilt das Recht der Bundesrepublik Deutschland (BGB). Erfüllungsort und ausschließlicher Gerichtsstand ist Berlin. Die deutsche Fassung ist rechtlich allein verbindlich.</w:t>
+            </w:r>
+          </w:p>
+        </w:tc>
+        <w:tc>
+          <w:tcPr>
+            <w:tcW w:type="dxa" w:w="5184"/>
+          </w:tcPr>
+          <w:p>
+            <w:r>
+              <w:rPr>
+                <w:b/>
+                <w:color w:val="475569"/>
+                <w:sz w:val="18"/>
+              </w:rPr>
+              <w:t>GTC § 8 Severability &amp; Jurisdiction</w:t>
+              <w:br/>
+            </w:r>
+            <w:r>
+              <w:rPr>
+                <w:sz w:val="16"/>
+              </w:rPr>
+              <w:t>Invalidity of individual clauses does not affect remaining provisions. German Civil Code (BGB) governs. Place of performance and sole legal jurisdiction is Berlin. Only the German language version is legally binding.</w:t>
             </w:r>
           </w:p>
         </w:tc>
@@ -1042,7 +947,7 @@
     </w:tbl>
     <w:p>
       <w:pPr>
-        <w:spacing w:after="500"/>
+        <w:spacing w:after="400"/>
       </w:pPr>
     </w:p>
     <w:tbl>
@@ -1052,8 +957,8 @@
         <w:tblLook w:firstColumn="1" w:firstRow="1" w:lastColumn="0" w:lastRow="0" w:noHBand="0" w:noVBand="1" w:val="04A0"/>
       </w:tblPr>
       <w:tblGrid>
-        <w:gridCol w:w="5162"/>
-        <w:gridCol w:w="5162"/>
+        <w:gridCol w:w="5234"/>
+        <w:gridCol w:w="5234"/>
       </w:tblGrid>
       <w:tr>
         <w:tc>
@@ -1062,13 +967,15 @@
           </w:tcPr>
           <w:p>
             <w:r>
+              <w:t>Ort, Datum: Berlin, 27.10.2026</w:t>
+              <w:br/>
+              <w:br/>
+              <w:br/>
               <w:t>_____________________________________</w:t>
               <w:br/>
               <w:t>Kylasam Nallagoundanpalayam Arruchamy</w:t>
               <w:br/>
               <w:t>Vermieter / Landlord</w:t>
-              <w:br/>
-              <w:t>Datum / Date: ____________________</w:t>
             </w:r>
           </w:p>
         </w:tc>
@@ -1078,13 +985,15 @@
           </w:tcPr>
           <w:p>
             <w:r>
+              <w:t>Ort, Datum: 27 Oct, 2026</w:t>
+              <w:br/>
+              <w:br/>
+              <w:br/>
               <w:t>_____________________________________</w:t>
               <w:br/>
               <w:t>Ajithkumar Velasseril Sreenivasan</w:t>
               <w:br/>
               <w:t>Mieter / Tenant</w:t>
-              <w:br/>
-              <w:t>Datum / Date: ____________________</w:t>
             </w:r>
           </w:p>
         </w:tc>
@@ -1092,7 +1001,7 @@
     </w:tbl>
     <w:sectPr>
       <w:pgSz w:w="11909" w:h="16834"/>
-      <w:pgMar w:top="720" w:right="792" w:bottom="720" w:left="792" w:header="720" w:footer="720" w:gutter="0"/>
+      <w:pgMar w:top="576" w:right="720" w:bottom="576" w:left="720" w:header="720" w:footer="720" w:gutter="0"/>
       <w:cols w:space="720"/>
       <w:docGrid w:linePitch="360"/>
     </w:sectPr>

</xml_diff>

<commit_message>
feat(contracts): match exact 7-page format of SIGNED_CONTRACT_67da88a52ff5e11a1f9d8ffa and sync templates to GDrive
</commit_message>
<xml_diff>
--- a/template_contract.docx
+++ b/template_contract.docx
@@ -7,65 +7,22 @@
         <w:jc w:val="center"/>
       </w:pPr>
       <w:r>
-        <w:drawing>
-          <wp:inline xmlns:a="http://schemas.openxmlformats.org/drawingml/2006/main" xmlns:pic="http://schemas.openxmlformats.org/drawingml/2006/picture">
-            <wp:extent cx="1645920" cy="1440180"/>
-            <wp:docPr id="1" name="Picture 1"/>
-            <wp:cNvGraphicFramePr>
-              <a:graphicFrameLocks noChangeAspect="1"/>
-            </wp:cNvGraphicFramePr>
-            <a:graphic>
-              <a:graphicData uri="http://schemas.openxmlformats.org/drawingml/2006/picture">
-                <pic:pic>
-                  <pic:nvPicPr>
-                    <pic:cNvPr id="0" name="Homelyo-logo-header.png"/>
-                    <pic:cNvPicPr/>
-                  </pic:nvPicPr>
-                  <pic:blipFill>
-                    <a:blip r:embed="rId9"/>
-                    <a:stretch>
-                      <a:fillRect/>
-                    </a:stretch>
-                  </pic:blipFill>
-                  <pic:spPr>
-                    <a:xfrm>
-                      <a:off x="0" y="0"/>
-                      <a:ext cx="1645920" cy="1440180"/>
-                    </a:xfrm>
-                    <a:prstGeom prst="rect"/>
-                  </pic:spPr>
-                </pic:pic>
-              </a:graphicData>
-            </a:graphic>
-          </wp:inline>
-        </w:drawing>
-      </w:r>
-    </w:p>
-    <w:p>
-      <w:pPr>
-        <w:jc w:val="center"/>
-      </w:pPr>
-      <w:r>
         <w:rPr>
           <w:b/>
-          <w:sz w:val="44"/>
+          <w:sz w:val="48"/>
         </w:rPr>
         <w:t>Mietvertrag</w:t>
         <w:br/>
       </w:r>
       <w:r>
         <w:rPr>
-          <w:color w:val="475569"/>
-          <w:sz w:val="24"/>
+          <w:color w:val="505050"/>
+          <w:sz w:val="32"/>
         </w:rPr>
-        <w:t>Residential Lease Agreement &amp; House Rules (AGB)</w:t>
+        <w:t>Rental Agreement</w:t>
       </w:r>
     </w:p>
-    <w:p>
-      <w:pPr>
-        <w:spacing w:after="120"/>
-      </w:pPr>
-    </w:p>
+    <w:p/>
     <w:tbl>
       <w:tblPr>
         <w:tblW w:type="auto" w:w="0"/>
@@ -73,8 +30,8 @@
         <w:tblLook w:firstColumn="1" w:firstRow="1" w:lastColumn="0" w:lastRow="0" w:noHBand="0" w:noVBand="1" w:val="04A0"/>
       </w:tblPr>
       <w:tblGrid>
-        <w:gridCol w:w="5234"/>
-        <w:gridCol w:w="5234"/>
+        <w:gridCol w:w="5040"/>
+        <w:gridCol w:w="5040"/>
       </w:tblGrid>
       <w:tr>
         <w:tc>
@@ -86,10 +43,7 @@
               <w:rPr>
                 <w:b/>
               </w:rPr>
-              <w:t xml:space="preserve">Mieter / Tenant: </w:t>
-            </w:r>
-            <w:r>
-              <w:t>Ajithkumar Velasseril Sreenivasan</w:t>
+              <w:t>Zwischen Vermieter:</w:t>
             </w:r>
           </w:p>
         </w:tc>
@@ -102,10 +56,35 @@
               <w:rPr>
                 <w:b/>
               </w:rPr>
-              <w:t xml:space="preserve">Mietobjekt / Room: </w:t>
+              <w:t>The landlord:</w:t>
             </w:r>
+          </w:p>
+        </w:tc>
+      </w:tr>
+      <w:tr>
+        <w:tc>
+          <w:tcPr>
+            <w:tcW w:type="dxa" w:w="5184"/>
+          </w:tcPr>
+          <w:p>
             <w:r>
-              <w:t>Zimmer KE2 (Sonnige Balkon-Suite / Private Balcony Suite)</w:t>
+              <w:rPr>
+                <w:sz w:val="17"/>
+              </w:rPr>
+              <w:t>Vorname, Nachname</w:t>
+            </w:r>
+          </w:p>
+        </w:tc>
+        <w:tc>
+          <w:tcPr>
+            <w:tcW w:type="dxa" w:w="5184"/>
+          </w:tcPr>
+          <w:p>
+            <w:r>
+              <w:rPr>
+                <w:sz w:val="17"/>
+              </w:rPr>
+              <w:t>Name, Surname</w:t>
             </w:r>
           </w:p>
         </w:tc>
@@ -120,10 +99,7 @@
               <w:rPr>
                 <w:b/>
               </w:rPr>
-              <w:t xml:space="preserve">Liegenschaft / Address: </w:t>
-            </w:r>
-            <w:r>
-              <w:t>Lichtenrader Damm 80, 12305 Berlin (2. OG, WE-11)</w:t>
+              <w:t>Kylasam NA</w:t>
             </w:r>
           </w:p>
         </w:tc>
@@ -136,10 +112,129 @@
               <w:rPr>
                 <w:b/>
               </w:rPr>
-              <w:t xml:space="preserve">Mietzeit / Rental Term: </w:t>
+              <w:t>Kylasam NA</w:t>
             </w:r>
+          </w:p>
+        </w:tc>
+      </w:tr>
+      <w:tr>
+        <w:tc>
+          <w:tcPr>
+            <w:tcW w:type="dxa" w:w="5184"/>
+          </w:tcPr>
+          <w:p>
             <w:r>
-              <w:t>02.11.2026 bis 30.04.2027</w:t>
+              <w:rPr>
+                <w:sz w:val="17"/>
+              </w:rPr>
+              <w:t>Anschrift</w:t>
+            </w:r>
+          </w:p>
+        </w:tc>
+        <w:tc>
+          <w:tcPr>
+            <w:tcW w:type="dxa" w:w="5184"/>
+          </w:tcPr>
+          <w:p>
+            <w:r>
+              <w:rPr>
+                <w:sz w:val="17"/>
+              </w:rPr>
+              <w:t>Address</w:t>
+            </w:r>
+          </w:p>
+        </w:tc>
+      </w:tr>
+      <w:tr>
+        <w:tc>
+          <w:tcPr>
+            <w:tcW w:type="dxa" w:w="5184"/>
+          </w:tcPr>
+          <w:p>
+            <w:r>
+              <w:t>Forckenbeckstraße 64,</w:t>
+              <w:br/>
+              <w:t>14199 Berlin, Deutschland</w:t>
+            </w:r>
+          </w:p>
+        </w:tc>
+        <w:tc>
+          <w:tcPr>
+            <w:tcW w:type="dxa" w:w="5184"/>
+          </w:tcPr>
+          <w:p>
+            <w:r>
+              <w:t>Forckenbeckstraße 64,</w:t>
+              <w:br/>
+              <w:t>14199 Berlin, Germany</w:t>
+            </w:r>
+          </w:p>
+        </w:tc>
+      </w:tr>
+    </w:tbl>
+    <w:p/>
+    <w:tbl>
+      <w:tblPr>
+        <w:tblW w:type="auto" w:w="0"/>
+        <w:jc w:val="center"/>
+        <w:tblLook w:firstColumn="1" w:firstRow="1" w:lastColumn="0" w:lastRow="0" w:noHBand="0" w:noVBand="1" w:val="04A0"/>
+      </w:tblPr>
+      <w:tblGrid>
+        <w:gridCol w:w="5040"/>
+        <w:gridCol w:w="5040"/>
+      </w:tblGrid>
+      <w:tr>
+        <w:tc>
+          <w:tcPr>
+            <w:tcW w:type="dxa" w:w="5184"/>
+          </w:tcPr>
+          <w:p>
+            <w:r>
+              <w:rPr>
+                <w:b/>
+              </w:rPr>
+              <w:t>Zwischen Mieter:</w:t>
+            </w:r>
+          </w:p>
+        </w:tc>
+        <w:tc>
+          <w:tcPr>
+            <w:tcW w:type="dxa" w:w="5184"/>
+          </w:tcPr>
+          <w:p>
+            <w:r>
+              <w:rPr>
+                <w:b/>
+              </w:rPr>
+              <w:t>The tenant:</w:t>
+            </w:r>
+          </w:p>
+        </w:tc>
+      </w:tr>
+      <w:tr>
+        <w:tc>
+          <w:tcPr>
+            <w:tcW w:type="dxa" w:w="5184"/>
+          </w:tcPr>
+          <w:p>
+            <w:r>
+              <w:rPr>
+                <w:sz w:val="17"/>
+              </w:rPr>
+              <w:t>Vorname, Nachname</w:t>
+            </w:r>
+          </w:p>
+        </w:tc>
+        <w:tc>
+          <w:tcPr>
+            <w:tcW w:type="dxa" w:w="5184"/>
+          </w:tcPr>
+          <w:p>
+            <w:r>
+              <w:rPr>
+                <w:sz w:val="17"/>
+              </w:rPr>
+              <w:t>Name, Surname</w:t>
             </w:r>
           </w:p>
         </w:tc>
@@ -154,10 +249,7 @@
               <w:rPr>
                 <w:b/>
               </w:rPr>
-              <w:t xml:space="preserve">Warmmiete / Warm Rent: </w:t>
-            </w:r>
-            <w:r>
-              <w:t>649 € / Monat (Sechshundertneunundvierzig Euro)</w:t>
+              <w:t>Bhargavi Mangesh Ayare</w:t>
             </w:r>
           </w:p>
         </w:tc>
@@ -170,10 +262,7 @@
               <w:rPr>
                 <w:b/>
               </w:rPr>
-              <w:t xml:space="preserve">Rent &amp; Inclusions: </w:t>
-            </w:r>
-            <w:r>
-              <w:t>€649 / month (incl. utilities &amp; 1000 Mbps Wi-Fi)</w:t>
+              <w:t>Bhargavi Mangesh Ayare</w:t>
             </w:r>
           </w:p>
         </w:tc>
@@ -186,12 +275,9 @@
           <w:p>
             <w:r>
               <w:rPr>
-                <w:b/>
+                <w:sz w:val="17"/>
               </w:rPr>
-              <w:t xml:space="preserve">Kaution / Security Deposit: </w:t>
-            </w:r>
-            <w:r>
-              <w:t>1.000 € (vor Einzug fällig)</w:t>
+              <w:t>Anschrift</w:t>
             </w:r>
           </w:p>
         </w:tc>
@@ -202,12 +288,9 @@
           <w:p>
             <w:r>
               <w:rPr>
-                <w:b/>
+                <w:sz w:val="17"/>
               </w:rPr>
-              <w:t xml:space="preserve">Deposit Terms: </w:t>
-            </w:r>
-            <w:r>
-              <w:t>€1.000 (held in escrow, payable prior to move-in)</w:t>
+              <w:t>Address</w:t>
             </w:r>
           </w:p>
         </w:tc>
@@ -219,13 +302,7 @@
           </w:tcPr>
           <w:p>
             <w:r>
-              <w:rPr>
-                <w:b/>
-              </w:rPr>
-              <w:t xml:space="preserve">Endreinigung / Cleaning: </w:t>
-            </w:r>
-            <w:r>
-              <w:t>70,00 € einmalig bei Auszug</w:t>
+              <w:t>Type 4 building no 3 flat no 4 esis hospital quarters , Vashi sector-5 sagar vihar road, 400703 Navi Mumbai, Indien</w:t>
             </w:r>
           </w:p>
         </w:tc>
@@ -235,13 +312,7 @@
           </w:tcPr>
           <w:p>
             <w:r>
-              <w:rPr>
-                <w:b/>
-              </w:rPr>
-              <w:t xml:space="preserve">Final Cleaning Fee: </w:t>
-            </w:r>
-            <w:r>
-              <w:t>€70,00 one-time checkout fee</w:t>
+              <w:t>Type 4 building no 3 flat no 4 esis hospital quarters , Vashi sector-5 sagar vihar road, 400703 Navi Mumbai, India</w:t>
             </w:r>
           </w:p>
         </w:tc>
@@ -259,8 +330,1193 @@
         <w:tblLook w:firstColumn="1" w:firstRow="1" w:lastColumn="0" w:lastRow="0" w:noHBand="0" w:noVBand="1" w:val="04A0"/>
       </w:tblPr>
       <w:tblGrid>
-        <w:gridCol w:w="5234"/>
-        <w:gridCol w:w="5234"/>
+        <w:gridCol w:w="5184"/>
+        <w:gridCol w:w="5184"/>
+      </w:tblGrid>
+      <w:tr>
+        <w:tc>
+          <w:tcPr>
+            <w:tcW w:type="dxa" w:w="5040"/>
+          </w:tcPr>
+          <w:p>
+            <w:r>
+              <w:rPr>
+                <w:b/>
+                <w:sz w:val="20"/>
+              </w:rPr>
+              <w:t>Präambel</w:t>
+            </w:r>
+          </w:p>
+        </w:tc>
+        <w:tc>
+          <w:tcPr>
+            <w:tcW w:type="dxa" w:w="5040"/>
+          </w:tcPr>
+          <w:p>
+            <w:r>
+              <w:rPr>
+                <w:b/>
+                <w:sz w:val="20"/>
+              </w:rPr>
+              <w:t>Preamble</w:t>
+            </w:r>
+          </w:p>
+        </w:tc>
+      </w:tr>
+      <w:tr>
+        <w:tc>
+          <w:tcPr>
+            <w:tcW w:type="dxa" w:w="5040"/>
+          </w:tcPr>
+          <w:p>
+            <w:r>
+              <w:rPr>
+                <w:sz w:val="17"/>
+              </w:rPr>
+              <w:t>Der Vermieter ist nicht zwingend Eigentümer des Mietobjektes, sondern hat den Mietgegenstand gegebenenfalls vom Eigentümer oder sonstigen Berechtigten zum Zwecke der Weitervermietung angemietet. Der Vermieter vermietet möblierten Wohnraum ausschließlich für begrenzte Zeit zum vorübergehenden Gebrauch.</w:t>
+            </w:r>
+          </w:p>
+        </w:tc>
+        <w:tc>
+          <w:tcPr>
+            <w:tcW w:type="dxa" w:w="5040"/>
+          </w:tcPr>
+          <w:p>
+            <w:r>
+              <w:rPr>
+                <w:sz w:val="17"/>
+              </w:rPr>
+              <w:t>The landlord is not necessarily the owner of the rental property but has rented the property from the owner or another authorised party for the purpose of subletting it. The landlord rents a furnished living space exclusively for a limited period of time for temporary use.</w:t>
+            </w:r>
+          </w:p>
+        </w:tc>
+      </w:tr>
+      <w:tr>
+        <w:tc>
+          <w:tcPr>
+            <w:tcW w:type="dxa" w:w="5040"/>
+          </w:tcPr>
+          <w:p>
+            <w:r>
+              <w:rPr>
+                <w:b/>
+                <w:sz w:val="20"/>
+              </w:rPr>
+              <w:t>1. Mietsache</w:t>
+            </w:r>
+          </w:p>
+        </w:tc>
+        <w:tc>
+          <w:tcPr>
+            <w:tcW w:type="dxa" w:w="5040"/>
+          </w:tcPr>
+          <w:p>
+            <w:r>
+              <w:rPr>
+                <w:b/>
+                <w:sz w:val="20"/>
+              </w:rPr>
+              <w:t>1. Rental property</w:t>
+            </w:r>
+          </w:p>
+        </w:tc>
+      </w:tr>
+      <w:tr>
+        <w:tc>
+          <w:tcPr>
+            <w:tcW w:type="dxa" w:w="5040"/>
+          </w:tcPr>
+          <w:p>
+            <w:r>
+              <w:rPr>
+                <w:sz w:val="17"/>
+              </w:rPr>
+              <w:t>(1) Der Vermieter vermietet dem Mieter zur Nutzung durch folgende Person(en)</w:t>
+              <w:br/>
+              <w:t>1. Bhargavi Mangesh Ayare</w:t>
+              <w:br/>
+              <w:t>zum vorübergehenden Gebrauch folgende Wohnung im Hause Lichtenrader Damm 80, 12305 Berlin, Deutschland , im 2 Geschoss bestehend aus 1 Zimmer(n).</w:t>
+              <w:br/>
+              <w:t>Die Wohnfläche beträgt ca. 23.92 m². Diese Angabe dient wegen möglicher Messfehler nicht zur Festlegung des Mietgegenstandes. Der räumliche Umfang der gemieteten Sache ergibt sich vielmehr aus der Anzahl der vermieteten Räume.</w:t>
+              <w:br/>
+              <w:t>(2) Das Mietobjekt ist voll möbliert und komplett eingerichtet.</w:t>
+              <w:br/>
+              <w:t>(3) Bei Wohnungsübergabe werden dem Mieter folgende Schlüssel ausgehändigt:</w:t>
+              <w:br/>
+              <w:t>Wie bei Übergabe vereinbart</w:t>
+            </w:r>
+          </w:p>
+        </w:tc>
+        <w:tc>
+          <w:tcPr>
+            <w:tcW w:type="dxa" w:w="5040"/>
+          </w:tcPr>
+          <w:p>
+            <w:r>
+              <w:rPr>
+                <w:sz w:val="17"/>
+              </w:rPr>
+              <w:t>(1) The landlord rents to the tenant for temporary use on behalf of the following person(s)</w:t>
+              <w:br/>
+              <w:t>1. Bhargavi Mangesh Ayare</w:t>
+              <w:br/>
+              <w:t>the following apartment is located in Lichtenrader Damm 80, 12305 Berlin, Germany , on 2 floor consisting of 1 rooms.</w:t>
+              <w:br/>
+              <w:t>The residential space consists of approximately 23.92 m². Due to possible measurement errors, this information is not conducive to define the rental property. Instead, the size of the rental property is determined by the number of rented rooms.</w:t>
+              <w:br/>
+              <w:t>(2) The rental property is entirely furnished and completely equipped.</w:t>
+              <w:br/>
+              <w:t>(3) When the apartment is handed over, the following keys are provided to the tenant:</w:t>
+              <w:br/>
+              <w:t>As agreed during key handover</w:t>
+            </w:r>
+          </w:p>
+        </w:tc>
+      </w:tr>
+      <w:tr>
+        <w:tc>
+          <w:tcPr>
+            <w:tcW w:type="dxa" w:w="5040"/>
+          </w:tcPr>
+          <w:p>
+            <w:r>
+              <w:rPr>
+                <w:b/>
+                <w:sz w:val="20"/>
+              </w:rPr>
+              <w:t>2. Mietdauer</w:t>
+            </w:r>
+          </w:p>
+        </w:tc>
+        <w:tc>
+          <w:tcPr>
+            <w:tcW w:type="dxa" w:w="5040"/>
+          </w:tcPr>
+          <w:p>
+            <w:r>
+              <w:rPr>
+                <w:b/>
+                <w:sz w:val="20"/>
+              </w:rPr>
+              <w:t>2. Rental duration</w:t>
+            </w:r>
+          </w:p>
+        </w:tc>
+      </w:tr>
+      <w:tr>
+        <w:tc>
+          <w:tcPr>
+            <w:tcW w:type="dxa" w:w="5040"/>
+          </w:tcPr>
+          <w:p>
+            <w:r>
+              <w:rPr>
+                <w:sz w:val="17"/>
+              </w:rPr>
+              <w:t>(1) Der Mietvertrag beginnt am 25 Mär, 2025 und endet am 30 Sep, 2025.</w:t>
+              <w:br/>
+              <w:t>(2) Die Wohnung ist gemäß § 549 Abs. 2 Nr. 1 BGB lediglich zum vorübergehenden Gebrauch vermietet. Der Vermieter vermietet das Mietobjekt ausschließlich im Rahmen des vorübergehenden Gebrauchs. Auf Seiten des Mieters besteht ein vorübergehender Sonderbedarf, welcher durch die Anmietung der voll möblierten Mietsache im Rahmen des § 549 Abs. 2 Nr. 1 BGB gedeckt werden soll. Der Mieter bestätigt einen vorübergehenden Sonderbedarf Aufgrund eines Studiensemesters außerhalb seines eigentlichen Studienortes.</w:t>
+              <w:br/>
+              <w:t>Sofern der vorübergehende Wohnbedarf aufgrund geänderter Umstände über den vereinbarten Zeitraum hinaus fortbesteht, kommt eine Verlängerung des Mietverhältnisses in Betracht. Hierfür hat der Mieter dem Vermieter den Grund zum vorübergehenden Gebrauch spätestens einen vollen Monat vor Mietende mitzuteilen. Der Vermieter ist nicht verpflichtet, den neuen oder aktualisierten Grund für den Aufenthalt zu akzeptieren und das Mietverhältnis fortzusetzen.</w:t>
+              <w:br/>
+              <w:t>(3) Setzt der Mieter nach Ablauf der Mietzeit den Gebrauch der Mietsache fort, so verlängert sich das</w:t>
+            </w:r>
+          </w:p>
+        </w:tc>
+        <w:tc>
+          <w:tcPr>
+            <w:tcW w:type="dxa" w:w="5040"/>
+          </w:tcPr>
+          <w:p>
+            <w:r>
+              <w:rPr>
+                <w:sz w:val="17"/>
+              </w:rPr>
+              <w:t>(1) The rental contract starts on 25 Mar, 2025 and ends on 30 Sep, 2025.</w:t>
+              <w:br/>
+              <w:t>(2) The apartment is rented for temporary use only, in accordance with section 549, paragraph 2(1) of the German Civil Code (Bürgerliches Gesetzbuch, BGB), the landlord rents the rental property exclusively for temporary use. The tenant has a special need for temporary accommodation, to be covered by renting the fully furnished rental property pursuant to section 549, paragraph 2(1) of the BGB. The tenant confirms a temporary special need Due to a semester of study outside of his/her normal place of study.</w:t>
+              <w:br/>
+              <w:t>If the temporary housing need continues beyond the agreed period due to changed circumstances, an extension of the rental period is possible. For this purpose, the tenant must inform the landlord of the reason for temporary use no later than one full month before the end of the rental period. The landlord is not obliged to accept the new or updated reason for residency and to resume the rental agreement.</w:t>
+              <w:br/>
+              <w:t>(3) If the tenant continues to use the rental property after the termination of the rental period, the rental relationship shall not be extended indefinitely. Section 545 of the BGB is excluded.</w:t>
+            </w:r>
+          </w:p>
+        </w:tc>
+      </w:tr>
+    </w:tbl>
+    <w:p>
+      <w:r>
+        <w:br w:type="page"/>
+      </w:r>
+    </w:p>
+    <w:tbl>
+      <w:tblPr>
+        <w:tblW w:type="auto" w:w="0"/>
+        <w:jc w:val="center"/>
+        <w:tblLook w:firstColumn="1" w:firstRow="1" w:lastColumn="0" w:lastRow="0" w:noHBand="0" w:noVBand="1" w:val="04A0"/>
+      </w:tblPr>
+      <w:tblGrid>
+        <w:gridCol w:w="5184"/>
+        <w:gridCol w:w="5184"/>
+      </w:tblGrid>
+      <w:tr>
+        <w:tc>
+          <w:tcPr>
+            <w:tcW w:type="dxa" w:w="5040"/>
+          </w:tcPr>
+          <w:p>
+            <w:r>
+              <w:rPr>
+                <w:sz w:val="17"/>
+              </w:rPr>
+              <w:t>Mietverhältnis nicht auf unbestimmte Zeit. § 545 BGB wird ausgeschlossen.</w:t>
+            </w:r>
+          </w:p>
+        </w:tc>
+        <w:tc>
+          <w:tcPr>
+            <w:tcW w:type="dxa" w:w="5040"/>
+          </w:tcPr>
+          <w:p>
+            <w:r>
+              <w:rPr>
+                <w:sz w:val="17"/>
+              </w:rPr>
+            </w:r>
+          </w:p>
+        </w:tc>
+      </w:tr>
+      <w:tr>
+        <w:tc>
+          <w:tcPr>
+            <w:tcW w:type="dxa" w:w="5040"/>
+          </w:tcPr>
+          <w:p>
+            <w:r>
+              <w:rPr>
+                <w:b/>
+                <w:sz w:val="20"/>
+              </w:rPr>
+              <w:t>3. Miete</w:t>
+            </w:r>
+          </w:p>
+        </w:tc>
+        <w:tc>
+          <w:tcPr>
+            <w:tcW w:type="dxa" w:w="5040"/>
+          </w:tcPr>
+          <w:p>
+            <w:r>
+              <w:rPr>
+                <w:b/>
+                <w:sz w:val="20"/>
+              </w:rPr>
+              <w:t>3. Rent</w:t>
+            </w:r>
+          </w:p>
+        </w:tc>
+      </w:tr>
+      <w:tr>
+        <w:tc>
+          <w:tcPr>
+            <w:tcW w:type="dxa" w:w="5040"/>
+          </w:tcPr>
+          <w:p>
+            <w:r>
+              <w:rPr>
+                <w:sz w:val="17"/>
+              </w:rPr>
+              <w:t>(1) Die Miete beträgt monatlich 639€, in Worten: sechshundertneununddreißig EURO.</w:t>
+              <w:br/>
+              <w:t>Hierin enthalten ist</w:t>
+              <w:br/>
+              <w:t>• eine Nettokaltmiete inklusive Möblierungszuschlag</w:t>
+              <w:br/>
+              <w:t>• Nebenkosten inkl. Betriebs-, Heiz-, Warmwasser-, Strom- und Internetkosten</w:t>
+              <w:br/>
+              <w:t>(2) Der Mieter hat für eine sachgemäße, nicht übertriebene Nutzung (Fair Usage) der Nebenkosten zu sorgen. Hier ist besonders auf den sachgemäßen Verbrauch von Strom, Wasser und Heizung zu achten.</w:t>
+              <w:br/>
+              <w:t>Die Gesamtmiete beinhaltet eine Internet-Flatrate. Weitere Kosten, die durch die Nutzung der Internetverbindung entstehen (z.B. kostenpflichtige oder illegale Downloads etc.), sind vom Mieter der Wohnung selbst zu tragen und werden mit dem Vermieter abgerechnet. Beim Einzug stellt der Vermieter dem Mieter den Router und die Zugangsdaten für die WLAN-Verbindung zur Verfügung. Beide Parteien sind sich einig, dass der Mieter allein für die Nutzung der Internetverbindungen und die illegale Internetnutzung verantwortlich ist. Bei illegaler Nutzung kann der Vermieter die Internetverbindung ohne Vorankündigung sperren. In diesem Fall hat der Mieter keinen Anspruch auf Mietminderung.</w:t>
+              <w:br/>
+              <w:t>Weitere, unmittelbar mit der Wohnung zusammenhängende Verbrauchskosten, z. B. Telefonkosten, trägt der Mieter selbst.</w:t>
+              <w:br/>
+              <w:t>(3) Bei einem Mietverhältnis mit einer Dauer von unter 6 Monaten findet der aktuell gesetzlich gültige Umsatzsteuersatz Anwendung.</w:t>
+              <w:br/>
+              <w:t>(4) Der Mieter hat zusätzlich zur laufenden Miete eine Endreinigungspauschale in Höhe von 50€ zu leisten, welche bei Rückgabe der Wohnung bar zu übergeben oder zu überweisen ist oder nach Absprache mit dem Vermieter von der Kaution abgezogen wird.</w:t>
+            </w:r>
+          </w:p>
+        </w:tc>
+        <w:tc>
+          <w:tcPr>
+            <w:tcW w:type="dxa" w:w="5040"/>
+          </w:tcPr>
+          <w:p>
+            <w:r>
+              <w:rPr>
+                <w:sz w:val="17"/>
+              </w:rPr>
+              <w:t>(1) The rent amounts to €639 per month, in words: six hundred and thirty-nine EURO.</w:t>
+              <w:br/>
+              <w:t>This includes</w:t>
+              <w:br/>
+              <w:t>• basic rent (ger:, Nettokaltmiete) which includes a furniture surcharge</w:t>
+              <w:br/>
+              <w:t>• Additional expenses lump sum incl. operating, utility, heating, electricity and internet cost</w:t>
+              <w:br/>
+              <w:t>(2) The tenant must ensure proper, non-exaggerated use (fair usage) of the utility costs in particular a proper consumption of electricity, water and heating is important.</w:t>
+              <w:br/>
+              <w:t>The total rent includes an Internet flat rate. Further costs arising from the use of the Internet connection (e.g. fee-based or illegal downloads, etc.) are to be borne by the tenant of the apartment and will be settled with the landlord. When moving in, the landlord provides the tenant with the router and the login details to connect to the WLAN. Both parties agree that the tenant is solely responsible for the Internet connection and liable for the illegal use of the Internet. In the event of illegal use, the landlord can block the Internet connection without prior notice. In this case, the tenant cannot claim a reduction in rent.</w:t>
+              <w:br/>
+              <w:t>Additional consumption costs directly related to the apartment (e.g. telephone costs) shall be borne by the tenant.</w:t>
+              <w:br/>
+              <w:t>(3) In the case of a rental agreement with a duration of less than 6 months, the currently valid statutory VAT rate shall apply.</w:t>
+              <w:br/>
+              <w:t>(4) In addition to the regular rent, the tenant must pay a fee for the final clean-up of €50, which must be paid in cash or by bank transfer at the time of handover of the apartment, or otherwise deducted from the deposit upon consultation with the landlord.</w:t>
+            </w:r>
+          </w:p>
+        </w:tc>
+      </w:tr>
+      <w:tr>
+        <w:tc>
+          <w:tcPr>
+            <w:tcW w:type="dxa" w:w="5040"/>
+          </w:tcPr>
+          <w:p>
+            <w:r>
+              <w:rPr>
+                <w:b/>
+                <w:sz w:val="20"/>
+              </w:rPr>
+              <w:t>4. Mietzahlungen</w:t>
+            </w:r>
+          </w:p>
+        </w:tc>
+        <w:tc>
+          <w:tcPr>
+            <w:tcW w:type="dxa" w:w="5040"/>
+          </w:tcPr>
+          <w:p>
+            <w:r>
+              <w:rPr>
+                <w:b/>
+                <w:sz w:val="20"/>
+              </w:rPr>
+              <w:t>4. Payment of rent</w:t>
+            </w:r>
+          </w:p>
+        </w:tc>
+      </w:tr>
+      <w:tr>
+        <w:tc>
+          <w:tcPr>
+            <w:tcW w:type="dxa" w:w="5040"/>
+          </w:tcPr>
+          <w:p>
+            <w:r>
+              <w:rPr>
+                <w:sz w:val="17"/>
+              </w:rPr>
+              <w:t>(1) Die erste Miete ist bei Vertragsunterzeichnung fällig und beläuft sich auf €639. Leistet der Mieter die vereinbarte Miete nicht, besteht kein Anspruch auf Übergabe der Mietsache.</w:t>
+              <w:br/>
+              <w:t>(2) Im Folgenden ist die Miete monatlich im Voraus, spätestens bis zum 1. Werktag des jeweiligen Monats, kostenfrei an den Vermieter auf folgendes Konto zu leisten:</w:t>
+            </w:r>
+          </w:p>
+        </w:tc>
+        <w:tc>
+          <w:tcPr>
+            <w:tcW w:type="dxa" w:w="5040"/>
+          </w:tcPr>
+          <w:p>
+            <w:r>
+              <w:rPr>
+                <w:sz w:val="17"/>
+              </w:rPr>
+              <w:t>(1) The first rent is due after contract signing and amounts to 639€. If the tenant does not pay the agreed rent, there is no entitlement to occupy the rental property.</w:t>
+              <w:br/>
+              <w:t>(2) In the subsequent period, the rent is to be paid on a monthly basis in advance, at the latest by the first working day of the corresponding month, free of any charges to the landlord, to the following account:</w:t>
+            </w:r>
+          </w:p>
+        </w:tc>
+      </w:tr>
+    </w:tbl>
+    <w:p>
+      <w:r>
+        <w:br w:type="page"/>
+      </w:r>
+    </w:p>
+    <w:tbl>
+      <w:tblPr>
+        <w:tblW w:type="auto" w:w="0"/>
+        <w:jc w:val="center"/>
+        <w:tblLook w:firstColumn="1" w:firstRow="1" w:lastColumn="0" w:lastRow="0" w:noHBand="0" w:noVBand="1" w:val="04A0"/>
+      </w:tblPr>
+      <w:tblGrid>
+        <w:gridCol w:w="5184"/>
+        <w:gridCol w:w="5184"/>
+      </w:tblGrid>
+      <w:tr>
+        <w:tc>
+          <w:tcPr>
+            <w:tcW w:type="dxa" w:w="5040"/>
+          </w:tcPr>
+          <w:p>
+            <w:r>
+              <w:rPr>
+                <w:sz w:val="17"/>
+              </w:rPr>
+              <w:t>Kontoinhaber: Kylasam Nallagoundanpalayam Arruchamy</w:t>
+              <w:br/>
+              <w:t>IBAN: DE87100110012624542768</w:t>
+              <w:br/>
+              <w:t>BIC: NTSBDEB1XXX</w:t>
+              <w:br/>
+              <w:t>Verwendungszweck: Bhargavi Mangesh Ayare "Monat / Jahr"</w:t>
+              <w:br/>
+              <w:br/>
+              <w:t>(3) Für die Rechtzeitigkeit der Zahlung kommt es nicht auf die Absendung, sondern auf den Eingang des Geldes an.</w:t>
+              <w:br/>
+              <w:t>(4) Der Mieter hat für jede Mahnung/ Zahlungserinnerung wegen verspäteter Zahlung der Miete 2,50 Euro für pauschalierte Mahnkosten zu zahlen, sofern der Mieter nicht nachweist, dass dem Vermieter geringere bzw. keine Kosten entstanden sind.</w:t>
+            </w:r>
+          </w:p>
+        </w:tc>
+        <w:tc>
+          <w:tcPr>
+            <w:tcW w:type="dxa" w:w="5040"/>
+          </w:tcPr>
+          <w:p>
+            <w:r>
+              <w:rPr>
+                <w:sz w:val="17"/>
+              </w:rPr>
+              <w:t>Account holder: Kylasam Nallagoundanpalayam Arruchamy</w:t>
+              <w:br/>
+              <w:t>IBAN: DE87100110012624542768</w:t>
+              <w:br/>
+              <w:t>BIC: NTSBDEB1XXX</w:t>
+              <w:br/>
+              <w:t>Payment reference: Bhargavi Mangesh Ayare "Month / Year"</w:t>
+              <w:br/>
+              <w:br/>
+              <w:t>(3) Punctual payment does not depend on the time of transfer, but on the receipt of the money.</w:t>
+              <w:br/>
+              <w:t>(4) For each reminder/overdue payment notice attributable to the late payment of the rent, the tenant must pay a fee of €2,50 as a reminder cost, unless the tenant proves that the landlord has incurred lower or no expenses.</w:t>
+            </w:r>
+          </w:p>
+        </w:tc>
+      </w:tr>
+      <w:tr>
+        <w:tc>
+          <w:tcPr>
+            <w:tcW w:type="dxa" w:w="5040"/>
+          </w:tcPr>
+          <w:p>
+            <w:r>
+              <w:rPr>
+                <w:b/>
+                <w:sz w:val="20"/>
+              </w:rPr>
+              <w:t>5. Mietsicherheit/ Kaution</w:t>
+            </w:r>
+          </w:p>
+        </w:tc>
+        <w:tc>
+          <w:tcPr>
+            <w:tcW w:type="dxa" w:w="5040"/>
+          </w:tcPr>
+          <w:p>
+            <w:r>
+              <w:rPr>
+                <w:b/>
+                <w:sz w:val="20"/>
+              </w:rPr>
+              <w:t>5. Security deposit</w:t>
+            </w:r>
+          </w:p>
+        </w:tc>
+      </w:tr>
+      <w:tr>
+        <w:tc>
+          <w:tcPr>
+            <w:tcW w:type="dxa" w:w="5040"/>
+          </w:tcPr>
+          <w:p>
+            <w:r>
+              <w:rPr>
+                <w:sz w:val="17"/>
+              </w:rPr>
+              <w:t>(1) Der Mieter leistet für die Erfüllung seiner Pflichten aus diesem Mietvertrag zu Beginn des Mietverhältnisses eine Sicherheit in Höhe von 1.200€, an den Vermieter auf folgendes Konto:</w:t>
+              <w:br/>
+              <w:br/>
+              <w:t>Kontoinhaber: Kylasam Nallagoundanpalayam Arruchamy</w:t>
+              <w:br/>
+              <w:t>IBAN: DE25120400000011466000</w:t>
+              <w:br/>
+              <w:t>BIC: COBADEFFXXX</w:t>
+              <w:br/>
+              <w:t>Verwendungszweck: Bhargavi Mangesh Ayare "Kaution"</w:t>
+              <w:br/>
+              <w:t>oder in bar bei Mietvertragsschluss.</w:t>
+              <w:br/>
+              <w:t>(2) Leistet der Mieter die vereinbarte Mietsicherheit nicht, besteht kein Anspruch auf Übergabe der Mietsache.</w:t>
+              <w:br/>
+              <w:t>(3) Nach Vertragsende und Rückgabe der Mietsache rechnet der Vermieter die Kaution gegenüber dem Mieter ab und zahlt, wenn sich die Wohnung in dem Zustand befindet, in dem sie sich am Anfang befand (ausgenommen Verschleiß) den errechneten Kautionsbetrag aus. Ein Zurückbehaltungsrecht des Vermieters besteht nicht, solange keine begründeten Gegenansprüche dargelegt werden (z.B. Schäden an Möbeln, nicht bezahlte Miete).</w:t>
+            </w:r>
+          </w:p>
+        </w:tc>
+        <w:tc>
+          <w:tcPr>
+            <w:tcW w:type="dxa" w:w="5040"/>
+          </w:tcPr>
+          <w:p>
+            <w:r>
+              <w:rPr>
+                <w:sz w:val="17"/>
+              </w:rPr>
+              <w:t>(1) For the fulfilment of his/ her obligations from this rental agreement, the tenant shall pay a security deposit of €1.200, to the landlord due upon the beginning of rental period, to the following bank account:</w:t>
+              <w:br/>
+              <w:br/>
+              <w:t>Account holder: Kylasam Nallagoundanpalayam Arruchamy</w:t>
+              <w:br/>
+              <w:t>IBAN: DE25120400000011466000</w:t>
+              <w:br/>
+              <w:t>BIC: COBADEFFXXX</w:t>
+              <w:br/>
+              <w:t>Payment reference: Bhargavi Mangesh Ayare "Deposit"</w:t>
+              <w:br/>
+              <w:t>or in cash upon conclusion of the rental contract.</w:t>
+              <w:br/>
+              <w:t>(2) If the tenant does not pay the agreed security deposit, there is no entitlement to occupy the rental property.</w:t>
+              <w:br/>
+              <w:t>(3) After termination of the contract and the return of the rental property, the landlord settles the security deposit with the tenant and pays back the deposit amount if the apartment is in the same condition as it was at the start of the contract (excluding wear and tear). The landlord cannot exercise a retention right as long as no justified counter-claims are presented (e.g. damage to furniture, unpaid rent).</w:t>
+            </w:r>
+          </w:p>
+        </w:tc>
+      </w:tr>
+    </w:tbl>
+    <w:p>
+      <w:r>
+        <w:br w:type="page"/>
+      </w:r>
+    </w:p>
+    <w:tbl>
+      <w:tblPr>
+        <w:tblW w:type="auto" w:w="0"/>
+        <w:jc w:val="center"/>
+        <w:tblLook w:firstColumn="1" w:firstRow="1" w:lastColumn="0" w:lastRow="0" w:noHBand="0" w:noVBand="1" w:val="04A0"/>
+      </w:tblPr>
+      <w:tblGrid>
+        <w:gridCol w:w="5184"/>
+        <w:gridCol w:w="5184"/>
+      </w:tblGrid>
+      <w:tr>
+        <w:tc>
+          <w:tcPr>
+            <w:tcW w:type="dxa" w:w="5040"/>
+          </w:tcPr>
+          <w:p>
+            <w:r>
+              <w:rPr>
+                <w:b/>
+                <w:sz w:val="20"/>
+              </w:rPr>
+              <w:t>6. Kündigung</w:t>
+            </w:r>
+          </w:p>
+        </w:tc>
+        <w:tc>
+          <w:tcPr>
+            <w:tcW w:type="dxa" w:w="5040"/>
+          </w:tcPr>
+          <w:p>
+            <w:r>
+              <w:rPr>
+                <w:b/>
+                <w:sz w:val="20"/>
+              </w:rPr>
+              <w:t>6. Termination</w:t>
+            </w:r>
+          </w:p>
+        </w:tc>
+      </w:tr>
+      <w:tr>
+        <w:tc>
+          <w:tcPr>
+            <w:tcW w:type="dxa" w:w="5040"/>
+          </w:tcPr>
+          <w:p>
+            <w:r>
+              <w:rPr>
+                <w:sz w:val="17"/>
+              </w:rPr>
+              <w:t>Der Mietvertrag wird für den in Ziffer 2 genannten Zeitraum fest abgeschlossen.</w:t>
+              <w:br/>
+              <w:t>Das Recht der Parteien zur außerordentlichen Kündigung des Mietverhältnisses bleibt hiervon unberührt.</w:t>
+            </w:r>
+          </w:p>
+        </w:tc>
+        <w:tc>
+          <w:tcPr>
+            <w:tcW w:type="dxa" w:w="5040"/>
+          </w:tcPr>
+          <w:p>
+            <w:r>
+              <w:rPr>
+                <w:sz w:val="17"/>
+              </w:rPr>
+              <w:t>The rental contract is concluded for the period specified in Section 2.</w:t>
+              <w:br/>
+              <w:t>The right of the parties to an exceptional termination of the rent remains unaffected.</w:t>
+            </w:r>
+          </w:p>
+        </w:tc>
+      </w:tr>
+      <w:tr>
+        <w:tc>
+          <w:tcPr>
+            <w:tcW w:type="dxa" w:w="5040"/>
+          </w:tcPr>
+          <w:p>
+            <w:r>
+              <w:rPr>
+                <w:b/>
+                <w:sz w:val="20"/>
+              </w:rPr>
+              <w:t>7. Nutzung der Mietsache</w:t>
+            </w:r>
+          </w:p>
+        </w:tc>
+        <w:tc>
+          <w:tcPr>
+            <w:tcW w:type="dxa" w:w="5040"/>
+          </w:tcPr>
+          <w:p>
+            <w:r>
+              <w:rPr>
+                <w:b/>
+                <w:sz w:val="20"/>
+              </w:rPr>
+              <w:t>7. Use of the rental property</w:t>
+            </w:r>
+          </w:p>
+        </w:tc>
+      </w:tr>
+      <w:tr>
+        <w:tc>
+          <w:tcPr>
+            <w:tcW w:type="dxa" w:w="5040"/>
+          </w:tcPr>
+          <w:p>
+            <w:r>
+              <w:rPr>
+                <w:sz w:val="17"/>
+              </w:rPr>
+              <w:t>(1) Eine weitere Untervermietung, sonstige Gebrauchsüberlassung an Dritte oder gewerbliche Nutzung ist dem Mieter ausdrücklich nicht gestattet.</w:t>
+              <w:br/>
+              <w:t>(2) Haustiere sind in der Wohnung nicht erlaubt</w:t>
+              <w:br/>
+              <w:t>(3) Rauchen ist in der Wohnung nicht erlaubt</w:t>
+            </w:r>
+          </w:p>
+        </w:tc>
+        <w:tc>
+          <w:tcPr>
+            <w:tcW w:type="dxa" w:w="5040"/>
+          </w:tcPr>
+          <w:p>
+            <w:r>
+              <w:rPr>
+                <w:sz w:val="17"/>
+              </w:rPr>
+              <w:t>(1) A further subletting, other transfer of use to third parties or commercial use on behalf of the tenant is expressly prohibited.</w:t>
+              <w:br/>
+              <w:t>(2) Pets are not allowed in the apartment</w:t>
+              <w:br/>
+              <w:t>(3) Smoking in the apartment is not allowed</w:t>
+            </w:r>
+          </w:p>
+        </w:tc>
+      </w:tr>
+      <w:tr>
+        <w:tc>
+          <w:tcPr>
+            <w:tcW w:type="dxa" w:w="5040"/>
+          </w:tcPr>
+          <w:p>
+            <w:r>
+              <w:rPr>
+                <w:b/>
+                <w:sz w:val="20"/>
+              </w:rPr>
+              <w:t>8. Instandhaltungspflicht/ Bauliche Veränderungen</w:t>
+            </w:r>
+          </w:p>
+        </w:tc>
+        <w:tc>
+          <w:tcPr>
+            <w:tcW w:type="dxa" w:w="5040"/>
+          </w:tcPr>
+          <w:p>
+            <w:r>
+              <w:rPr>
+                <w:b/>
+                <w:sz w:val="20"/>
+              </w:rPr>
+              <w:t>8. Obligation to undertake maintenance/ structural modifications</w:t>
+            </w:r>
+          </w:p>
+        </w:tc>
+      </w:tr>
+      <w:tr>
+        <w:tc>
+          <w:tcPr>
+            <w:tcW w:type="dxa" w:w="5040"/>
+          </w:tcPr>
+          <w:p>
+            <w:r>
+              <w:rPr>
+                <w:sz w:val="17"/>
+              </w:rPr>
+              <w:t>(1) Der Mieter ist verpflichtet, die Mietsache sowie die überlassenen Möbel, Einrichtungen und Anlagen schonend und pfleglich zu behandeln. Er hat für eine ordnungsgemäße Reinigung der Mietsache und für eine ausreichende Lüftung und Beheizung des ihm überlassenen Hauses zu sorgen.</w:t>
+              <w:br/>
+              <w:t>(2) Zeigt sich ein wesentlicher Mangel der Mietsache oder wird eine Vorkehrung zum Schutz der Mietsache oder des Anwesens gegen eine nicht vorhergesehene Gefahr erforderlich, so hat der Mieter dies dem Vermieter unverzüglich mitzuteilen und ihm Gelegenheit zu geben, innerhalb angemessener Frist für Abhilfe zu sorgen. Der Mieter hat keinen Anspruch auf Ersatz seiner Aufwendungen, wenn er nicht dem Vermieter vorher diese Gelegenheit gegeben hat, es sei denn, es bestand Gefahr im Verzug.</w:t>
+              <w:br/>
+              <w:t>(3) Den Mieter trifft die Beweislast für den Umstand, dass er einen Schaden nicht zu vertreten hat, wenn die Schadensursache in einem Bereich der Mietsache liegt, der nur ihm als Mietpartei zugänglich ist.</w:t>
+              <w:br/>
+              <w:t>(4) Hat der Mieter einen Schaden zu vertreten, ist er verpflichtet, diesen sofort zu beseitigen. Das bedeutet eine angemessene Schadensersatzzahlung oder der Austausch des beschädigten Inventars.</w:t>
+              <w:br/>
+              <w:t>(5) Der Mieter ist nicht berechtigt, an den gemieteten Räumen bauliche Veränderungen vorzunehmen.</w:t>
+            </w:r>
+          </w:p>
+        </w:tc>
+        <w:tc>
+          <w:tcPr>
+            <w:tcW w:type="dxa" w:w="5040"/>
+          </w:tcPr>
+          <w:p>
+            <w:r>
+              <w:rPr>
+                <w:sz w:val="17"/>
+              </w:rPr>
+              <w:t>(1) The tenant is obliged to treat the rental property, as well as the furniture, furnishings and equipment with respect and care. The tenant shall ensure proper cleaning and sufficient ventilation and heating of the rental property.</w:t>
+              <w:br/>
+              <w:t>(2) If a substantial defect of the rental property becomes apparent or if a precautionary measure is necessary to protect the rental property or the premises against an unforeseen hazard, the tenant shall immediately inform the landlord and grant the opportunity to remedy the situation within a reasonable period of time. The tenant is not entitled to compensation for his/her expenses if no notice was given to the landlord concerning this opportunity, unless an imminent danger was present.</w:t>
+              <w:br/>
+              <w:t>(3) The burden of proof, stating that he/she is not responsible for damage, is borne by the tenant if the cause of the damage is located in an area of the rental property that is solely accessible to him/her as a rental party.</w:t>
+              <w:br/>
+              <w:t>(4) If the tenant is responsible for damage, he/she is obliged to remedy it immediately. This means an appropriate compensation or the replacement of the damaged inventory.</w:t>
+              <w:br/>
+              <w:t>(5) The tenant is not entitled to make structural modifications to the rented rooms.</w:t>
+            </w:r>
+          </w:p>
+        </w:tc>
+      </w:tr>
+    </w:tbl>
+    <w:p>
+      <w:r>
+        <w:br w:type="page"/>
+      </w:r>
+    </w:p>
+    <w:tbl>
+      <w:tblPr>
+        <w:tblW w:type="auto" w:w="0"/>
+        <w:jc w:val="center"/>
+        <w:tblLook w:firstColumn="1" w:firstRow="1" w:lastColumn="0" w:lastRow="0" w:noHBand="0" w:noVBand="1" w:val="04A0"/>
+      </w:tblPr>
+      <w:tblGrid>
+        <w:gridCol w:w="5184"/>
+        <w:gridCol w:w="5184"/>
+      </w:tblGrid>
+      <w:tr>
+        <w:tc>
+          <w:tcPr>
+            <w:tcW w:type="dxa" w:w="5040"/>
+          </w:tcPr>
+          <w:p>
+            <w:r>
+              <w:rPr>
+                <w:b/>
+                <w:sz w:val="20"/>
+              </w:rPr>
+              <w:t>9. Betreten der Mietsache durch den Vermieter</w:t>
+            </w:r>
+          </w:p>
+        </w:tc>
+        <w:tc>
+          <w:tcPr>
+            <w:tcW w:type="dxa" w:w="5040"/>
+          </w:tcPr>
+          <w:p>
+            <w:r>
+              <w:rPr>
+                <w:b/>
+                <w:sz w:val="20"/>
+              </w:rPr>
+              <w:t>9. Entitlement of the landlord to enter the rental property</w:t>
+            </w:r>
+          </w:p>
+        </w:tc>
+      </w:tr>
+      <w:tr>
+        <w:tc>
+          <w:tcPr>
+            <w:tcW w:type="dxa" w:w="5040"/>
+          </w:tcPr>
+          <w:p>
+            <w:r>
+              <w:rPr>
+                <w:sz w:val="17"/>
+              </w:rPr>
+              <w:t>(1) Zur Überprüfung des Wohnungszustandes, der Feststellung der Notwendigkeit unaufschiebbarer Arbeiten, dem Ablesen der Messgeräte oder zum Zwecke des Verkaufs des Anwesens, ist der Vermieter berechtigt, die Mietsache zusammen mit Handwerkern bzw. Miet- oder Kaufinteressenten nach rechtzeitiger vorheriger Abstimmung mit dem Mieter, zu betreten.</w:t>
+              <w:br/>
+              <w:t>(2) Der Vermieter darf die Wohnung darüber hinaus betreten, wenn eine konkrete Gefahr für die Mietsache oder andere Mieter besteht.</w:t>
+              <w:br/>
+              <w:t>(3) Der Mieter hat dafür Sorge zu tragen, dass der Vermieter diese Rechte auch bei längerer Abwesenheit wahrnehmen kann.</w:t>
+            </w:r>
+          </w:p>
+        </w:tc>
+        <w:tc>
+          <w:tcPr>
+            <w:tcW w:type="dxa" w:w="5040"/>
+          </w:tcPr>
+          <w:p>
+            <w:r>
+              <w:rPr>
+                <w:sz w:val="17"/>
+              </w:rPr>
+              <w:t>(1) In order to check the condition of the apartment, to determine the necessity of work that cannot be postponed, to read the counters, or for the purpose of selling the property, the landlord is entitled to enter the rental property together with craftspeople, prospective tenants or purchasers after timely prior consultation with the tenant.</w:t>
+              <w:br/>
+              <w:t>(2) Furthermore, the landlord may enter the apartment in case of concrete danger to the rental property or other tenants.</w:t>
+              <w:br/>
+              <w:t>(3) The tenant must ensure that the landlord can exercise these rights even in case of an extended absence.</w:t>
+            </w:r>
+          </w:p>
+        </w:tc>
+      </w:tr>
+      <w:tr>
+        <w:tc>
+          <w:tcPr>
+            <w:tcW w:type="dxa" w:w="5040"/>
+          </w:tcPr>
+          <w:p>
+            <w:r>
+              <w:rPr>
+                <w:b/>
+                <w:sz w:val="20"/>
+              </w:rPr>
+              <w:t>10. Rückgabe der Mietsache</w:t>
+            </w:r>
+          </w:p>
+        </w:tc>
+        <w:tc>
+          <w:tcPr>
+            <w:tcW w:type="dxa" w:w="5040"/>
+          </w:tcPr>
+          <w:p>
+            <w:r>
+              <w:rPr>
+                <w:b/>
+                <w:sz w:val="20"/>
+              </w:rPr>
+              <w:t>10. Return of the rental property</w:t>
+            </w:r>
+          </w:p>
+        </w:tc>
+      </w:tr>
+      <w:tr>
+        <w:tc>
+          <w:tcPr>
+            <w:tcW w:type="dxa" w:w="5040"/>
+          </w:tcPr>
+          <w:p>
+            <w:r>
+              <w:rPr>
+                <w:sz w:val="17"/>
+              </w:rPr>
+              <w:t>(1) Bei Ende des Mietvertrages hat der Mieter die vollständig möblierte Mietsache mit sämtlichen Schlüsseln – auch den vom Mieter zusätzlich beschafften – von privaten Gegenständen geräumt und besenrein zu übergeben.</w:t>
+              <w:br/>
+              <w:t>(2) Vom Mieter mitgebrachte Gegenstände sind zu entfernen.</w:t>
+            </w:r>
+          </w:p>
+        </w:tc>
+        <w:tc>
+          <w:tcPr>
+            <w:tcW w:type="dxa" w:w="5040"/>
+          </w:tcPr>
+          <w:p>
+            <w:r>
+              <w:rPr>
+                <w:sz w:val="17"/>
+              </w:rPr>
+              <w:t>(1) Upon termination of the rental agreement, the tenant must return the fully furnished rental property with all keys (including those additionally produced by the tenant), cleared of any private items and swept clean.</w:t>
+              <w:br/>
+              <w:t>(2) Objects brought by the tenant must be removed.</w:t>
+            </w:r>
+          </w:p>
+        </w:tc>
+      </w:tr>
+      <w:tr>
+        <w:tc>
+          <w:tcPr>
+            <w:tcW w:type="dxa" w:w="5040"/>
+          </w:tcPr>
+          <w:p>
+            <w:r>
+              <w:rPr>
+                <w:b/>
+                <w:sz w:val="20"/>
+              </w:rPr>
+              <w:t>11. Erfüllungsort und Gerichtsstand</w:t>
+            </w:r>
+          </w:p>
+        </w:tc>
+        <w:tc>
+          <w:tcPr>
+            <w:tcW w:type="dxa" w:w="5040"/>
+          </w:tcPr>
+          <w:p>
+            <w:r>
+              <w:rPr>
+                <w:b/>
+                <w:sz w:val="20"/>
+              </w:rPr>
+              <w:t>11. Place of performance and jurisdiction</w:t>
+            </w:r>
+          </w:p>
+        </w:tc>
+      </w:tr>
+      <w:tr>
+        <w:tc>
+          <w:tcPr>
+            <w:tcW w:type="dxa" w:w="5040"/>
+          </w:tcPr>
+          <w:p>
+            <w:r>
+              <w:rPr>
+                <w:sz w:val="17"/>
+              </w:rPr>
+              <w:t>Erfüllungsort und Gerichtsstand für alle sich aus diesem Vertrag ergebenden Verpflichtungen ist der Ort der Wohnung.</w:t>
+            </w:r>
+          </w:p>
+        </w:tc>
+        <w:tc>
+          <w:tcPr>
+            <w:tcW w:type="dxa" w:w="5040"/>
+          </w:tcPr>
+          <w:p>
+            <w:r>
+              <w:rPr>
+                <w:sz w:val="17"/>
+              </w:rPr>
+              <w:t>The place of performance and the jurisdiction for all obligations arising from this contract is the location of the apartment.</w:t>
+            </w:r>
+          </w:p>
+        </w:tc>
+      </w:tr>
+      <w:tr>
+        <w:tc>
+          <w:tcPr>
+            <w:tcW w:type="dxa" w:w="5040"/>
+          </w:tcPr>
+          <w:p>
+            <w:r>
+              <w:rPr>
+                <w:b/>
+                <w:sz w:val="20"/>
+              </w:rPr>
+              <w:t>12. Datenschutz</w:t>
+            </w:r>
+          </w:p>
+        </w:tc>
+        <w:tc>
+          <w:tcPr>
+            <w:tcW w:type="dxa" w:w="5040"/>
+          </w:tcPr>
+          <w:p>
+            <w:r>
+              <w:rPr>
+                <w:b/>
+                <w:sz w:val="20"/>
+              </w:rPr>
+              <w:t>12. Data protection</w:t>
+            </w:r>
+          </w:p>
+        </w:tc>
+      </w:tr>
+      <w:tr>
+        <w:tc>
+          <w:tcPr>
+            <w:tcW w:type="dxa" w:w="5040"/>
+          </w:tcPr>
+          <w:p>
+            <w:r>
+              <w:rPr>
+                <w:sz w:val="17"/>
+              </w:rPr>
+              <w:t>Der Mieter hat davon Kenntnis genommen, dass die Daten, die zur ordnungsgemäßen Durchführung der vertraglichen Bestimmungen oder zur üblichen Betreuung des Mieters erforderlich sind, auf Datenträger gespeichert und nach den Bestimmungen der Datenschutzgrundverordnung (DSGVO) bearbeitet werden. Der Mieter erklärt sich mit der Einholung einer Auskunft über seine Zahlungsfähigkeit einverstanden.</w:t>
+            </w:r>
+          </w:p>
+        </w:tc>
+        <w:tc>
+          <w:tcPr>
+            <w:tcW w:type="dxa" w:w="5040"/>
+          </w:tcPr>
+          <w:p>
+            <w:r>
+              <w:rPr>
+                <w:sz w:val="17"/>
+              </w:rPr>
+              <w:t>The tenant is aware that the data required for the proper execution of the contractual provisions or for the regular support of the tenant will be stored on data carriers and processed in accordance with the provisions of the General Data Protection Regulations (GDPR). The tenant agrees to obtain information about his/her solvency.</w:t>
+            </w:r>
+          </w:p>
+        </w:tc>
+      </w:tr>
+      <w:tr>
+        <w:tc>
+          <w:tcPr>
+            <w:tcW w:type="dxa" w:w="5040"/>
+          </w:tcPr>
+          <w:p>
+            <w:r>
+              <w:rPr>
+                <w:b/>
+                <w:sz w:val="20"/>
+              </w:rPr>
+              <w:t>13. Individuelle Vereinbarungen</w:t>
+            </w:r>
+          </w:p>
+        </w:tc>
+        <w:tc>
+          <w:tcPr>
+            <w:tcW w:type="dxa" w:w="5040"/>
+          </w:tcPr>
+          <w:p>
+            <w:r>
+              <w:rPr>
+                <w:b/>
+                <w:sz w:val="20"/>
+              </w:rPr>
+              <w:t>13. Individual stipulations</w:t>
+            </w:r>
+          </w:p>
+        </w:tc>
+      </w:tr>
+      <w:tr>
+        <w:tc>
+          <w:tcPr>
+            <w:tcW w:type="dxa" w:w="5040"/>
+          </w:tcPr>
+          <w:p>
+            <w:r>
+              <w:rPr>
+                <w:sz w:val="17"/>
+              </w:rPr>
+              <w:t>5 % Erhöhung der Miete pro Jahr</w:t>
+              <w:br/>
+              <w:t>Wenn Sie es mit anderen Personen teilen, müssen Sie den Kauf gemeinsamer Gegenstände wie WC-Reinigungsflüssigkeit unter den Mietern einplanen.</w:t>
+            </w:r>
+          </w:p>
+        </w:tc>
+        <w:tc>
+          <w:tcPr>
+            <w:tcW w:type="dxa" w:w="5040"/>
+          </w:tcPr>
+          <w:p>
+            <w:r>
+              <w:rPr>
+                <w:sz w:val="17"/>
+              </w:rPr>
+              <w:t>5% increase on rent/year</w:t>
+              <w:br/>
+              <w:t>if shared with other people, need to plan buying common items like wc cleaning liquid among tenants.</w:t>
+            </w:r>
+          </w:p>
+        </w:tc>
+      </w:tr>
+    </w:tbl>
+    <w:p>
+      <w:r>
+        <w:br w:type="page"/>
+      </w:r>
+    </w:p>
+    <w:tbl>
+      <w:tblPr>
+        <w:tblW w:type="auto" w:w="0"/>
+        <w:jc w:val="center"/>
+        <w:tblLook w:firstColumn="1" w:firstRow="1" w:lastColumn="0" w:lastRow="0" w:noHBand="0" w:noVBand="1" w:val="04A0"/>
+      </w:tblPr>
+      <w:tblGrid>
+        <w:gridCol w:w="5184"/>
+        <w:gridCol w:w="5184"/>
+      </w:tblGrid>
+      <w:tr>
+        <w:tc>
+          <w:tcPr>
+            <w:tcW w:type="dxa" w:w="5040"/>
+          </w:tcPr>
+          <w:p>
+            <w:r>
+              <w:rPr>
+                <w:b/>
+                <w:sz w:val="20"/>
+              </w:rPr>
+              <w:t>14. Salvatorische Klausel</w:t>
+            </w:r>
+          </w:p>
+        </w:tc>
+        <w:tc>
+          <w:tcPr>
+            <w:tcW w:type="dxa" w:w="5040"/>
+          </w:tcPr>
+          <w:p>
+            <w:r>
+              <w:rPr>
+                <w:b/>
+                <w:sz w:val="20"/>
+              </w:rPr>
+              <w:t>14. Severability clause</w:t>
+            </w:r>
+          </w:p>
+        </w:tc>
+      </w:tr>
+      <w:tr>
+        <w:tc>
+          <w:tcPr>
+            <w:tcW w:type="dxa" w:w="5040"/>
+          </w:tcPr>
+          <w:p>
+            <w:r>
+              <w:rPr>
+                <w:sz w:val="17"/>
+              </w:rPr>
+              <w:t>Soweit eine der Bestimmungen dieses Mietvertrages, gleich aus welchem Grund, unwirksam sein sollte, gelten die übrigen Bestimmungen unverändert fort. Die Vertragspartner vereinbaren jedoch bereits jetzt eine unwirksame Bestimmung durch eine gültige Bestimmung zu ersetzen, die dem gewollten Zweck in gesetzlich zulässiger Weise am nächsten kommt.</w:t>
+            </w:r>
+          </w:p>
+        </w:tc>
+        <w:tc>
+          <w:tcPr>
+            <w:tcW w:type="dxa" w:w="5040"/>
+          </w:tcPr>
+          <w:p>
+            <w:r>
+              <w:rPr>
+                <w:sz w:val="17"/>
+              </w:rPr>
+              <w:t>Should one of the provisions of this rental agreement be invalid for any reason whatsoever, the remaining provisions shall continue to apply, unchanged. Nevertheless, the contracting parties hereby agree to replace an invalid provision with a valid provision which comes closest to the intended purpose in a lawful manner.</w:t>
+            </w:r>
+          </w:p>
+        </w:tc>
+      </w:tr>
+    </w:tbl>
+    <w:p/>
+    <w:tbl>
+      <w:tblPr>
+        <w:tblW w:type="auto" w:w="0"/>
+        <w:jc w:val="center"/>
+        <w:tblLook w:firstColumn="1" w:firstRow="1" w:lastColumn="0" w:lastRow="0" w:noHBand="0" w:noVBand="1" w:val="04A0"/>
+      </w:tblPr>
+      <w:tblGrid>
+        <w:gridCol w:w="5040"/>
+        <w:gridCol w:w="5040"/>
       </w:tblGrid>
       <w:tr>
         <w:tc>
@@ -271,20 +1527,8 @@
             <w:r>
               <w:rPr>
                 <w:b/>
-                <w:sz w:val="18"/>
               </w:rPr>
-              <w:t>§ 1 Mietdauer &amp; Befristungszweck (§ 549 Abs. 2 / § 575 BGB)</w:t>
-              <w:br/>
-            </w:r>
-            <w:r>
-              <w:rPr>
-                <w:sz w:val="16"/>
-              </w:rPr>
-              <w:t>(1) Mietzeit: Beginn am 02.11.2026, befristetes Ende am 30.04.2027. Mindestmietdauer beträgt sechs (6) Monate.</w:t>
-              <w:br/>
-              <w:t>(2) Zweck: Vorübergehender Gebrauch gem. § 549 Abs. 2 Nr. 1 BGB (Aufgrund eines Studien-, Praktikums- oder Erwerbsaufenthalts in Berlin).</w:t>
-              <w:br/>
-              <w:t>(3) Ausschluss: Stillschweigende Verlängerung (§ 545 BGB) ist ausgeschlossen.</w:t>
+              <w:t>Kylasam Nallagoundanpalayam Arruchamy</w:t>
             </w:r>
           </w:p>
         </w:tc>
@@ -296,21 +1540,36 @@
             <w:r>
               <w:rPr>
                 <w:b/>
-                <w:color w:val="475569"/>
-                <w:sz w:val="18"/>
               </w:rPr>
-              <w:t>§ 1 Lease Term &amp; Temporary Purpose (§ 549 (2) / § 575 BGB)</w:t>
-              <w:br/>
+              <w:t>Bhargavi Mangesh Ayare</w:t>
             </w:r>
+          </w:p>
+        </w:tc>
+      </w:tr>
+      <w:tr>
+        <w:tc>
+          <w:tcPr>
+            <w:tcW w:type="dxa" w:w="5184"/>
+          </w:tcPr>
+          <w:p>
             <w:r>
               <w:rPr>
-                <w:sz w:val="16"/>
+                <w:sz w:val="17"/>
               </w:rPr>
-              <w:t>(1) Term: Commences on 2 Nov, 2026, terminates on 30 Apr, 2027. Minimum lease term is six (6) months.</w:t>
-              <w:br/>
-              <w:t>(2) Purpose: Temporary living pursuant to Section 549 (2) No. 1 BGB (Due to an academic, internship, or professional stay in Berlin).</w:t>
-              <w:br/>
-              <w:t>(3) Tacit Renewal: Section 545 BGB is strictly excluded.</w:t>
+              <w:t>20 Mar 2025, 10:39 GMT</w:t>
+            </w:r>
+          </w:p>
+        </w:tc>
+        <w:tc>
+          <w:tcPr>
+            <w:tcW w:type="dxa" w:w="5184"/>
+          </w:tcPr>
+          <w:p>
+            <w:r>
+              <w:rPr>
+                <w:sz w:val="17"/>
+              </w:rPr>
+              <w:t>21 Mar 2025, 12:36 GMT</w:t>
             </w:r>
           </w:p>
         </w:tc>
@@ -324,20 +1583,8 @@
             <w:r>
               <w:rPr>
                 <w:b/>
-                <w:sz w:val="18"/>
               </w:rPr>
-              <w:t>§ 2 Miethöhe, Pauschale &amp; Nebenkosten</w:t>
-              <w:br/>
-            </w:r>
-            <w:r>
-              <w:rPr>
-                <w:sz w:val="16"/>
-              </w:rPr>
-              <w:t>(1) Warmmiete: 649 € monatlich (Sechshundertneunundvierzig Euro).</w:t>
-              <w:br/>
-              <w:t>(2) Inklusivleistungen: Kalte &amp; warme Betriebskosten, Strom, Heizung und Vodafone 1000 Mbit/s WLAN in verbrauchsüblichem Maße (Fair Use).</w:t>
-              <w:br/>
-              <w:t>(3) ARD-Beitrag &amp; Endreinigung: GEZ ist nicht enthalten (von WG eigenständig getragen). Endreinigungspauschale bei Auszug: 70,00 €.</w:t>
+              <w:t>Vom Vermieter akzeptiert</w:t>
             </w:r>
           </w:p>
         </w:tc>
@@ -349,21 +1596,8 @@
             <w:r>
               <w:rPr>
                 <w:b/>
-                <w:color w:val="475569"/>
-                <w:sz w:val="18"/>
               </w:rPr>
-              <w:t>§ 2 Rent, Utilities &amp; Public License Fee</w:t>
-              <w:br/>
-            </w:r>
-            <w:r>
-              <w:rPr>
-                <w:sz w:val="16"/>
-              </w:rPr>
-              <w:t>(1) Rent: Flat monthly rate of €649 (Six hundred forty-nine euros).</w:t>
-              <w:br/>
-              <w:t>(2) Inclusions: Heating, water, electricity, operating costs and Vodafone 1000 Mbps Wi-Fi based on customary fair use.</w:t>
-              <w:br/>
-              <w:t>(3) ARD License &amp; Cleaning: Broadcasting fee (GEZ) settled directly by WG. Final cleaning fee upon checkout: €70,00.</w:t>
+              <w:t>Vom Mieter akzeptiert</w:t>
             </w:r>
           </w:p>
         </w:tc>
@@ -376,21 +1610,9 @@
           <w:p>
             <w:r>
               <w:rPr>
-                <w:b/>
-                <w:sz w:val="18"/>
+                <w:sz w:val="17"/>
               </w:rPr>
-              <w:t>§ 3 Kaution &amp; Mietsicherheit (§ 551 BGB)</w:t>
-              <w:br/>
-            </w:r>
-            <w:r>
-              <w:rPr>
-                <w:sz w:val="16"/>
-              </w:rPr>
-              <w:t>(1) Kaution: 1.000 € (Eintausend Euro).</w:t>
-              <w:br/>
-              <w:t>(2) Fälligkeit: Vor Einzug am 02.11.2026 vollständig auf das Vermieterkonto zu zahlen. Keine Schlüssel ohne Geldeingang.</w:t>
-              <w:br/>
-              <w:t>(3) Erstattung: Treuhandverwahrung gem. § 551 BGB; Erstattung innerhalb von 30 Tagen nach Auszug abzüglich berechtigter Forderungen. Kein Aufrechnen gegen Miete.</w:t>
+              <w:t>Accepted by Landlord</w:t>
             </w:r>
           </w:p>
         </w:tc>
@@ -401,607 +1623,17 @@
           <w:p>
             <w:r>
               <w:rPr>
-                <w:b/>
-                <w:color w:val="475569"/>
-                <w:sz w:val="18"/>
+                <w:sz w:val="17"/>
               </w:rPr>
-              <w:t>§ 3 Security Deposit &amp; Escrow (§ 551 BGB)</w:t>
-              <w:br/>
-            </w:r>
-            <w:r>
-              <w:rPr>
-                <w:sz w:val="16"/>
-              </w:rPr>
-              <w:t>(1) Deposit: €1.000 (One thousand euros).</w:t>
-              <w:br/>
-              <w:t>(2) Due Date: Payable in full before move-in on 2 Nov, 2026. Key handover denied without receipt.</w:t>
-              <w:br/>
-              <w:t>(3) Refund: Escrow under § 551 BGB; refunded within 30 days after move-out protocol less proven claims. No set-off against ongoing rent.</w:t>
-            </w:r>
-          </w:p>
-        </w:tc>
-      </w:tr>
-      <w:tr>
-        <w:tc>
-          <w:tcPr>
-            <w:tcW w:type="dxa" w:w="5184"/>
-          </w:tcPr>
-          <w:p>
-            <w:r>
-              <w:rPr>
-                <w:b/>
-                <w:sz w:val="18"/>
-              </w:rPr>
-              <w:t>§ 4 Zahlungsbedingungen, Fälligkeit &amp; Verzug</w:t>
-              <w:br/>
-            </w:r>
-            <w:r>
-              <w:rPr>
-                <w:sz w:val="16"/>
-              </w:rPr>
-              <w:t>(1) Fälligkeit: Bis spätestens zum 3. Werktag des Monats im Voraus kostenfrei zu überweisen.</w:t>
-              <w:br/>
-              <w:t>(2) Bank: N26 Bank AG, Berlin | Inhaber: Kylasam Nallagoundanpalayam Arruchamy | IBAN: DE87100110012624542768 | BIC: NTSBDEB1XXX.</w:t>
-              <w:br/>
-              <w:t>(3) Verzug: Mahngebühr 5,00 € je Mahnung. Kündigung gem. § 543 Abs. 2 BGB bei Verzug von 2 Monatsmieten.</w:t>
-            </w:r>
-          </w:p>
-        </w:tc>
-        <w:tc>
-          <w:tcPr>
-            <w:tcW w:type="dxa" w:w="5184"/>
-          </w:tcPr>
-          <w:p>
-            <w:r>
-              <w:rPr>
-                <w:b/>
-                <w:color w:val="475569"/>
-                <w:sz w:val="18"/>
-              </w:rPr>
-              <w:t>§ 4 Payment Terms, Due Dates &amp; Late Fees</w:t>
-              <w:br/>
-            </w:r>
-            <w:r>
-              <w:rPr>
-                <w:sz w:val="16"/>
-              </w:rPr>
-              <w:t>(1) Due Date: Payable in advance on or before the 3rd business day of each month via wire transfer.</w:t>
-              <w:br/>
-              <w:t>(2) Account: N26 Bank AG, Berlin | Holder: Kylasam Nallagoundanpalayam Arruchamy | IBAN: DE87100110012624542768 | BIC: NTSBDEB1XXX.</w:t>
-              <w:br/>
-              <w:t>(3) Default: Reminder charge of €5,00 per notice. Cancellation under § 543 (2) BGB for 2 months arrears.</w:t>
-            </w:r>
-          </w:p>
-        </w:tc>
-      </w:tr>
-      <w:tr>
-        <w:tc>
-          <w:tcPr>
-            <w:tcW w:type="dxa" w:w="5184"/>
-          </w:tcPr>
-          <w:p>
-            <w:r>
-              <w:rPr>
-                <w:b/>
-                <w:sz w:val="18"/>
-              </w:rPr>
-              <w:t>§ 5 Kündigung &amp; Nachmieterstellung</w:t>
-              <w:br/>
-            </w:r>
-            <w:r>
-              <w:rPr>
-                <w:sz w:val="16"/>
-              </w:rPr>
-              <w:t>(1) Ordentliche Kündigung: Während der festen Mietdauer ausgeschlossen.</w:t>
-              <w:br/>
-              <w:t>(2) Nachmieter: Vorzeitige Entlassung mit 3 Monaten Frist zum Monatsende bei Gestellung eines solventen, für die WG zumutbaren Nachmieters.</w:t>
-              <w:br/>
-              <w:t>(3) Außerordentliche Kündigung: Gesetzliche Kündigung aus wichtigem Grund (§§ 543, 569 BGB) bleibt unberührt.</w:t>
-            </w:r>
-          </w:p>
-        </w:tc>
-        <w:tc>
-          <w:tcPr>
-            <w:tcW w:type="dxa" w:w="5184"/>
-          </w:tcPr>
-          <w:p>
-            <w:r>
-              <w:rPr>
-                <w:b/>
-                <w:color w:val="475569"/>
-                <w:sz w:val="18"/>
-              </w:rPr>
-              <w:t>§ 5 Termination &amp; Replacement Tenant Release</w:t>
-              <w:br/>
-            </w:r>
-            <w:r>
-              <w:rPr>
-                <w:sz w:val="16"/>
-              </w:rPr>
-              <w:t>(1) Ordinary Notice: Excluded during the fixed lease term.</w:t>
-              <w:br/>
-              <w:t>(2) Replacement Tenant: Early release with 3 months' notice to month-end upon presenting an accepted solvent replacement tenant who executes a contract.</w:t>
-              <w:br/>
-              <w:t>(3) Cause: Extraordinary termination for good cause (§§ 543, 569 BGB) unaffected.</w:t>
-            </w:r>
-          </w:p>
-        </w:tc>
-      </w:tr>
-      <w:tr>
-        <w:tc>
-          <w:tcPr>
-            <w:tcW w:type="dxa" w:w="5184"/>
-          </w:tcPr>
-          <w:p>
-            <w:r>
-              <w:rPr>
-                <w:b/>
-                <w:sz w:val="18"/>
-              </w:rPr>
-              <w:t>§ 6 AGB &amp; Anlagen als Vertragsbestandteil</w:t>
-              <w:br/>
-            </w:r>
-            <w:r>
-              <w:rPr>
-                <w:sz w:val="16"/>
-              </w:rPr>
-              <w:t>Anlage 1 (Inventar) und Anlage 2 (AGB § 1 bis § 8) werden mit Unterschrift anerkannt. Übergabeprotokoll, Schlüsselquittung und Wohnungsgeberbestätigung (§ 19 BMG) werden bei Einzug ausgehändigt.</w:t>
-            </w:r>
-          </w:p>
-        </w:tc>
-        <w:tc>
-          <w:tcPr>
-            <w:tcW w:type="dxa" w:w="5184"/>
-          </w:tcPr>
-          <w:p>
-            <w:r>
-              <w:rPr>
-                <w:b/>
-                <w:color w:val="475569"/>
-                <w:sz w:val="18"/>
-              </w:rPr>
-              <w:t>§ 6 Terms &amp; Attachments</w:t>
-              <w:br/>
-            </w:r>
-            <w:r>
-              <w:rPr>
-                <w:sz w:val="16"/>
-              </w:rPr>
-              <w:t>Attachment 1 (Inventory) and Attachment 2 (GTC § 1 to § 8) are integral binding parts. Handover protocol, keys acknowledgement, and landlord confirmation (§ 19 BMG) provided upon move-in.</w:t>
-            </w:r>
-          </w:p>
-        </w:tc>
-      </w:tr>
-      <w:tr>
-        <w:tc>
-          <w:tcPr>
-            <w:tcW w:type="dxa" w:w="5184"/>
-          </w:tcPr>
-          <w:p>
-            <w:r>
-              <w:rPr>
-                <w:b/>
-                <w:sz w:val="18"/>
-              </w:rPr>
-              <w:t>AGB § 1 Zusammenleben in der WG / mit den Nachbarn</w:t>
-              <w:br/>
-            </w:r>
-            <w:r>
-              <w:rPr>
-                <w:sz w:val="16"/>
-              </w:rPr>
-              <w:t>Rücksichtnahme in der WG. Ruhezeiten: 13:00–15:00 Uhr sowie 22:00–08:00 Uhr (Sonn-/Feiertage ganztägig). TV/Audio auf Zimmerlautstärke. Störende Partys verboten. Reinigung eigenverantwortlich nach Putzplan; bei Säumnis Vergabe an Fremdfirma auf WG-Kosten. Striktes Rauch- und Drogenverbot (Strafanzeige). Keine Haustiere. Gäste max. 5 Tage/Monat.</w:t>
-            </w:r>
-          </w:p>
-        </w:tc>
-        <w:tc>
-          <w:tcPr>
-            <w:tcW w:type="dxa" w:w="5184"/>
-          </w:tcPr>
-          <w:p>
-            <w:r>
-              <w:rPr>
-                <w:b/>
-                <w:color w:val="475569"/>
-                <w:sz w:val="18"/>
-              </w:rPr>
-              <w:t>GTC § 1 Cohabitation in Flat Share / Neighbours</w:t>
-              <w:br/>
-            </w:r>
-            <w:r>
-              <w:rPr>
-                <w:sz w:val="16"/>
-              </w:rPr>
-              <w:t>Mutual courtesy. Quiet hours: 1:00pm–3:00pm and 10:00pm–8:00am (Sundays/holidays full quiet). Media at room volume. Disruptive parties prohibited. Shared cleaning rota; default results in professional cleaning at tenants' equal cost. Strict non-smoking and drug ban (police report). No pets. Overnight guests max 5 days/month.</w:t>
-            </w:r>
-          </w:p>
-        </w:tc>
-      </w:tr>
-      <w:tr>
-        <w:tc>
-          <w:tcPr>
-            <w:tcW w:type="dxa" w:w="5184"/>
-          </w:tcPr>
-          <w:p>
-            <w:r>
-              <w:rPr>
-                <w:b/>
-                <w:sz w:val="18"/>
-              </w:rPr>
-              <w:t>AGB § 2 Regelungen zur Wohnung</w:t>
-              <w:br/>
-            </w:r>
-            <w:r>
-              <w:rPr>
-                <w:sz w:val="16"/>
-              </w:rPr>
-              <w:t>Ausschließlich Wohnzwecke. Stoßlüften mind. 2x täglich für 5–10 Min. (kein Dauerkippen im Winter). WLAN bereitgestellt; P2P/Torrents verboten; Mieter haftet und stellt Vermieter frei. Wandbohrungen, Nägel, Dübel und klebende Folien untersagt. Abflüsse vor Fett/Abfall schützen. Mülltrennung nach BSR (Gelb, Papier, Bio, Rest). Türen 22:00–06:00 Uhr geschlossen. Zutrittsrecht des Vermieters werktags 09–12 &amp; 15–20h nach Vorankündigung (letzte 4 Wochen mind. 5 Termine) und bei Gefahr im Verzug.</w:t>
-            </w:r>
-          </w:p>
-        </w:tc>
-        <w:tc>
-          <w:tcPr>
-            <w:tcW w:type="dxa" w:w="5184"/>
-          </w:tcPr>
-          <w:p>
-            <w:r>
-              <w:rPr>
-                <w:b/>
-                <w:color w:val="475569"/>
-                <w:sz w:val="18"/>
-              </w:rPr>
-              <w:t>GTC § 2 Apartment Regulations</w:t>
-              <w:br/>
-            </w:r>
-            <w:r>
-              <w:rPr>
-                <w:sz w:val="16"/>
-              </w:rPr>
-              <w:t>Residential use only. Air out 2x daily 5–10 min (no tilting in winter). Wi-Fi provided; P2P/torrents prohibited; tenant fully indemnifies landlord. No drilling, nails, screws or wall plugs. Drains kept free of grease/solids. Waste sorting per Berlin BSR. Doors closed 10:00pm–6:00am. Landlord access workdays 9am–12pm &amp; 3pm–8pm upon notice (at least 5 viewings in last 4 weeks) and anytime during emergencies.</w:t>
-            </w:r>
-          </w:p>
-        </w:tc>
-      </w:tr>
-      <w:tr>
-        <w:tc>
-          <w:tcPr>
-            <w:tcW w:type="dxa" w:w="5184"/>
-          </w:tcPr>
-          <w:p>
-            <w:r>
-              <w:rPr>
-                <w:b/>
-                <w:sz w:val="18"/>
-              </w:rPr>
-              <w:t>AGB § 3 Zahlungsvereinbarungen</w:t>
-              <w:br/>
-            </w:r>
-            <w:r>
-              <w:rPr>
-                <w:sz w:val="16"/>
-              </w:rPr>
-              <w:t>Rechtzeitigkeit nach Geldeingang. Kaution sichert alle Ansprüche; kein Aufrechnen vor Mietende. Miete im Voraus bis 3. Werktag. Kautionsabrechnung binnen 30 Tagen nach Auszug. Fair Usage der Nebenkosten (&gt; 25% Mehraufwand wird umgelegt). Mahngebühr 5,00 € je Mahnung. Mieterhöhung nach BGB. Aufrechnung nur mit 1 Monat Vorankündigung.</w:t>
-            </w:r>
-          </w:p>
-        </w:tc>
-        <w:tc>
-          <w:tcPr>
-            <w:tcW w:type="dxa" w:w="5184"/>
-          </w:tcPr>
-          <w:p>
-            <w:r>
-              <w:rPr>
-                <w:b/>
-                <w:color w:val="475569"/>
-                <w:sz w:val="18"/>
-              </w:rPr>
-              <w:t>GTC § 3 Payment Agreements</w:t>
-              <w:br/>
-            </w:r>
-            <w:r>
-              <w:rPr>
-                <w:sz w:val="16"/>
-              </w:rPr>
-              <w:t>Punctuality determined by account credit date. Deposit secures all claims; no set-off against ongoing rent. Rent in advance by 3rd business day. Deposit refund within 30 days after move-out. Fair usage (&gt; 25% excess billed). Overdue fine €5.00 per notice. Rent adjustments per statutory law. Set-off requires 1 month notice.</w:t>
-            </w:r>
-          </w:p>
-        </w:tc>
-      </w:tr>
-      <w:tr>
-        <w:tc>
-          <w:tcPr>
-            <w:tcW w:type="dxa" w:w="5184"/>
-          </w:tcPr>
-          <w:p>
-            <w:r>
-              <w:rPr>
-                <w:b/>
-                <w:sz w:val="18"/>
-              </w:rPr>
-              <w:t>AGB § 4 Übergabe und Rückgabe &amp; Schlüsselgebühren</w:t>
-              <w:br/>
-            </w:r>
-            <w:r>
-              <w:rPr>
-                <w:sz w:val="16"/>
-              </w:rPr>
-              <w:t>Übergabe nach Zahlungseingang per Protokoll. Bei Auszug geräumt und besenrein bis 11:00 Uhr mit allen Schlüsseln. Schlüsselersatzpauschalen:</w:t>
-              <w:br/>
-              <w:t>• Haustür (Schließanlage): 680,00 € | Wohnung: 120,00 €</w:t>
-              <w:br/>
-              <w:t>• Zimmer: 90,00 € | Briefkasten: 70,00 €</w:t>
-              <w:br/>
-              <w:t>Zusätzliche Haftung für Schlossaustausch der Schließanlage.</w:t>
-            </w:r>
-          </w:p>
-        </w:tc>
-        <w:tc>
-          <w:tcPr>
-            <w:tcW w:type="dxa" w:w="5184"/>
-          </w:tcPr>
-          <w:p>
-            <w:r>
-              <w:rPr>
-                <w:b/>
-                <w:color w:val="475569"/>
-                <w:sz w:val="18"/>
-              </w:rPr>
-              <w:t>GTC § 4 Handover, Departure &amp; Key Replacement Schedule</w:t>
-              <w:br/>
-            </w:r>
-            <w:r>
-              <w:rPr>
-                <w:sz w:val="16"/>
-              </w:rPr>
-              <w:t>Handover after payment receipt with protocol. Departure by 11:00am cleared, swept-clean with all keys. Key replacement schedule:</w:t>
-              <w:br/>
-              <w:t>• Building entrance (master system): €680.00 | Flat: €120.00</w:t>
-              <w:br/>
-              <w:t>• Room: €90.00 | Mailbox: €70.00</w:t>
-              <w:br/>
-              <w:t>Tenant additionally liable for lock cylinder replacement.</w:t>
-            </w:r>
-          </w:p>
-        </w:tc>
-      </w:tr>
-      <w:tr>
-        <w:tc>
-          <w:tcPr>
-            <w:tcW w:type="dxa" w:w="5184"/>
-          </w:tcPr>
-          <w:p>
-            <w:r>
-              <w:rPr>
-                <w:b/>
-                <w:sz w:val="18"/>
-              </w:rPr>
-              <w:t>AGB § 5 Schäden an der Wohnung &amp; Kleinreparaturen</w:t>
-              <w:br/>
-            </w:r>
-            <w:r>
-              <w:rPr>
-                <w:sz w:val="16"/>
-              </w:rPr>
-              <w:t>Schäden unverzüglich melden (4 Wochen Abhilfefrist). Mieter haftet für Sorgfaltspflichtverletzung und Besucher; Beweislast beim Mieter. Keine Schönheitsreparaturen geschuldet. Kleinreparaturen bis 100,00 € je Einzelfall (max. 8% der Jahresmiete bzw. 350,00 € jährlich) trägt der Mieter.</w:t>
-            </w:r>
-          </w:p>
-        </w:tc>
-        <w:tc>
-          <w:tcPr>
-            <w:tcW w:type="dxa" w:w="5184"/>
-          </w:tcPr>
-          <w:p>
-            <w:r>
-              <w:rPr>
-                <w:b/>
-                <w:color w:val="475569"/>
-                <w:sz w:val="18"/>
-              </w:rPr>
-              <w:t>GTC § 5 Damages to Property &amp; Minor Repairs</w:t>
-              <w:br/>
-            </w:r>
-            <w:r>
-              <w:rPr>
-                <w:sz w:val="16"/>
-              </w:rPr>
-              <w:t>Report defects immediately (4 weeks remedy period). Tenant liable for neglect and visitors; burden of proof rests with tenant. No general cosmetic repairs. Minor repairs up to €100.00 per instance (annual cap: 8% of rent or €350.00) borne by tenant.</w:t>
-            </w:r>
-          </w:p>
-        </w:tc>
-      </w:tr>
-      <w:tr>
-        <w:tc>
-          <w:tcPr>
-            <w:tcW w:type="dxa" w:w="5184"/>
-          </w:tcPr>
-          <w:p>
-            <w:r>
-              <w:rPr>
-                <w:b/>
-                <w:sz w:val="18"/>
-              </w:rPr>
-              <w:t>AGB § 6 Kündigungsbedingungen</w:t>
-              <w:br/>
-            </w:r>
-            <w:r>
-              <w:rPr>
-                <w:sz w:val="16"/>
-              </w:rPr>
-              <w:t>Kündigungsfrist 3 Monate zum Monatsende. Vorzeitiges Ausscheiden bei akzeptiertem Nachmieter ab Übergabe. Stillschweigende Verlängerung gem. § 545 BGB ausgeschlossen. Fristlose Kündigung gem. § 543 BGB zulässig bei: Verzug von 2 Monatsmieten, AGB-Verstoß nach Abmahnung, Schäden &gt; 50,00 € unbeglichen, unerlaubter Dritter, Drogen oder Reinigungsverweigerung.</w:t>
-            </w:r>
-          </w:p>
-        </w:tc>
-        <w:tc>
-          <w:tcPr>
-            <w:tcW w:type="dxa" w:w="5184"/>
-          </w:tcPr>
-          <w:p>
-            <w:r>
-              <w:rPr>
-                <w:b/>
-                <w:color w:val="475569"/>
-                <w:sz w:val="18"/>
-              </w:rPr>
-              <w:t>GTC § 6 Conditions of Termination</w:t>
-              <w:br/>
-            </w:r>
-            <w:r>
-              <w:rPr>
-                <w:sz w:val="16"/>
-              </w:rPr>
-              <w:t>Notice period 3 months to month-end. Early release upon accepted replacement tenant. Tacit renewal excluded under § 545 BGB. Termination without notice under § 543 BGB for: 2 months rent arrears, GTC breach after warning, damages &gt; €50.00 unpaid, unauthorized guests, drugs, or persistent cleaning refusal.</w:t>
-            </w:r>
-          </w:p>
-        </w:tc>
-      </w:tr>
-      <w:tr>
-        <w:tc>
-          <w:tcPr>
-            <w:tcW w:type="dxa" w:w="5184"/>
-          </w:tcPr>
-          <w:p>
-            <w:r>
-              <w:rPr>
-                <w:b/>
-                <w:sz w:val="18"/>
-              </w:rPr>
-              <w:t>AGB § 7 Schriftform</w:t>
-              <w:br/>
-            </w:r>
-            <w:r>
-              <w:rPr>
-                <w:sz w:val="16"/>
-              </w:rPr>
-              <w:t>Mündliche Nebenabreden bestehen nicht. Änderungen und Ergänzungen bedürfen der Schriftform; dies gilt auch für die Aufhebung dieses Schriftformerfordernisses.</w:t>
-            </w:r>
-          </w:p>
-        </w:tc>
-        <w:tc>
-          <w:tcPr>
-            <w:tcW w:type="dxa" w:w="5184"/>
-          </w:tcPr>
-          <w:p>
-            <w:r>
-              <w:rPr>
-                <w:b/>
-                <w:color w:val="475569"/>
-                <w:sz w:val="18"/>
-              </w:rPr>
-              <w:t>GTC § 7 Written Form</w:t>
-              <w:br/>
-            </w:r>
-            <w:r>
-              <w:rPr>
-                <w:sz w:val="16"/>
-              </w:rPr>
-              <w:t>No oral side agreements exist. Modifications and amendments must be executed in writing; this also applies to waiving this written-form requirement.</w:t>
-            </w:r>
-          </w:p>
-        </w:tc>
-      </w:tr>
-      <w:tr>
-        <w:tc>
-          <w:tcPr>
-            <w:tcW w:type="dxa" w:w="5184"/>
-          </w:tcPr>
-          <w:p>
-            <w:r>
-              <w:rPr>
-                <w:b/>
-                <w:sz w:val="18"/>
-              </w:rPr>
-              <w:t>AGB § 8 Salvatorische Klausel &amp; Gerichtsstand</w:t>
-              <w:br/>
-            </w:r>
-            <w:r>
-              <w:rPr>
-                <w:sz w:val="16"/>
-              </w:rPr>
-              <w:t>Unwirksamkeit einzelner Bestimmungen berührt die übrigen Klauseln nicht. Es gilt das Recht der Bundesrepublik Deutschland (BGB). Erfüllungsort und ausschließlicher Gerichtsstand ist Berlin. Die deutsche Fassung ist rechtlich allein verbindlich.</w:t>
-            </w:r>
-          </w:p>
-        </w:tc>
-        <w:tc>
-          <w:tcPr>
-            <w:tcW w:type="dxa" w:w="5184"/>
-          </w:tcPr>
-          <w:p>
-            <w:r>
-              <w:rPr>
-                <w:b/>
-                <w:color w:val="475569"/>
-                <w:sz w:val="18"/>
-              </w:rPr>
-              <w:t>GTC § 8 Severability &amp; Jurisdiction</w:t>
-              <w:br/>
-            </w:r>
-            <w:r>
-              <w:rPr>
-                <w:sz w:val="16"/>
-              </w:rPr>
-              <w:t>Invalidity of individual clauses does not affect remaining provisions. German Civil Code (BGB) governs. Place of performance and sole legal jurisdiction is Berlin. Only the German language version is legally binding.</w:t>
-            </w:r>
-          </w:p>
-        </w:tc>
-      </w:tr>
-    </w:tbl>
-    <w:p>
-      <w:pPr>
-        <w:spacing w:after="400"/>
-      </w:pPr>
-    </w:p>
-    <w:tbl>
-      <w:tblPr>
-        <w:tblW w:type="auto" w:w="0"/>
-        <w:jc w:val="center"/>
-        <w:tblLook w:firstColumn="1" w:firstRow="1" w:lastColumn="0" w:lastRow="0" w:noHBand="0" w:noVBand="1" w:val="04A0"/>
-      </w:tblPr>
-      <w:tblGrid>
-        <w:gridCol w:w="5234"/>
-        <w:gridCol w:w="5234"/>
-      </w:tblGrid>
-      <w:tr>
-        <w:tc>
-          <w:tcPr>
-            <w:tcW w:type="dxa" w:w="5184"/>
-          </w:tcPr>
-          <w:p>
-            <w:r>
-              <w:t>Ort, Datum: Berlin, 27.10.2026</w:t>
-              <w:br/>
-              <w:br/>
-              <w:br/>
-              <w:t>_____________________________________</w:t>
-              <w:br/>
-              <w:t>Kylasam Nallagoundanpalayam Arruchamy</w:t>
-              <w:br/>
-              <w:t>Vermieter / Landlord</w:t>
-            </w:r>
-          </w:p>
-        </w:tc>
-        <w:tc>
-          <w:tcPr>
-            <w:tcW w:type="dxa" w:w="5184"/>
-          </w:tcPr>
-          <w:p>
-            <w:r>
-              <w:t>Ort, Datum: 27 Oct, 2026</w:t>
-              <w:br/>
-              <w:br/>
-              <w:br/>
-              <w:t>_____________________________________</w:t>
-              <w:br/>
-              <w:t>Ajithkumar Velasseril Sreenivasan</w:t>
-              <w:br/>
-              <w:t>Mieter / Tenant</w:t>
+              <w:t>Accepted by Tenant</w:t>
             </w:r>
           </w:p>
         </w:tc>
       </w:tr>
     </w:tbl>
     <w:sectPr>
-      <w:pgSz w:w="11909" w:h="16834"/>
-      <w:pgMar w:top="576" w:right="720" w:bottom="576" w:left="720" w:header="720" w:footer="720" w:gutter="0"/>
+      <w:pgSz w:w="12240" w:h="15840"/>
+      <w:pgMar w:top="864" w:right="936" w:bottom="864" w:left="936" w:header="720" w:footer="720" w:gutter="0"/>
       <w:cols w:space="720"/>
       <w:docGrid w:linePitch="360"/>
     </w:sectPr>

</xml_diff>

<commit_message>
feat(contract): integrate Claude AI into n8n onboarding and preserve master template formatting
</commit_message>
<xml_diff>
--- a/template_contract.docx
+++ b/template_contract.docx
@@ -4,59 +4,111 @@
   <w:body>
     <w:p>
       <w:pPr>
+        <w:spacing w:before="0" w:after="200"/>
+        <w:jc w:val="center"/>
+      </w:pPr>
+      <w:r>
+        <w:drawing>
+          <wp:inline xmlns:a="http://schemas.openxmlformats.org/drawingml/2006/main" xmlns:pic="http://schemas.openxmlformats.org/drawingml/2006/picture">
+            <wp:extent cx="1828800" cy="1828800"/>
+            <wp:docPr id="1" name="Picture 1"/>
+            <wp:cNvGraphicFramePr>
+              <a:graphicFrameLocks noChangeAspect="1"/>
+            </wp:cNvGraphicFramePr>
+            <a:graphic>
+              <a:graphicData uri="http://schemas.openxmlformats.org/drawingml/2006/picture">
+                <pic:pic>
+                  <pic:nvPicPr>
+                    <pic:cNvPr id="0" name="Homelyo-logo-new.jpg"/>
+                    <pic:cNvPicPr/>
+                  </pic:nvPicPr>
+                  <pic:blipFill>
+                    <a:blip r:embed="rId9"/>
+                    <a:stretch>
+                      <a:fillRect/>
+                    </a:stretch>
+                  </pic:blipFill>
+                  <pic:spPr>
+                    <a:xfrm>
+                      <a:off x="0" y="0"/>
+                      <a:ext cx="1828800" cy="1828800"/>
+                    </a:xfrm>
+                    <a:prstGeom prst="rect"/>
+                  </pic:spPr>
+                </pic:pic>
+              </a:graphicData>
+            </a:graphic>
+          </wp:inline>
+        </w:drawing>
+      </w:r>
+    </w:p>
+    <w:p>
+      <w:pPr>
+        <w:spacing w:before="300" w:after="80"/>
         <w:jc w:val="center"/>
       </w:pPr>
       <w:r>
         <w:rPr>
+          <w:rFonts w:ascii="Arial" w:hAnsi="Arial"/>
           <w:b/>
-          <w:sz w:val="48"/>
+          <w:color w:val="0F172A"/>
+          <w:sz w:val="44"/>
         </w:rPr>
-        <w:t>Mietvertrag</w:t>
-        <w:br/>
+        <w:t>MIETVERTRAG / RENTAL AGREEMENT</w:t>
       </w:r>
+    </w:p>
+    <w:p>
+      <w:pPr>
+        <w:spacing w:after="600"/>
+        <w:jc w:val="center"/>
+      </w:pPr>
       <w:r>
         <w:rPr>
-          <w:color w:val="505050"/>
-          <w:sz w:val="32"/>
+          <w:rFonts w:ascii="Arial" w:hAnsi="Arial"/>
+          <w:color w:val="475569"/>
+          <w:sz w:val="24"/>
         </w:rPr>
-        <w:t>Rental Agreement</w:t>
+        <w:t>Wohnraummietvertrag für WG-Zimmer • Co-Living Tenancy Agreement</w:t>
       </w:r>
     </w:p>
-    <w:p/>
     <w:tbl>
       <w:tblPr>
         <w:tblW w:type="auto" w:w="0"/>
         <w:jc w:val="center"/>
+        <w:tblLayout w:type="autofit"/>
         <w:tblLook w:firstColumn="1" w:firstRow="1" w:lastColumn="0" w:lastRow="0" w:noHBand="0" w:noVBand="1" w:val="04A0"/>
       </w:tblPr>
       <w:tblGrid>
-        <w:gridCol w:w="5040"/>
-        <w:gridCol w:w="5040"/>
+        <w:gridCol w:w="5112"/>
+        <w:gridCol w:w="5112"/>
       </w:tblGrid>
       <w:tr>
         <w:tc>
           <w:tcPr>
-            <w:tcW w:type="dxa" w:w="5184"/>
+            <w:tcW w:type="dxa" w:w="5112"/>
           </w:tcPr>
           <w:p>
             <w:r>
               <w:rPr>
                 <w:b/>
+                <w:sz w:val="20"/>
               </w:rPr>
-              <w:t>Zwischen Vermieter:</w:t>
+              <w:t>Mieter / Tenant:</w:t>
             </w:r>
           </w:p>
         </w:tc>
         <w:tc>
           <w:tcPr>
-            <w:tcW w:type="dxa" w:w="5184"/>
+            <w:tcW w:type="dxa" w:w="5112"/>
           </w:tcPr>
           <w:p>
             <w:r>
               <w:rPr>
                 <w:b/>
+                <w:color w:val="0284C7"/>
+                <w:sz w:val="20"/>
               </w:rPr>
-              <w:t>The landlord:</w:t>
+              <w:t>{{TENANT_NAME}}</w:t>
             </w:r>
           </w:p>
         </w:tc>
@@ -64,27 +116,28 @@
       <w:tr>
         <w:tc>
           <w:tcPr>
-            <w:tcW w:type="dxa" w:w="5184"/>
+            <w:tcW w:type="dxa" w:w="5112"/>
           </w:tcPr>
           <w:p>
             <w:r>
               <w:rPr>
-                <w:sz w:val="17"/>
+                <w:b/>
+                <w:sz w:val="20"/>
               </w:rPr>
-              <w:t>Vorname, Nachname</w:t>
+              <w:t>Mietobjekt / Room:</w:t>
             </w:r>
           </w:p>
         </w:tc>
         <w:tc>
           <w:tcPr>
-            <w:tcW w:type="dxa" w:w="5184"/>
+            <w:tcW w:type="dxa" w:w="5112"/>
           </w:tcPr>
           <w:p>
             <w:r>
               <w:rPr>
-                <w:sz w:val="17"/>
+                <w:sz w:val="20"/>
               </w:rPr>
-              <w:t>Name, Surname</w:t>
+              <w:t>Zimmer {{TENANT_ROOM_ID}} ({{ROOM_TITLE}})</w:t>
             </w:r>
           </w:p>
         </w:tc>
@@ -92,27 +145,28 @@
       <w:tr>
         <w:tc>
           <w:tcPr>
-            <w:tcW w:type="dxa" w:w="5184"/>
+            <w:tcW w:type="dxa" w:w="5112"/>
           </w:tcPr>
           <w:p>
             <w:r>
               <w:rPr>
                 <w:b/>
+                <w:sz w:val="20"/>
               </w:rPr>
-              <w:t>Kylasam NA</w:t>
+              <w:t>Liegenschaft / Address:</w:t>
             </w:r>
           </w:p>
         </w:tc>
         <w:tc>
           <w:tcPr>
-            <w:tcW w:type="dxa" w:w="5184"/>
+            <w:tcW w:type="dxa" w:w="5112"/>
           </w:tcPr>
           <w:p>
             <w:r>
               <w:rPr>
-                <w:b/>
+                <w:sz w:val="20"/>
               </w:rPr>
-              <w:t>Kylasam NA</w:t>
+              <w:t>Lichtenrader Damm 80, 12305 Berlin</w:t>
             </w:r>
           </w:p>
         </w:tc>
@@ -120,27 +174,28 @@
       <w:tr>
         <w:tc>
           <w:tcPr>
-            <w:tcW w:type="dxa" w:w="5184"/>
+            <w:tcW w:type="dxa" w:w="5112"/>
           </w:tcPr>
           <w:p>
             <w:r>
               <w:rPr>
-                <w:sz w:val="17"/>
+                <w:b/>
+                <w:sz w:val="20"/>
               </w:rPr>
-              <w:t>Anschrift</w:t>
+              <w:t>Mietzeit / Rental Term:</w:t>
             </w:r>
           </w:p>
         </w:tc>
         <w:tc>
           <w:tcPr>
-            <w:tcW w:type="dxa" w:w="5184"/>
+            <w:tcW w:type="dxa" w:w="5112"/>
           </w:tcPr>
           <w:p>
             <w:r>
               <w:rPr>
-                <w:sz w:val="17"/>
+                <w:sz w:val="20"/>
               </w:rPr>
-              <w:t>Address</w:t>
+              <w:t>{{CONTRACT_START_DT}} – {{CONTRACT_END_DT}}</w:t>
             </w:r>
           </w:p>
         </w:tc>
@@ -148,171 +203,28 @@
       <w:tr>
         <w:tc>
           <w:tcPr>
-            <w:tcW w:type="dxa" w:w="5184"/>
+            <w:tcW w:type="dxa" w:w="5112"/>
           </w:tcPr>
           <w:p>
             <w:r>
-              <w:t>Forckenbeckstraße 64,</w:t>
-              <w:br/>
-              <w:t>14199 Berlin, Deutschland</w:t>
+              <w:rPr>
+                <w:b/>
+                <w:sz w:val="20"/>
+              </w:rPr>
+              <w:t>Datum / Creation Date:</w:t>
             </w:r>
           </w:p>
         </w:tc>
         <w:tc>
           <w:tcPr>
-            <w:tcW w:type="dxa" w:w="5184"/>
-          </w:tcPr>
-          <w:p>
-            <w:r>
-              <w:t>Forckenbeckstraße 64,</w:t>
-              <w:br/>
-              <w:t>14199 Berlin, Germany</w:t>
-            </w:r>
-          </w:p>
-        </w:tc>
-      </w:tr>
-    </w:tbl>
-    <w:p/>
-    <w:tbl>
-      <w:tblPr>
-        <w:tblW w:type="auto" w:w="0"/>
-        <w:jc w:val="center"/>
-        <w:tblLook w:firstColumn="1" w:firstRow="1" w:lastColumn="0" w:lastRow="0" w:noHBand="0" w:noVBand="1" w:val="04A0"/>
-      </w:tblPr>
-      <w:tblGrid>
-        <w:gridCol w:w="5040"/>
-        <w:gridCol w:w="5040"/>
-      </w:tblGrid>
-      <w:tr>
-        <w:tc>
-          <w:tcPr>
-            <w:tcW w:type="dxa" w:w="5184"/>
+            <w:tcW w:type="dxa" w:w="5112"/>
           </w:tcPr>
           <w:p>
             <w:r>
               <w:rPr>
-                <w:b/>
+                <w:sz w:val="20"/>
               </w:rPr>
-              <w:t>Zwischen Mieter:</w:t>
-            </w:r>
-          </w:p>
-        </w:tc>
-        <w:tc>
-          <w:tcPr>
-            <w:tcW w:type="dxa" w:w="5184"/>
-          </w:tcPr>
-          <w:p>
-            <w:r>
-              <w:rPr>
-                <w:b/>
-              </w:rPr>
-              <w:t>The tenant:</w:t>
-            </w:r>
-          </w:p>
-        </w:tc>
-      </w:tr>
-      <w:tr>
-        <w:tc>
-          <w:tcPr>
-            <w:tcW w:type="dxa" w:w="5184"/>
-          </w:tcPr>
-          <w:p>
-            <w:r>
-              <w:rPr>
-                <w:sz w:val="17"/>
-              </w:rPr>
-              <w:t>Vorname, Nachname</w:t>
-            </w:r>
-          </w:p>
-        </w:tc>
-        <w:tc>
-          <w:tcPr>
-            <w:tcW w:type="dxa" w:w="5184"/>
-          </w:tcPr>
-          <w:p>
-            <w:r>
-              <w:rPr>
-                <w:sz w:val="17"/>
-              </w:rPr>
-              <w:t>Name, Surname</w:t>
-            </w:r>
-          </w:p>
-        </w:tc>
-      </w:tr>
-      <w:tr>
-        <w:tc>
-          <w:tcPr>
-            <w:tcW w:type="dxa" w:w="5184"/>
-          </w:tcPr>
-          <w:p>
-            <w:r>
-              <w:rPr>
-                <w:b/>
-              </w:rPr>
-              <w:t>Bhargavi Mangesh Ayare</w:t>
-            </w:r>
-          </w:p>
-        </w:tc>
-        <w:tc>
-          <w:tcPr>
-            <w:tcW w:type="dxa" w:w="5184"/>
-          </w:tcPr>
-          <w:p>
-            <w:r>
-              <w:rPr>
-                <w:b/>
-              </w:rPr>
-              <w:t>Bhargavi Mangesh Ayare</w:t>
-            </w:r>
-          </w:p>
-        </w:tc>
-      </w:tr>
-      <w:tr>
-        <w:tc>
-          <w:tcPr>
-            <w:tcW w:type="dxa" w:w="5184"/>
-          </w:tcPr>
-          <w:p>
-            <w:r>
-              <w:rPr>
-                <w:sz w:val="17"/>
-              </w:rPr>
-              <w:t>Anschrift</w:t>
-            </w:r>
-          </w:p>
-        </w:tc>
-        <w:tc>
-          <w:tcPr>
-            <w:tcW w:type="dxa" w:w="5184"/>
-          </w:tcPr>
-          <w:p>
-            <w:r>
-              <w:rPr>
-                <w:sz w:val="17"/>
-              </w:rPr>
-              <w:t>Address</w:t>
-            </w:r>
-          </w:p>
-        </w:tc>
-      </w:tr>
-      <w:tr>
-        <w:tc>
-          <w:tcPr>
-            <w:tcW w:type="dxa" w:w="5184"/>
-          </w:tcPr>
-          <w:p>
-            <w:r>
-              <w:t>Type 4 building no 3 flat no 4 esis hospital quarters , Vashi sector-5 sagar vihar road, 400703 Navi Mumbai, Indien</w:t>
-            </w:r>
-          </w:p>
-        </w:tc>
-        <w:tc>
-          <w:tcPr>
-            <w:tcW w:type="dxa" w:w="5184"/>
-          </w:tcPr>
-          <w:p>
-            <w:r>
-              <w:t>Type 4 building no 3 flat no 4 esis hospital quarters , Vashi sector-5 sagar vihar road, 400703 Navi Mumbai, India</w:t>
+              <w:t>{{CONTRACT_CREATION_DATE}}</w:t>
             </w:r>
           </w:p>
         </w:tc>
@@ -323,6 +235,56 @@
         <w:br w:type="page"/>
       </w:r>
     </w:p>
+    <w:p>
+      <w:pPr>
+        <w:spacing w:before="0" w:after="200"/>
+        <w:jc w:val="center"/>
+      </w:pPr>
+      <w:r>
+        <w:drawing>
+          <wp:inline xmlns:a="http://schemas.openxmlformats.org/drawingml/2006/main" xmlns:pic="http://schemas.openxmlformats.org/drawingml/2006/picture">
+            <wp:extent cx="1828800" cy="1828800"/>
+            <wp:docPr id="2" name="Picture 2"/>
+            <wp:cNvGraphicFramePr>
+              <a:graphicFrameLocks noChangeAspect="1"/>
+            </wp:cNvGraphicFramePr>
+            <a:graphic>
+              <a:graphicData uri="http://schemas.openxmlformats.org/drawingml/2006/picture">
+                <pic:pic>
+                  <pic:nvPicPr>
+                    <pic:cNvPr id="0" name="Homelyo-logo-new.jpg"/>
+                    <pic:cNvPicPr/>
+                  </pic:nvPicPr>
+                  <pic:blipFill>
+                    <a:blip r:embed="rId9"/>
+                    <a:stretch>
+                      <a:fillRect/>
+                    </a:stretch>
+                  </pic:blipFill>
+                  <pic:spPr>
+                    <a:xfrm>
+                      <a:off x="0" y="0"/>
+                      <a:ext cx="1828800" cy="1828800"/>
+                    </a:xfrm>
+                    <a:prstGeom prst="rect"/>
+                  </pic:spPr>
+                </pic:pic>
+              </a:graphicData>
+            </a:graphic>
+          </wp:inline>
+        </w:drawing>
+      </w:r>
+    </w:p>
+    <w:p>
+      <w:r>
+        <w:rPr>
+          <w:b/>
+          <w:color w:val="0284C7"/>
+          <w:sz w:val="26"/>
+        </w:rPr>
+        <w:t>1. Übersicht &amp; Begrüßung / Overview &amp; Welcome</w:t>
+      </w:r>
+    </w:p>
     <w:tbl>
       <w:tblPr>
         <w:tblW w:type="auto" w:w="0"/>
@@ -330,215 +292,170 @@
         <w:tblLook w:firstColumn="1" w:firstRow="1" w:lastColumn="0" w:lastRow="0" w:noHBand="0" w:noVBand="1" w:val="04A0"/>
       </w:tblPr>
       <w:tblGrid>
-        <w:gridCol w:w="5184"/>
-        <w:gridCol w:w="5184"/>
+        <w:gridCol w:w="5112"/>
+        <w:gridCol w:w="5112"/>
       </w:tblGrid>
       <w:tr>
         <w:tc>
           <w:tcPr>
-            <w:tcW w:type="dxa" w:w="5040"/>
+            <w:tcW w:type="dxa" w:w="5112"/>
+            <w:shd w:fill="FAFBFD"/>
           </w:tcPr>
           <w:p>
+            <w:pPr>
+              <w:spacing w:before="40" w:after="40"/>
+            </w:pPr>
             <w:r>
               <w:rPr>
-                <w:b/>
-                <w:sz w:val="20"/>
+                <w:rFonts w:ascii="Arial" w:hAnsi="Arial"/>
+                <w:b w:val="0"/>
+                <w:sz w:val="19"/>
               </w:rPr>
-              <w:t>Präambel</w:t>
+              <w:t>Lieber Mieter, {{TENANT_NAME}},</w:t>
+              <w:br/>
+              <w:br/>
+              <w:t>im Folgenden erhältst Du alle wichtigen Informationen rund um Deinen Mietvertrag sowie Deine ersten Schritte zur erfolgreichen Anmietung eines Zimmers bei der Liegenschaft Lichtenrader Damm 80, 12305 Berlin.</w:t>
+              <w:br/>
+              <w:br/>
+              <w:t>Bestandteile dieses Dokuments:</w:t>
+              <w:br/>
+              <w:t>• Mietvertrag (Hauptvereinbarung)</w:t>
+              <w:br/>
+              <w:t>• Zahlungsmöglichkeiten (N26 Bank)</w:t>
+              <w:br/>
+              <w:t>• Anlage 1 – Inventar der Mietsache</w:t>
+              <w:br/>
+              <w:t>• Anlage 2 – Allgemeine Geschäftsbedingungen (AGB)</w:t>
             </w:r>
           </w:p>
         </w:tc>
         <w:tc>
           <w:tcPr>
-            <w:tcW w:type="dxa" w:w="5040"/>
+            <w:tcW w:type="dxa" w:w="5112"/>
           </w:tcPr>
           <w:p>
+            <w:pPr>
+              <w:spacing w:before="40" w:after="40"/>
+            </w:pPr>
             <w:r>
               <w:rPr>
-                <w:b/>
-                <w:sz w:val="20"/>
+                <w:rFonts w:ascii="Arial" w:hAnsi="Arial"/>
+                <w:b w:val="0"/>
+                <w:sz w:val="19"/>
               </w:rPr>
-              <w:t>Preamble</w:t>
+              <w:t>Dear tenant, {{TENANT_NAME}},</w:t>
+              <w:br/>
+              <w:br/>
+              <w:t>below you will find all important information regarding your lease and your first steps to successfully renting a room at Lichtenrader Damm 80, 12305 Berlin.</w:t>
+              <w:br/>
+              <w:br/>
+              <w:t>Structure of this document:</w:t>
+              <w:br/>
+              <w:t>• Rental Agreement (Core Terms)</w:t>
+              <w:br/>
+              <w:t>• Payment Options (N26 Bank)</w:t>
+              <w:br/>
+              <w:t>• Attachment 1 – Inventory</w:t>
+              <w:br/>
+              <w:t>• Attachment 2 – General Terms and Conditions (AGB)</w:t>
             </w:r>
           </w:p>
         </w:tc>
       </w:tr>
+    </w:tbl>
+    <w:p>
+      <w:pPr>
+        <w:spacing w:after="200"/>
+      </w:pPr>
+    </w:p>
+    <w:p>
+      <w:r>
+        <w:rPr>
+          <w:b/>
+          <w:color w:val="0F172A"/>
+          <w:sz w:val="24"/>
+        </w:rPr>
+        <w:t>2. Mietparteien / Contracting Parties</w:t>
+      </w:r>
+    </w:p>
+    <w:tbl>
+      <w:tblPr>
+        <w:tblW w:type="auto" w:w="0"/>
+        <w:tblLook w:firstColumn="1" w:firstRow="1" w:lastColumn="0" w:lastRow="0" w:noHBand="0" w:noVBand="1" w:val="04A0"/>
+      </w:tblPr>
+      <w:tblGrid>
+        <w:gridCol w:w="5112"/>
+        <w:gridCol w:w="5112"/>
+      </w:tblGrid>
       <w:tr>
         <w:tc>
           <w:tcPr>
-            <w:tcW w:type="dxa" w:w="5040"/>
+            <w:tcW w:type="dxa" w:w="5112"/>
+            <w:shd w:fill="FAFBFD"/>
           </w:tcPr>
           <w:p>
+            <w:pPr>
+              <w:spacing w:before="40" w:after="40"/>
+            </w:pPr>
             <w:r>
               <w:rPr>
-                <w:sz w:val="17"/>
+                <w:rFonts w:ascii="Arial" w:hAnsi="Arial"/>
+                <w:b w:val="0"/>
+                <w:sz w:val="19"/>
               </w:rPr>
-              <w:t>Der Vermieter ist nicht zwingend Eigentümer des Mietobjektes, sondern hat den Mietgegenstand gegebenenfalls vom Eigentümer oder sonstigen Berechtigten zum Zwecke der Weitervermietung angemietet. Der Vermieter vermietet möblierten Wohnraum ausschließlich für begrenzte Zeit zum vorübergehenden Gebrauch.</w:t>
+              <w:t>Vermieter:</w:t>
+              <w:br/>
+              <w:t>Kylasam Nallagoundanpalayam Arruchamy</w:t>
+              <w:br/>
+              <w:t>Forckenbeckstrasse 64, 14199 Berlin</w:t>
+              <w:br/>
+              <w:t>Email: support@homelyo.eu | Tel: +49 176 8332 9439</w:t>
+              <w:br/>
+              <w:t>(nachfolgend „Vermieter“ genannt)</w:t>
+              <w:br/>
+              <w:br/>
+              <w:t>Mieter:</w:t>
+              <w:br/>
+              <w:t>{{TENANT_NAME}}</w:t>
+              <w:br/>
+              <w:t>Email: {{TENANT_EMAIL}} | Tel: {{TENANT_PHONE}}</w:t>
+              <w:br/>
+              <w:t>(nachfolgend „Mieter“ genannt)</w:t>
             </w:r>
           </w:p>
         </w:tc>
         <w:tc>
           <w:tcPr>
-            <w:tcW w:type="dxa" w:w="5040"/>
+            <w:tcW w:type="dxa" w:w="5112"/>
           </w:tcPr>
           <w:p>
+            <w:pPr>
+              <w:spacing w:before="40" w:after="40"/>
+            </w:pPr>
             <w:r>
               <w:rPr>
-                <w:sz w:val="17"/>
+                <w:rFonts w:ascii="Arial" w:hAnsi="Arial"/>
+                <w:b w:val="0"/>
+                <w:sz w:val="19"/>
               </w:rPr>
-              <w:t>The landlord is not necessarily the owner of the rental property but has rented the property from the owner or another authorised party for the purpose of subletting it. The landlord rents a furnished living space exclusively for a limited period of time for temporary use.</w:t>
-            </w:r>
-          </w:p>
-        </w:tc>
-      </w:tr>
-      <w:tr>
-        <w:tc>
-          <w:tcPr>
-            <w:tcW w:type="dxa" w:w="5040"/>
-          </w:tcPr>
-          <w:p>
-            <w:r>
-              <w:rPr>
-                <w:b/>
-                <w:sz w:val="20"/>
-              </w:rPr>
-              <w:t>1. Mietsache</w:t>
-            </w:r>
-          </w:p>
-        </w:tc>
-        <w:tc>
-          <w:tcPr>
-            <w:tcW w:type="dxa" w:w="5040"/>
-          </w:tcPr>
-          <w:p>
-            <w:r>
-              <w:rPr>
-                <w:b/>
-                <w:sz w:val="20"/>
-              </w:rPr>
-              <w:t>1. Rental property</w:t>
-            </w:r>
-          </w:p>
-        </w:tc>
-      </w:tr>
-      <w:tr>
-        <w:tc>
-          <w:tcPr>
-            <w:tcW w:type="dxa" w:w="5040"/>
-          </w:tcPr>
-          <w:p>
-            <w:r>
-              <w:rPr>
-                <w:sz w:val="17"/>
-              </w:rPr>
-              <w:t>(1) Der Vermieter vermietet dem Mieter zur Nutzung durch folgende Person(en)</w:t>
+              <w:t>Landlord:</w:t>
               <w:br/>
-              <w:t>1. Bhargavi Mangesh Ayare</w:t>
+              <w:t>Kylasam Nallagoundanpalayam Arruchamy</w:t>
               <w:br/>
-              <w:t>zum vorübergehenden Gebrauch folgende Wohnung im Hause Lichtenrader Damm 80, 12305 Berlin, Deutschland , im 2 Geschoss bestehend aus 1 Zimmer(n).</w:t>
+              <w:t>Forckenbeckstrasse 64, 14199 Berlin</w:t>
               <w:br/>
-              <w:t>Die Wohnfläche beträgt ca. 23.92 m². Diese Angabe dient wegen möglicher Messfehler nicht zur Festlegung des Mietgegenstandes. Der räumliche Umfang der gemieteten Sache ergibt sich vielmehr aus der Anzahl der vermieteten Räume.</w:t>
+              <w:t>Email: support@homelyo.eu | Phone: +49 176 8332 9439</w:t>
               <w:br/>
-              <w:t>(2) Das Mietobjekt ist voll möbliert und komplett eingerichtet.</w:t>
+              <w:t>(subsequently referred to as 'landlord')</w:t>
               <w:br/>
-              <w:t>(3) Bei Wohnungsübergabe werden dem Mieter folgende Schlüssel ausgehändigt:</w:t>
               <w:br/>
-              <w:t>Wie bei Übergabe vereinbart</w:t>
-            </w:r>
-          </w:p>
-        </w:tc>
-        <w:tc>
-          <w:tcPr>
-            <w:tcW w:type="dxa" w:w="5040"/>
-          </w:tcPr>
-          <w:p>
-            <w:r>
-              <w:rPr>
-                <w:sz w:val="17"/>
-              </w:rPr>
-              <w:t>(1) The landlord rents to the tenant for temporary use on behalf of the following person(s)</w:t>
+              <w:t>Tenant:</w:t>
               <w:br/>
-              <w:t>1. Bhargavi Mangesh Ayare</w:t>
+              <w:t>{{TENANT_NAME}}</w:t>
               <w:br/>
-              <w:t>the following apartment is located in Lichtenrader Damm 80, 12305 Berlin, Germany , on 2 floor consisting of 1 rooms.</w:t>
+              <w:t>Email: {{TENANT_EMAIL}} | Phone: {{TENANT_PHONE}}</w:t>
               <w:br/>
-              <w:t>The residential space consists of approximately 23.92 m². Due to possible measurement errors, this information is not conducive to define the rental property. Instead, the size of the rental property is determined by the number of rented rooms.</w:t>
-              <w:br/>
-              <w:t>(2) The rental property is entirely furnished and completely equipped.</w:t>
-              <w:br/>
-              <w:t>(3) When the apartment is handed over, the following keys are provided to the tenant:</w:t>
-              <w:br/>
-              <w:t>As agreed during key handover</w:t>
-            </w:r>
-          </w:p>
-        </w:tc>
-      </w:tr>
-      <w:tr>
-        <w:tc>
-          <w:tcPr>
-            <w:tcW w:type="dxa" w:w="5040"/>
-          </w:tcPr>
-          <w:p>
-            <w:r>
-              <w:rPr>
-                <w:b/>
-                <w:sz w:val="20"/>
-              </w:rPr>
-              <w:t>2. Mietdauer</w:t>
-            </w:r>
-          </w:p>
-        </w:tc>
-        <w:tc>
-          <w:tcPr>
-            <w:tcW w:type="dxa" w:w="5040"/>
-          </w:tcPr>
-          <w:p>
-            <w:r>
-              <w:rPr>
-                <w:b/>
-                <w:sz w:val="20"/>
-              </w:rPr>
-              <w:t>2. Rental duration</w:t>
-            </w:r>
-          </w:p>
-        </w:tc>
-      </w:tr>
-      <w:tr>
-        <w:tc>
-          <w:tcPr>
-            <w:tcW w:type="dxa" w:w="5040"/>
-          </w:tcPr>
-          <w:p>
-            <w:r>
-              <w:rPr>
-                <w:sz w:val="17"/>
-              </w:rPr>
-              <w:t>(1) Der Mietvertrag beginnt am 25 Mär, 2025 und endet am 30 Sep, 2025.</w:t>
-              <w:br/>
-              <w:t>(2) Die Wohnung ist gemäß § 549 Abs. 2 Nr. 1 BGB lediglich zum vorübergehenden Gebrauch vermietet. Der Vermieter vermietet das Mietobjekt ausschließlich im Rahmen des vorübergehenden Gebrauchs. Auf Seiten des Mieters besteht ein vorübergehender Sonderbedarf, welcher durch die Anmietung der voll möblierten Mietsache im Rahmen des § 549 Abs. 2 Nr. 1 BGB gedeckt werden soll. Der Mieter bestätigt einen vorübergehenden Sonderbedarf Aufgrund eines Studiensemesters außerhalb seines eigentlichen Studienortes.</w:t>
-              <w:br/>
-              <w:t>Sofern der vorübergehende Wohnbedarf aufgrund geänderter Umstände über den vereinbarten Zeitraum hinaus fortbesteht, kommt eine Verlängerung des Mietverhältnisses in Betracht. Hierfür hat der Mieter dem Vermieter den Grund zum vorübergehenden Gebrauch spätestens einen vollen Monat vor Mietende mitzuteilen. Der Vermieter ist nicht verpflichtet, den neuen oder aktualisierten Grund für den Aufenthalt zu akzeptieren und das Mietverhältnis fortzusetzen.</w:t>
-              <w:br/>
-              <w:t>(3) Setzt der Mieter nach Ablauf der Mietzeit den Gebrauch der Mietsache fort, so verlängert sich das</w:t>
-            </w:r>
-          </w:p>
-        </w:tc>
-        <w:tc>
-          <w:tcPr>
-            <w:tcW w:type="dxa" w:w="5040"/>
-          </w:tcPr>
-          <w:p>
-            <w:r>
-              <w:rPr>
-                <w:sz w:val="17"/>
-              </w:rPr>
-              <w:t>(1) The rental contract starts on 25 Mar, 2025 and ends on 30 Sep, 2025.</w:t>
-              <w:br/>
-              <w:t>(2) The apartment is rented for temporary use only, in accordance with section 549, paragraph 2(1) of the German Civil Code (Bürgerliches Gesetzbuch, BGB), the landlord rents the rental property exclusively for temporary use. The tenant has a special need for temporary accommodation, to be covered by renting the fully furnished rental property pursuant to section 549, paragraph 2(1) of the BGB. The tenant confirms a temporary special need Due to a semester of study outside of his/her normal place of study.</w:t>
-              <w:br/>
-              <w:t>If the temporary housing need continues beyond the agreed period due to changed circumstances, an extension of the rental period is possible. For this purpose, the tenant must inform the landlord of the reason for temporary use no later than one full month before the end of the rental period. The landlord is not obliged to accept the new or updated reason for residency and to resume the rental agreement.</w:t>
-              <w:br/>
-              <w:t>(3) If the tenant continues to use the rental property after the termination of the rental period, the rental relationship shall not be extended indefinitely. Section 545 of the BGB is excluded.</w:t>
+              <w:t>(subsequently referred to as 'tenant')</w:t>
             </w:r>
           </w:p>
         </w:tc>
@@ -549,39 +466,110 @@
         <w:br w:type="page"/>
       </w:r>
     </w:p>
+    <w:p>
+      <w:pPr>
+        <w:spacing w:before="0" w:after="200"/>
+        <w:jc w:val="center"/>
+      </w:pPr>
+      <w:r>
+        <w:drawing>
+          <wp:inline xmlns:a="http://schemas.openxmlformats.org/drawingml/2006/main" xmlns:pic="http://schemas.openxmlformats.org/drawingml/2006/picture">
+            <wp:extent cx="1828800" cy="1828800"/>
+            <wp:docPr id="3" name="Picture 3"/>
+            <wp:cNvGraphicFramePr>
+              <a:graphicFrameLocks noChangeAspect="1"/>
+            </wp:cNvGraphicFramePr>
+            <a:graphic>
+              <a:graphicData uri="http://schemas.openxmlformats.org/drawingml/2006/picture">
+                <pic:pic>
+                  <pic:nvPicPr>
+                    <pic:cNvPr id="0" name="Homelyo-logo-new.jpg"/>
+                    <pic:cNvPicPr/>
+                  </pic:nvPicPr>
+                  <pic:blipFill>
+                    <a:blip r:embed="rId9"/>
+                    <a:stretch>
+                      <a:fillRect/>
+                    </a:stretch>
+                  </pic:blipFill>
+                  <pic:spPr>
+                    <a:xfrm>
+                      <a:off x="0" y="0"/>
+                      <a:ext cx="1828800" cy="1828800"/>
+                    </a:xfrm>
+                    <a:prstGeom prst="rect"/>
+                  </pic:spPr>
+                </pic:pic>
+              </a:graphicData>
+            </a:graphic>
+          </wp:inline>
+        </w:drawing>
+      </w:r>
+    </w:p>
+    <w:p>
+      <w:r>
+        <w:rPr>
+          <w:b/>
+          <w:color w:val="0284C7"/>
+          <w:sz w:val="26"/>
+        </w:rPr>
+        <w:t>Mietgegenstand, Mietdauer &amp; Konditionen / Property &amp; Terms</w:t>
+      </w:r>
+    </w:p>
     <w:tbl>
       <w:tblPr>
         <w:tblW w:type="auto" w:w="0"/>
-        <w:jc w:val="center"/>
         <w:tblLook w:firstColumn="1" w:firstRow="1" w:lastColumn="0" w:lastRow="0" w:noHBand="0" w:noVBand="1" w:val="04A0"/>
       </w:tblPr>
       <w:tblGrid>
-        <w:gridCol w:w="5184"/>
-        <w:gridCol w:w="5184"/>
+        <w:gridCol w:w="5112"/>
+        <w:gridCol w:w="5112"/>
       </w:tblGrid>
       <w:tr>
         <w:tc>
           <w:tcPr>
-            <w:tcW w:type="dxa" w:w="5040"/>
+            <w:tcW w:type="dxa" w:w="5112"/>
+            <w:shd w:fill="FAFBFD"/>
           </w:tcPr>
           <w:p>
+            <w:pPr>
+              <w:spacing w:before="40" w:after="40"/>
+            </w:pPr>
             <w:r>
               <w:rPr>
-                <w:sz w:val="17"/>
+                <w:rFonts w:ascii="Arial" w:hAnsi="Arial"/>
+                <w:b w:val="0"/>
+                <w:sz w:val="19"/>
               </w:rPr>
-              <w:t>Mietverhältnis nicht auf unbestimmte Zeit. § 545 BGB wird ausgeschlossen.</w:t>
+              <w:t>Mietgegenstand:</w:t>
+              <w:br/>
+              <w:t>Vermietet wird das Zimmer {{TENANT_ROOM_ID}} ({{ROOM_TITLE}}) mit ca. {{ROOM_SIZE}} m² in der Wohnung Lichtenrader Damm 80, 12305 Berlin (2. OG / 1. OG rechts, WE-11, Zimmernr. {{ROOM_NUMBER}}).</w:t>
+              <w:br/>
+              <w:br/>
+              <w:t>Flur, Küche, Bad, Balkon/Terrasse und Gepäckraum dürfen mitbenutzt werden.</w:t>
             </w:r>
           </w:p>
         </w:tc>
         <w:tc>
           <w:tcPr>
-            <w:tcW w:type="dxa" w:w="5040"/>
+            <w:tcW w:type="dxa" w:w="5112"/>
           </w:tcPr>
           <w:p>
+            <w:pPr>
+              <w:spacing w:before="40" w:after="40"/>
+            </w:pPr>
             <w:r>
               <w:rPr>
-                <w:sz w:val="17"/>
+                <w:rFonts w:ascii="Arial" w:hAnsi="Arial"/>
+                <w:b w:val="0"/>
+                <w:sz w:val="19"/>
               </w:rPr>
+              <w:t>Rental Premises:</w:t>
+              <w:br/>
+              <w:t>Rented is private room {{TENANT_ROOM_ID}} ({{ROOM_TITLE}}) with approx. {{ROOM_SIZE}} m² in apartment Lichtenrader Damm 80, 12305 Berlin (2nd floor / 1st upper right, WE-11, Room No. {{ROOM_NUMBER}}).</w:t>
+              <w:br/>
+              <w:br/>
+              <w:t>Hallway, kitchen, bathroom, balcony, and luggage room are shared.</w:t>
             </w:r>
           </w:p>
         </w:tc>
@@ -589,29 +577,46 @@
       <w:tr>
         <w:tc>
           <w:tcPr>
-            <w:tcW w:type="dxa" w:w="5040"/>
+            <w:tcW w:type="dxa" w:w="5112"/>
+            <w:shd w:fill="FAFBFD"/>
           </w:tcPr>
           <w:p>
+            <w:pPr>
+              <w:spacing w:before="40" w:after="40"/>
+            </w:pPr>
             <w:r>
               <w:rPr>
-                <w:b/>
-                <w:sz w:val="20"/>
+                <w:rFonts w:ascii="Arial" w:hAnsi="Arial"/>
+                <w:b w:val="0"/>
+                <w:sz w:val="19"/>
               </w:rPr>
-              <w:t>3. Miete</w:t>
+              <w:t>§ 1 – Mietdauer &amp; Zweck:</w:t>
+              <w:br/>
+              <w:t>1. Das Mietverhältnis beginnt am {{CONTRACT_START_DT}} und endet am {{CONTRACT_END_DT}}.</w:t>
+              <w:br/>
+              <w:t>2. Vermietung zum vorübergehenden Gebrauch gem. § 549 Abs. 2 Nr. 1 BGB für Studium, Praktikum oder Beruf.</w:t>
             </w:r>
           </w:p>
         </w:tc>
         <w:tc>
           <w:tcPr>
-            <w:tcW w:type="dxa" w:w="5040"/>
+            <w:tcW w:type="dxa" w:w="5112"/>
           </w:tcPr>
           <w:p>
+            <w:pPr>
+              <w:spacing w:before="40" w:after="40"/>
+            </w:pPr>
             <w:r>
               <w:rPr>
-                <w:b/>
-                <w:sz w:val="20"/>
+                <w:rFonts w:ascii="Arial" w:hAnsi="Arial"/>
+                <w:b w:val="0"/>
+                <w:sz w:val="19"/>
               </w:rPr>
-              <w:t>3. Rent</w:t>
+              <w:t>§ 1 – Lease Term &amp; Purpose:</w:t>
+              <w:br/>
+              <w:t>1. The tenancy begins on {{CONTRACT_START_DT}} and ends on {{CONTRACT_END_DT}}.</w:t>
+              <w:br/>
+              <w:t>2. Temporary lease pursuant to Section 549 (2) No. 1 BGB for academic, professional, or training stay.</w:t>
             </w:r>
           </w:p>
         </w:tc>
@@ -619,59 +624,42 @@
       <w:tr>
         <w:tc>
           <w:tcPr>
-            <w:tcW w:type="dxa" w:w="5040"/>
+            <w:tcW w:type="dxa" w:w="5112"/>
+            <w:shd w:fill="FAFBFD"/>
           </w:tcPr>
           <w:p>
+            <w:pPr>
+              <w:spacing w:before="40" w:after="40"/>
+            </w:pPr>
             <w:r>
               <w:rPr>
-                <w:sz w:val="17"/>
+                <w:rFonts w:ascii="Arial" w:hAnsi="Arial"/>
+                <w:b w:val="0"/>
+                <w:sz w:val="19"/>
               </w:rPr>
-              <w:t>(1) Die Miete beträgt monatlich 639€, in Worten: sechshundertneununddreißig EURO.</w:t>
+              <w:t>§ 2 – Miethöhe &amp; Pauschale:</w:t>
               <w:br/>
-              <w:t>Hierin enthalten ist</w:t>
-              <w:br/>
-              <w:t>• eine Nettokaltmiete inklusive Möblierungszuschlag</w:t>
-              <w:br/>
-              <w:t>• Nebenkosten inkl. Betriebs-, Heiz-, Warmwasser-, Strom- und Internetkosten</w:t>
-              <w:br/>
-              <w:t>(2) Der Mieter hat für eine sachgemäße, nicht übertriebene Nutzung (Fair Usage) der Nebenkosten zu sorgen. Hier ist besonders auf den sachgemäßen Verbrauch von Strom, Wasser und Heizung zu achten.</w:t>
-              <w:br/>
-              <w:t>Die Gesamtmiete beinhaltet eine Internet-Flatrate. Weitere Kosten, die durch die Nutzung der Internetverbindung entstehen (z.B. kostenpflichtige oder illegale Downloads etc.), sind vom Mieter der Wohnung selbst zu tragen und werden mit dem Vermieter abgerechnet. Beim Einzug stellt der Vermieter dem Mieter den Router und die Zugangsdaten für die WLAN-Verbindung zur Verfügung. Beide Parteien sind sich einig, dass der Mieter allein für die Nutzung der Internetverbindungen und die illegale Internetnutzung verantwortlich ist. Bei illegaler Nutzung kann der Vermieter die Internetverbindung ohne Vorankündigung sperren. In diesem Fall hat der Mieter keinen Anspruch auf Mietminderung.</w:t>
-              <w:br/>
-              <w:t>Weitere, unmittelbar mit der Wohnung zusammenhängende Verbrauchskosten, z. B. Telefonkosten, trägt der Mieter selbst.</w:t>
-              <w:br/>
-              <w:t>(3) Bei einem Mietverhältnis mit einer Dauer von unter 6 Monaten findet der aktuell gesetzlich gültige Umsatzsteuersatz Anwendung.</w:t>
-              <w:br/>
-              <w:t>(4) Der Mieter hat zusätzlich zur laufenden Miete eine Endreinigungspauschale in Höhe von 50€ zu leisten, welche bei Rückgabe der Wohnung bar zu übergeben oder zu überweisen ist oder nach Absprache mit dem Vermieter von der Kaution abgezogen wird.</w:t>
+              <w:t>Die monatliche Pauschalmiete beträgt {{RENT_PER_MONTH}} EUR. Sämtliche Nebenkosten (Heizung, Warm-/Kaltwasser, Ökostrom, Hausgeld, GEZ-Rundfunkbeitrag, 1000 Mbit/s Highspeed WLAN) sind inklusive.</w:t>
             </w:r>
           </w:p>
         </w:tc>
         <w:tc>
           <w:tcPr>
-            <w:tcW w:type="dxa" w:w="5040"/>
+            <w:tcW w:type="dxa" w:w="5112"/>
           </w:tcPr>
           <w:p>
+            <w:pPr>
+              <w:spacing w:before="40" w:after="40"/>
+            </w:pPr>
             <w:r>
               <w:rPr>
-                <w:sz w:val="17"/>
+                <w:rFonts w:ascii="Arial" w:hAnsi="Arial"/>
+                <w:b w:val="0"/>
+                <w:sz w:val="19"/>
               </w:rPr>
-              <w:t>(1) The rent amounts to €639 per month, in words: six hundred and thirty-nine EURO.</w:t>
+              <w:t>§ 2 – Rent &amp; Utilities:</w:t>
               <w:br/>
-              <w:t>This includes</w:t>
-              <w:br/>
-              <w:t>• basic rent (ger:, Nettokaltmiete) which includes a furniture surcharge</w:t>
-              <w:br/>
-              <w:t>• Additional expenses lump sum incl. operating, utility, heating, electricity and internet cost</w:t>
-              <w:br/>
-              <w:t>(2) The tenant must ensure proper, non-exaggerated use (fair usage) of the utility costs in particular a proper consumption of electricity, water and heating is important.</w:t>
-              <w:br/>
-              <w:t>The total rent includes an Internet flat rate. Further costs arising from the use of the Internet connection (e.g. fee-based or illegal downloads, etc.) are to be borne by the tenant of the apartment and will be settled with the landlord. When moving in, the landlord provides the tenant with the router and the login details to connect to the WLAN. Both parties agree that the tenant is solely responsible for the Internet connection and liable for the illegal use of the Internet. In the event of illegal use, the landlord can block the Internet connection without prior notice. In this case, the tenant cannot claim a reduction in rent.</w:t>
-              <w:br/>
-              <w:t>Additional consumption costs directly related to the apartment (e.g. telephone costs) shall be borne by the tenant.</w:t>
-              <w:br/>
-              <w:t>(3) In the case of a rental agreement with a duration of less than 6 months, the currently valid statutory VAT rate shall apply.</w:t>
-              <w:br/>
-              <w:t>(4) In addition to the regular rent, the tenant must pay a fee for the final clean-up of €50, which must be paid in cash or by bank transfer at the time of handover of the apartment, or otherwise deducted from the deposit upon consultation with the landlord.</w:t>
+              <w:t>The monthly flat warm rent is {{RENT_PER_MONTH}} EUR. All operating costs (heating, water, green electricity, HOA/Hausgeld, GEZ TV tax, 1,000 Mbps Wi-Fi) are included.</w:t>
             </w:r>
           </w:p>
         </w:tc>
@@ -679,61 +667,42 @@
       <w:tr>
         <w:tc>
           <w:tcPr>
-            <w:tcW w:type="dxa" w:w="5040"/>
+            <w:tcW w:type="dxa" w:w="5112"/>
+            <w:shd w:fill="FAFBFD"/>
           </w:tcPr>
           <w:p>
+            <w:pPr>
+              <w:spacing w:before="40" w:after="40"/>
+            </w:pPr>
             <w:r>
               <w:rPr>
-                <w:b/>
-                <w:sz w:val="20"/>
+                <w:rFonts w:ascii="Arial" w:hAnsi="Arial"/>
+                <w:b w:val="0"/>
+                <w:sz w:val="19"/>
               </w:rPr>
-              <w:t>4. Mietzahlungen</w:t>
+              <w:t>§ 3 – Kaution:</w:t>
+              <w:br/>
+              <w:t>Der Mieter leistet eine Kaution von {{DEPOSIT_AMOUNT}} EUR vor Schlüsselübergabe zur Sicherung aller Ansprüche des Vermieters.</w:t>
             </w:r>
           </w:p>
         </w:tc>
         <w:tc>
           <w:tcPr>
-            <w:tcW w:type="dxa" w:w="5040"/>
+            <w:tcW w:type="dxa" w:w="5112"/>
           </w:tcPr>
           <w:p>
+            <w:pPr>
+              <w:spacing w:before="40" w:after="40"/>
+            </w:pPr>
             <w:r>
               <w:rPr>
-                <w:b/>
-                <w:sz w:val="20"/>
+                <w:rFonts w:ascii="Arial" w:hAnsi="Arial"/>
+                <w:b w:val="0"/>
+                <w:sz w:val="19"/>
               </w:rPr>
-              <w:t>4. Payment of rent</w:t>
-            </w:r>
-          </w:p>
-        </w:tc>
-      </w:tr>
-      <w:tr>
-        <w:tc>
-          <w:tcPr>
-            <w:tcW w:type="dxa" w:w="5040"/>
-          </w:tcPr>
-          <w:p>
-            <w:r>
-              <w:rPr>
-                <w:sz w:val="17"/>
-              </w:rPr>
-              <w:t>(1) Die erste Miete ist bei Vertragsunterzeichnung fällig und beläuft sich auf €639. Leistet der Mieter die vereinbarte Miete nicht, besteht kein Anspruch auf Übergabe der Mietsache.</w:t>
+              <w:t>§ 3 – Security Deposit:</w:t>
               <w:br/>
-              <w:t>(2) Im Folgenden ist die Miete monatlich im Voraus, spätestens bis zum 1. Werktag des jeweiligen Monats, kostenfrei an den Vermieter auf folgendes Konto zu leisten:</w:t>
-            </w:r>
-          </w:p>
-        </w:tc>
-        <w:tc>
-          <w:tcPr>
-            <w:tcW w:type="dxa" w:w="5040"/>
-          </w:tcPr>
-          <w:p>
-            <w:r>
-              <w:rPr>
-                <w:sz w:val="17"/>
-              </w:rPr>
-              <w:t>(1) The first rent is due after contract signing and amounts to 639€. If the tenant does not pay the agreed rent, there is no entitlement to occupy the rental property.</w:t>
-              <w:br/>
-              <w:t>(2) In the subsequent period, the rent is to be paid on a monthly basis in advance, at the latest by the first working day of the corresponding month, free of any charges to the landlord, to the following account:</w:t>
+              <w:t>A security deposit of {{DEPOSIT_AMOUNT}} EUR must be rendered prior to key handover to secure all obligations.</w:t>
             </w:r>
           </w:p>
         </w:tc>
@@ -744,6 +713,146 @@
         <w:br w:type="page"/>
       </w:r>
     </w:p>
+    <w:p>
+      <w:pPr>
+        <w:spacing w:before="0" w:after="200"/>
+        <w:jc w:val="center"/>
+      </w:pPr>
+      <w:r>
+        <w:drawing>
+          <wp:inline xmlns:a="http://schemas.openxmlformats.org/drawingml/2006/main" xmlns:pic="http://schemas.openxmlformats.org/drawingml/2006/picture">
+            <wp:extent cx="1828800" cy="1828800"/>
+            <wp:docPr id="4" name="Picture 4"/>
+            <wp:cNvGraphicFramePr>
+              <a:graphicFrameLocks noChangeAspect="1"/>
+            </wp:cNvGraphicFramePr>
+            <a:graphic>
+              <a:graphicData uri="http://schemas.openxmlformats.org/drawingml/2006/picture">
+                <pic:pic>
+                  <pic:nvPicPr>
+                    <pic:cNvPr id="0" name="Homelyo-logo-new.jpg"/>
+                    <pic:cNvPicPr/>
+                  </pic:nvPicPr>
+                  <pic:blipFill>
+                    <a:blip r:embed="rId9"/>
+                    <a:stretch>
+                      <a:fillRect/>
+                    </a:stretch>
+                  </pic:blipFill>
+                  <pic:spPr>
+                    <a:xfrm>
+                      <a:off x="0" y="0"/>
+                      <a:ext cx="1828800" cy="1828800"/>
+                    </a:xfrm>
+                    <a:prstGeom prst="rect"/>
+                  </pic:spPr>
+                </pic:pic>
+              </a:graphicData>
+            </a:graphic>
+          </wp:inline>
+        </w:drawing>
+      </w:r>
+    </w:p>
+    <w:p>
+      <w:r>
+        <w:rPr>
+          <w:b/>
+          <w:color w:val="0284C7"/>
+          <w:sz w:val="26"/>
+        </w:rPr>
+        <w:t>Zahlungsbedingungen &amp; Unterschriften / Payment &amp; Signatures</w:t>
+      </w:r>
+    </w:p>
+    <w:tbl>
+      <w:tblPr>
+        <w:tblW w:type="auto" w:w="0"/>
+        <w:tblLook w:firstColumn="1" w:firstRow="1" w:lastColumn="0" w:lastRow="0" w:noHBand="0" w:noVBand="1" w:val="04A0"/>
+      </w:tblPr>
+      <w:tblGrid>
+        <w:gridCol w:w="5112"/>
+        <w:gridCol w:w="5112"/>
+      </w:tblGrid>
+      <w:tr>
+        <w:tc>
+          <w:tcPr>
+            <w:tcW w:type="dxa" w:w="5112"/>
+            <w:shd w:fill="FAFBFD"/>
+          </w:tcPr>
+          <w:p>
+            <w:pPr>
+              <w:spacing w:before="40" w:after="40"/>
+            </w:pPr>
+            <w:r>
+              <w:rPr>
+                <w:rFonts w:ascii="Arial" w:hAnsi="Arial"/>
+                <w:b w:val="0"/>
+                <w:sz w:val="19"/>
+              </w:rPr>
+              <w:t>§ 4 – Zahlungsbedingungen:</w:t>
+              <w:br/>
+              <w:t>(1) Die Kaution ist bis zum {{DEPOSIT_AMOUNT_PAY_BEFORE_DT}} per Banküberweisung zu leisten. Die erste Miete ist vor Übergabe fällig.</w:t>
+              <w:br/>
+              <w:t>(2) Laufende Mieten sind bis zum 3. Werktag eines jeden Monats im Voraus zu zahlen.</w:t>
+              <w:br/>
+              <w:br/>
+              <w:t>§ 5 – Außerordentliche Kündigung:</w:t>
+              <w:br/>
+              <w:t>Gesetzliche Bestimmungen gelten für Kündigung aus wichtigem Grund in Schriftform.</w:t>
+              <w:br/>
+              <w:br/>
+              <w:t>§ 6 – AGB &amp; Anlagen:</w:t>
+              <w:br/>
+              <w:t>Anlage 1 (Inventar) und Anlage 2 (AGB) werden vollumfänglich anerkannt.</w:t>
+            </w:r>
+          </w:p>
+        </w:tc>
+        <w:tc>
+          <w:tcPr>
+            <w:tcW w:type="dxa" w:w="5112"/>
+          </w:tcPr>
+          <w:p>
+            <w:pPr>
+              <w:spacing w:before="40" w:after="40"/>
+            </w:pPr>
+            <w:r>
+              <w:rPr>
+                <w:rFonts w:ascii="Arial" w:hAnsi="Arial"/>
+                <w:b w:val="0"/>
+                <w:sz w:val="19"/>
+              </w:rPr>
+              <w:t>§ 4 – Payment Conditions:</w:t>
+              <w:br/>
+              <w:t>(1) The deposit must be transferred before {{DEPOSIT_AMOUNT_PAY_BEFORE_DT}}. First rent is due before handover.</w:t>
+              <w:br/>
+              <w:t>(2) Monthly rent is payable by the 3rd working day of each calendar month.</w:t>
+              <w:br/>
+              <w:br/>
+              <w:t>§ 5 – Extraordinary Termination:</w:t>
+              <w:br/>
+              <w:t>Statutory rules apply for termination for cause. Written form is mandatory.</w:t>
+              <w:br/>
+              <w:br/>
+              <w:t>§ 6 – Terms &amp; Conditions:</w:t>
+              <w:br/>
+              <w:t>Attachment 1 (Inventory) and Attachment 2 (AGB) form an integral part.</w:t>
+            </w:r>
+          </w:p>
+        </w:tc>
+      </w:tr>
+    </w:tbl>
+    <w:p>
+      <w:pPr>
+        <w:spacing w:before="160"/>
+      </w:pPr>
+      <w:r>
+        <w:rPr>
+          <w:i/>
+          <w:color w:val="64748B"/>
+          <w:sz w:val="17"/>
+        </w:rPr>
+        <w:t>Hinweis: Die deutsche Fassung ist rechtlich allein verbindlich. / Notice: The German text is solely legally binding.</w:t>
+      </w:r>
+    </w:p>
     <w:tbl>
       <w:tblPr>
         <w:tblW w:type="auto" w:w="0"/>
@@ -751,55 +860,45 @@
         <w:tblLook w:firstColumn="1" w:firstRow="1" w:lastColumn="0" w:lastRow="0" w:noHBand="0" w:noVBand="1" w:val="04A0"/>
       </w:tblPr>
       <w:tblGrid>
-        <w:gridCol w:w="5184"/>
-        <w:gridCol w:w="5184"/>
+        <w:gridCol w:w="5112"/>
+        <w:gridCol w:w="5112"/>
       </w:tblGrid>
       <w:tr>
         <w:tc>
           <w:tcPr>
-            <w:tcW w:type="dxa" w:w="5040"/>
+            <w:tcW w:type="dxa" w:w="5112"/>
           </w:tcPr>
           <w:p>
             <w:r>
               <w:rPr>
-                <w:sz w:val="17"/>
+                <w:sz w:val="19"/>
               </w:rPr>
-              <w:t>Kontoinhaber: Kylasam Nallagoundanpalayam Arruchamy</w:t>
-              <w:br/>
-              <w:t>IBAN: DE87100110012624542768</w:t>
-              <w:br/>
-              <w:t>BIC: NTSBDEB1XXX</w:t>
-              <w:br/>
-              <w:t>Verwendungszweck: Bhargavi Mangesh Ayare "Monat / Jahr"</w:t>
+              <w:t>Ort, Datum: Berlin, {{LANDLORD_SIGN_DATE}}</w:t>
               <w:br/>
               <w:br/>
-              <w:t>(3) Für die Rechtzeitigkeit der Zahlung kommt es nicht auf die Absendung, sondern auf den Eingang des Geldes an.</w:t>
               <w:br/>
-              <w:t>(4) Der Mieter hat für jede Mahnung/ Zahlungserinnerung wegen verspäteter Zahlung der Miete 2,50 Euro für pauschalierte Mahnkosten zu zahlen, sofern der Mieter nicht nachweist, dass dem Vermieter geringere bzw. keine Kosten entstanden sind.</w:t>
+              <w:t>__________________________________</w:t>
+              <w:br/>
+              <w:t>Kylasam N. A. (Vermieter / Landlord)</w:t>
             </w:r>
           </w:p>
         </w:tc>
         <w:tc>
           <w:tcPr>
-            <w:tcW w:type="dxa" w:w="5040"/>
+            <w:tcW w:type="dxa" w:w="5112"/>
           </w:tcPr>
           <w:p>
             <w:r>
               <w:rPr>
-                <w:sz w:val="17"/>
+                <w:sz w:val="19"/>
               </w:rPr>
-              <w:t>Account holder: Kylasam Nallagoundanpalayam Arruchamy</w:t>
-              <w:br/>
-              <w:t>IBAN: DE87100110012624542768</w:t>
-              <w:br/>
-              <w:t>BIC: NTSBDEB1XXX</w:t>
-              <w:br/>
-              <w:t>Payment reference: Bhargavi Mangesh Ayare "Month / Year"</w:t>
+              <w:t>Ort, Datum: {{TENANT_SIGN_DATE}}</w:t>
               <w:br/>
               <w:br/>
-              <w:t>(3) Punctual payment does not depend on the time of transfer, but on the receipt of the money.</w:t>
               <w:br/>
-              <w:t>(4) For each reminder/overdue payment notice attributable to the late payment of the rent, the tenant must pay a fee of €2,50 as a reminder cost, unless the tenant proves that the landlord has incurred lower or no expenses.</w:t>
+              <w:t>__________________________________</w:t>
+              <w:br/>
+              <w:t>{{TENANT_NAME}} (Mieter / Tenant)</w:t>
             </w:r>
           </w:p>
         </w:tc>
@@ -807,29 +906,111 @@
       <w:tr>
         <w:tc>
           <w:tcPr>
-            <w:tcW w:type="dxa" w:w="5040"/>
+            <w:tcW w:type="dxa" w:w="5112"/>
+          </w:tcPr>
+          <w:p/>
+        </w:tc>
+        <w:tc>
+          <w:tcPr>
+            <w:tcW w:type="dxa" w:w="5112"/>
+          </w:tcPr>
+          <w:p/>
+        </w:tc>
+      </w:tr>
+    </w:tbl>
+    <w:p>
+      <w:r>
+        <w:br w:type="page"/>
+      </w:r>
+    </w:p>
+    <w:p>
+      <w:pPr>
+        <w:spacing w:before="0" w:after="200"/>
+        <w:jc w:val="center"/>
+      </w:pPr>
+      <w:r>
+        <w:drawing>
+          <wp:inline xmlns:a="http://schemas.openxmlformats.org/drawingml/2006/main" xmlns:pic="http://schemas.openxmlformats.org/drawingml/2006/picture">
+            <wp:extent cx="1828800" cy="1828800"/>
+            <wp:docPr id="5" name="Picture 5"/>
+            <wp:cNvGraphicFramePr>
+              <a:graphicFrameLocks noChangeAspect="1"/>
+            </wp:cNvGraphicFramePr>
+            <a:graphic>
+              <a:graphicData uri="http://schemas.openxmlformats.org/drawingml/2006/picture">
+                <pic:pic>
+                  <pic:nvPicPr>
+                    <pic:cNvPr id="0" name="Homelyo-logo-new.jpg"/>
+                    <pic:cNvPicPr/>
+                  </pic:nvPicPr>
+                  <pic:blipFill>
+                    <a:blip r:embed="rId9"/>
+                    <a:stretch>
+                      <a:fillRect/>
+                    </a:stretch>
+                  </pic:blipFill>
+                  <pic:spPr>
+                    <a:xfrm>
+                      <a:off x="0" y="0"/>
+                      <a:ext cx="1828800" cy="1828800"/>
+                    </a:xfrm>
+                    <a:prstGeom prst="rect"/>
+                  </pic:spPr>
+                </pic:pic>
+              </a:graphicData>
+            </a:graphic>
+          </wp:inline>
+        </w:drawing>
+      </w:r>
+    </w:p>
+    <w:p>
+      <w:r>
+        <w:rPr>
+          <w:b/>
+          <w:color w:val="0284C7"/>
+          <w:sz w:val="26"/>
+        </w:rPr>
+        <w:t>Zahlungsmöglichkeiten / Payment Options</w:t>
+      </w:r>
+    </w:p>
+    <w:p>
+      <w:r>
+        <w:rPr>
+          <w:b/>
+        </w:rPr>
+        <w:t>Bankverbindung für Miete &amp; Kaution / Bank Details for Rent &amp; Deposit:</w:t>
+      </w:r>
+    </w:p>
+    <w:tbl>
+      <w:tblPr>
+        <w:tblW w:type="auto" w:w="0"/>
+        <w:tblLook w:firstColumn="1" w:firstRow="1" w:lastColumn="0" w:lastRow="0" w:noHBand="0" w:noVBand="1" w:val="04A0"/>
+      </w:tblPr>
+      <w:tblGrid>
+        <w:gridCol w:w="5112"/>
+        <w:gridCol w:w="5112"/>
+      </w:tblGrid>
+      <w:tr>
+        <w:tc>
+          <w:tcPr>
+            <w:tcW w:type="dxa" w:w="5112"/>
           </w:tcPr>
           <w:p>
             <w:r>
               <w:rPr>
                 <w:b/>
-                <w:sz w:val="20"/>
               </w:rPr>
-              <w:t>5. Mietsicherheit/ Kaution</w:t>
+              <w:t>Kontoinhaber / Account Holder:</w:t>
             </w:r>
           </w:p>
         </w:tc>
         <w:tc>
           <w:tcPr>
-            <w:tcW w:type="dxa" w:w="5040"/>
+            <w:tcW w:type="dxa" w:w="5112"/>
           </w:tcPr>
           <w:p>
             <w:r>
-              <w:rPr>
-                <w:b/>
-                <w:sz w:val="20"/>
-              </w:rPr>
-              <w:t>5. Security deposit</w:t>
+              <w:t>Kylasam Nallagoundanpalayam Arruchamy</w:t>
             </w:r>
           </w:p>
         </w:tc>
@@ -837,57 +1018,269 @@
       <w:tr>
         <w:tc>
           <w:tcPr>
-            <w:tcW w:type="dxa" w:w="5040"/>
+            <w:tcW w:type="dxa" w:w="5112"/>
           </w:tcPr>
           <w:p>
             <w:r>
               <w:rPr>
-                <w:sz w:val="17"/>
+                <w:b/>
               </w:rPr>
-              <w:t>(1) Der Mieter leistet für die Erfüllung seiner Pflichten aus diesem Mietvertrag zu Beginn des Mietverhältnisses eine Sicherheit in Höhe von 1.200€, an den Vermieter auf folgendes Konto:</w:t>
-              <w:br/>
-              <w:br/>
-              <w:t>Kontoinhaber: Kylasam Nallagoundanpalayam Arruchamy</w:t>
-              <w:br/>
-              <w:t>IBAN: DE25120400000011466000</w:t>
-              <w:br/>
-              <w:t>BIC: COBADEFFXXX</w:t>
-              <w:br/>
-              <w:t>Verwendungszweck: Bhargavi Mangesh Ayare "Kaution"</w:t>
-              <w:br/>
-              <w:t>oder in bar bei Mietvertragsschluss.</w:t>
-              <w:br/>
-              <w:t>(2) Leistet der Mieter die vereinbarte Mietsicherheit nicht, besteht kein Anspruch auf Übergabe der Mietsache.</w:t>
-              <w:br/>
-              <w:t>(3) Nach Vertragsende und Rückgabe der Mietsache rechnet der Vermieter die Kaution gegenüber dem Mieter ab und zahlt, wenn sich die Wohnung in dem Zustand befindet, in dem sie sich am Anfang befand (ausgenommen Verschleiß) den errechneten Kautionsbetrag aus. Ein Zurückbehaltungsrecht des Vermieters besteht nicht, solange keine begründeten Gegenansprüche dargelegt werden (z.B. Schäden an Möbeln, nicht bezahlte Miete).</w:t>
+              <w:t>IBAN:</w:t>
             </w:r>
           </w:p>
         </w:tc>
         <w:tc>
           <w:tcPr>
-            <w:tcW w:type="dxa" w:w="5040"/>
+            <w:tcW w:type="dxa" w:w="5112"/>
+          </w:tcPr>
+          <w:p>
+            <w:r>
+              <w:t>DE 87 1001 1001 2624 5427 68</w:t>
+            </w:r>
+          </w:p>
+        </w:tc>
+      </w:tr>
+      <w:tr>
+        <w:tc>
+          <w:tcPr>
+            <w:tcW w:type="dxa" w:w="5112"/>
           </w:tcPr>
           <w:p>
             <w:r>
               <w:rPr>
-                <w:sz w:val="17"/>
+                <w:b/>
               </w:rPr>
-              <w:t>(1) For the fulfilment of his/ her obligations from this rental agreement, the tenant shall pay a security deposit of €1.200, to the landlord due upon the beginning of rental period, to the following bank account:</w:t>
+              <w:t>BIC / SWIFT:</w:t>
+            </w:r>
+          </w:p>
+        </w:tc>
+        <w:tc>
+          <w:tcPr>
+            <w:tcW w:type="dxa" w:w="5112"/>
+          </w:tcPr>
+          <w:p>
+            <w:r>
+              <w:t>NTSBDEB1XXX</w:t>
+            </w:r>
+          </w:p>
+        </w:tc>
+      </w:tr>
+      <w:tr>
+        <w:tc>
+          <w:tcPr>
+            <w:tcW w:type="dxa" w:w="5112"/>
+          </w:tcPr>
+          <w:p>
+            <w:r>
+              <w:rPr>
+                <w:b/>
+              </w:rPr>
+              <w:t>Kreditinstitut / Bank:</w:t>
+            </w:r>
+          </w:p>
+        </w:tc>
+        <w:tc>
+          <w:tcPr>
+            <w:tcW w:type="dxa" w:w="5112"/>
+          </w:tcPr>
+          <w:p>
+            <w:r>
+              <w:t>N26 Bank AG, Berlin</w:t>
+            </w:r>
+          </w:p>
+        </w:tc>
+      </w:tr>
+    </w:tbl>
+    <w:p>
+      <w:pPr>
+        <w:spacing w:before="160"/>
+      </w:pPr>
+      <w:r>
+        <w:rPr>
+          <w:b/>
+        </w:rPr>
+        <w:t>Verwendungszweck / Payment Reference:</w:t>
+      </w:r>
+    </w:p>
+    <w:p>
+      <w:r>
+        <w:t>• Für Miete: Miete [Monat/Jahr] {{TENANT_NAME}}</w:t>
+        <w:br/>
+        <w:t>• Für Kaution: Kaution {{TENANT_NAME}} Zimmer {{TENANT_ROOM_ID}}</w:t>
+      </w:r>
+    </w:p>
+    <w:p>
+      <w:r>
+        <w:br w:type="page"/>
+      </w:r>
+    </w:p>
+    <w:p>
+      <w:pPr>
+        <w:spacing w:before="0" w:after="200"/>
+        <w:jc w:val="center"/>
+      </w:pPr>
+      <w:r>
+        <w:drawing>
+          <wp:inline xmlns:a="http://schemas.openxmlformats.org/drawingml/2006/main" xmlns:pic="http://schemas.openxmlformats.org/drawingml/2006/picture">
+            <wp:extent cx="1828800" cy="1828800"/>
+            <wp:docPr id="6" name="Picture 6"/>
+            <wp:cNvGraphicFramePr>
+              <a:graphicFrameLocks noChangeAspect="1"/>
+            </wp:cNvGraphicFramePr>
+            <a:graphic>
+              <a:graphicData uri="http://schemas.openxmlformats.org/drawingml/2006/picture">
+                <pic:pic>
+                  <pic:nvPicPr>
+                    <pic:cNvPr id="0" name="Homelyo-logo-new.jpg"/>
+                    <pic:cNvPicPr/>
+                  </pic:nvPicPr>
+                  <pic:blipFill>
+                    <a:blip r:embed="rId9"/>
+                    <a:stretch>
+                      <a:fillRect/>
+                    </a:stretch>
+                  </pic:blipFill>
+                  <pic:spPr>
+                    <a:xfrm>
+                      <a:off x="0" y="0"/>
+                      <a:ext cx="1828800" cy="1828800"/>
+                    </a:xfrm>
+                    <a:prstGeom prst="rect"/>
+                  </pic:spPr>
+                </pic:pic>
+              </a:graphicData>
+            </a:graphic>
+          </wp:inline>
+        </w:drawing>
+      </w:r>
+    </w:p>
+    <w:p>
+      <w:r>
+        <w:rPr>
+          <w:b/>
+          <w:color w:val="0284C7"/>
+          <w:sz w:val="26"/>
+        </w:rPr>
+        <w:t>Anlage 1 – Inventar der Mietsache / Attachment 1 – Inventory</w:t>
+      </w:r>
+    </w:p>
+    <w:tbl>
+      <w:tblPr>
+        <w:tblW w:type="auto" w:w="0"/>
+        <w:tblLook w:firstColumn="1" w:firstRow="1" w:lastColumn="0" w:lastRow="0" w:noHBand="0" w:noVBand="1" w:val="04A0"/>
+      </w:tblPr>
+      <w:tblGrid>
+        <w:gridCol w:w="5112"/>
+        <w:gridCol w:w="5112"/>
+      </w:tblGrid>
+      <w:tr>
+        <w:tc>
+          <w:tcPr>
+            <w:tcW w:type="dxa" w:w="5112"/>
+            <w:shd w:fill="FAFBFD"/>
+          </w:tcPr>
+          <w:p>
+            <w:pPr>
+              <w:spacing w:before="40" w:after="40"/>
+            </w:pPr>
+            <w:r>
+              <w:rPr>
+                <w:rFonts w:ascii="Arial" w:hAnsi="Arial"/>
+                <w:b w:val="0"/>
+                <w:sz w:val="19"/>
+              </w:rPr>
+              <w:t>Ausstattung im Zimmer:</w:t>
+              <w:br/>
+              <w:t>• Bett mit Qualitätsmatratze, Lattenrost &amp; Schoner</w:t>
+              <w:br/>
+              <w:t>• Kleiderschrank / Kommode</w:t>
+              <w:br/>
+              <w:t>• Schreibtisch &amp; Bürostuhl</w:t>
+              <w:br/>
+              <w:t>• Spiegel, Beleuchtung, Vorhänge</w:t>
+              <w:br/>
+              <w:t>• Bettwäscheset &amp; Kissen</w:t>
               <w:br/>
               <w:br/>
-              <w:t>Account holder: Kylasam Nallagoundanpalayam Arruchamy</w:t>
+              <w:t>Gemeinschaftsausstattung:</w:t>
               <w:br/>
-              <w:t>IBAN: DE25120400000011466000</w:t>
+              <w:t>• Waschmaschine, Kühlschrank, Induktionskochfeld, Backofen, Mikrowelle, Kaffeemaschine, Wasserkocher, Staubsauger, Geschirr &amp; Kochutensilien.</w:t>
+            </w:r>
+          </w:p>
+        </w:tc>
+        <w:tc>
+          <w:tcPr>
+            <w:tcW w:type="dxa" w:w="5112"/>
+          </w:tcPr>
+          <w:p>
+            <w:pPr>
+              <w:spacing w:before="40" w:after="40"/>
+            </w:pPr>
+            <w:r>
+              <w:rPr>
+                <w:rFonts w:ascii="Arial" w:hAnsi="Arial"/>
+                <w:b w:val="0"/>
+                <w:sz w:val="19"/>
+              </w:rPr>
+              <w:t>Included in the Lease:</w:t>
               <w:br/>
-              <w:t>BIC: COBADEFFXXX</w:t>
+              <w:t>• Quality bed with mattress, slatted frame &amp; protector</w:t>
               <w:br/>
-              <w:t>Payment reference: Bhargavi Mangesh Ayare "Deposit"</w:t>
+              <w:t>• Large wardrobe / dresser</w:t>
               <w:br/>
-              <w:t>or in cash upon conclusion of the rental contract.</w:t>
+              <w:t>• Study desk &amp; office chair</w:t>
               <w:br/>
-              <w:t>(2) If the tenant does not pay the agreed security deposit, there is no entitlement to occupy the rental property.</w:t>
+              <w:t>• Mirror, lighting fixtures, curtains</w:t>
               <w:br/>
-              <w:t>(3) After termination of the contract and the return of the rental property, the landlord settles the security deposit with the tenant and pays back the deposit amount if the apartment is in the same condition as it was at the start of the contract (excluding wear and tear). The landlord cannot exercise a retention right as long as no justified counter-claims are presented (e.g. damage to furniture, unpaid rent).</w:t>
+              <w:t>• Pillow &amp; bed linen sets</w:t>
+              <w:br/>
+              <w:br/>
+              <w:t>Shared Amenities:</w:t>
+              <w:br/>
+              <w:t>• Washing machine, fridge/freezer, induction hob, oven, microwave, coffee maker, kettle, vacuum cleaner, tableware &amp; kitchen cookware.</w:t>
+            </w:r>
+          </w:p>
+        </w:tc>
+      </w:tr>
+      <w:tr>
+        <w:tc>
+          <w:tcPr>
+            <w:tcW w:type="dxa" w:w="5112"/>
+            <w:shd w:fill="FAFBFD"/>
+          </w:tcPr>
+          <w:p>
+            <w:pPr>
+              <w:spacing w:before="40" w:after="40"/>
+            </w:pPr>
+            <w:r>
+              <w:rPr>
+                <w:rFonts w:ascii="Arial" w:hAnsi="Arial"/>
+                <w:b w:val="0"/>
+                <w:sz w:val="19"/>
+              </w:rPr>
+              <w:t>Kleinreparaturklausel:</w:t>
+              <w:br/>
+              <w:t>Kleinere Instandhaltungen bis zu 200,00 EUR im Einzelfall an Gegenständen des täglichen Gebrauchs trägt der Mieter selbst (inkl. Leuchtmittelaustausch).</w:t>
+            </w:r>
+          </w:p>
+        </w:tc>
+        <w:tc>
+          <w:tcPr>
+            <w:tcW w:type="dxa" w:w="5112"/>
+          </w:tcPr>
+          <w:p>
+            <w:pPr>
+              <w:spacing w:before="40" w:after="40"/>
+            </w:pPr>
+            <w:r>
+              <w:rPr>
+                <w:rFonts w:ascii="Arial" w:hAnsi="Arial"/>
+                <w:b w:val="0"/>
+                <w:sz w:val="19"/>
+              </w:rPr>
+              <w:t>Minor Repairs Clause:</w:t>
+              <w:br/>
+              <w:t>Repairs on daily fixtures up to 200.00 EUR per occurrence are covered by the tenant (including light bulb replacement).</w:t>
             </w:r>
           </w:p>
         </w:tc>
@@ -898,42 +1291,128 @@
         <w:br w:type="page"/>
       </w:r>
     </w:p>
+    <w:p>
+      <w:pPr>
+        <w:spacing w:before="0" w:after="200"/>
+        <w:jc w:val="center"/>
+      </w:pPr>
+      <w:r>
+        <w:drawing>
+          <wp:inline xmlns:a="http://schemas.openxmlformats.org/drawingml/2006/main" xmlns:pic="http://schemas.openxmlformats.org/drawingml/2006/picture">
+            <wp:extent cx="1828800" cy="1828800"/>
+            <wp:docPr id="7" name="Picture 7"/>
+            <wp:cNvGraphicFramePr>
+              <a:graphicFrameLocks noChangeAspect="1"/>
+            </wp:cNvGraphicFramePr>
+            <a:graphic>
+              <a:graphicData uri="http://schemas.openxmlformats.org/drawingml/2006/picture">
+                <pic:pic>
+                  <pic:nvPicPr>
+                    <pic:cNvPr id="0" name="Homelyo-logo-new.jpg"/>
+                    <pic:cNvPicPr/>
+                  </pic:nvPicPr>
+                  <pic:blipFill>
+                    <a:blip r:embed="rId9"/>
+                    <a:stretch>
+                      <a:fillRect/>
+                    </a:stretch>
+                  </pic:blipFill>
+                  <pic:spPr>
+                    <a:xfrm>
+                      <a:off x="0" y="0"/>
+                      <a:ext cx="1828800" cy="1828800"/>
+                    </a:xfrm>
+                    <a:prstGeom prst="rect"/>
+                  </pic:spPr>
+                </pic:pic>
+              </a:graphicData>
+            </a:graphic>
+          </wp:inline>
+        </w:drawing>
+      </w:r>
+    </w:p>
+    <w:p>
+      <w:r>
+        <w:rPr>
+          <w:b/>
+          <w:color w:val="0284C7"/>
+          <w:sz w:val="26"/>
+        </w:rPr>
+        <w:t>Anlage 2 – Allgemeine Geschäftsbedingungen (AGB)</w:t>
+      </w:r>
+    </w:p>
     <w:tbl>
       <w:tblPr>
         <w:tblW w:type="auto" w:w="0"/>
-        <w:jc w:val="center"/>
         <w:tblLook w:firstColumn="1" w:firstRow="1" w:lastColumn="0" w:lastRow="0" w:noHBand="0" w:noVBand="1" w:val="04A0"/>
       </w:tblPr>
       <w:tblGrid>
-        <w:gridCol w:w="5184"/>
-        <w:gridCol w:w="5184"/>
+        <w:gridCol w:w="5112"/>
+        <w:gridCol w:w="5112"/>
       </w:tblGrid>
       <w:tr>
         <w:tc>
           <w:tcPr>
-            <w:tcW w:type="dxa" w:w="5040"/>
+            <w:tcW w:type="dxa" w:w="5112"/>
+            <w:shd w:fill="FAFBFD"/>
           </w:tcPr>
           <w:p>
+            <w:pPr>
+              <w:spacing w:before="40" w:after="40"/>
+            </w:pPr>
             <w:r>
               <w:rPr>
-                <w:b/>
-                <w:sz w:val="20"/>
+                <w:rFonts w:ascii="Arial" w:hAnsi="Arial"/>
+                <w:b w:val="0"/>
+                <w:sz w:val="19"/>
               </w:rPr>
-              <w:t>6. Kündigung</w:t>
+              <w:t>§ 1 Zusammenleben &amp; Hausordnung:</w:t>
+              <w:br/>
+              <w:t>1. Gegenseitige Rücksichtnahme in der WG.</w:t>
+              <w:br/>
+              <w:t>2. Ruhezeiten: 22:00 bis 08:00 Uhr sowie 13:00 bis 15:00 Uhr. Zimmerlautstärke ist obligatorisch.</w:t>
+              <w:br/>
+              <w:t>3. Partys: Störende Feiern im Haus/Zimmer sind untersagt.</w:t>
+              <w:br/>
+              <w:t>4. Reinigung: Alle Mieter reinigen Bad, Küche und Flur eigenverantwortlich nach Putzplan.</w:t>
+              <w:br/>
+              <w:t>5. Rauchverbot: Striktes Rauch- und Drogenverbot im gesamten Gebäude.</w:t>
+              <w:br/>
+              <w:t>6. Haustiere: Tierhaltung ist untersagt.</w:t>
+              <w:br/>
+              <w:t>7. Gäste: Übernachtungsgäste max. 5 Tage/Monat.</w:t>
             </w:r>
           </w:p>
         </w:tc>
         <w:tc>
           <w:tcPr>
-            <w:tcW w:type="dxa" w:w="5040"/>
+            <w:tcW w:type="dxa" w:w="5112"/>
           </w:tcPr>
           <w:p>
+            <w:pPr>
+              <w:spacing w:before="40" w:after="40"/>
+            </w:pPr>
             <w:r>
               <w:rPr>
-                <w:b/>
-                <w:sz w:val="20"/>
+                <w:rFonts w:ascii="Arial" w:hAnsi="Arial"/>
+                <w:b w:val="0"/>
+                <w:sz w:val="19"/>
               </w:rPr>
-              <w:t>6. Termination</w:t>
+              <w:t>§ 1 Community Living &amp; House Rules:</w:t>
+              <w:br/>
+              <w:t>1. Mutual consideration among co-living residents.</w:t>
+              <w:br/>
+              <w:t>2. Quiet Hours: 22:00 to 08:00 and 13:00 to 15:00. Room volume must be respected at all times.</w:t>
+              <w:br/>
+              <w:t>3. Parties: Disruptive gatherings are strictly forbidden.</w:t>
+              <w:br/>
+              <w:t>4. Cleaning: Roommates clean shared kitchen, bathroom and hall via weekly schedule.</w:t>
+              <w:br/>
+              <w:t>5. Non-Smoking: Strict smoking and drug ban throughout the building.</w:t>
+              <w:br/>
+              <w:t>6. Pets: Pets of any kind are not permitted.</w:t>
+              <w:br/>
+              <w:t>7. Visitors: Guests limited to max 5 nights/month.</w:t>
             </w:r>
           </w:p>
         </w:tc>
@@ -941,31 +1420,50 @@
       <w:tr>
         <w:tc>
           <w:tcPr>
-            <w:tcW w:type="dxa" w:w="5040"/>
+            <w:tcW w:type="dxa" w:w="5112"/>
+            <w:shd w:fill="FAFBFD"/>
           </w:tcPr>
           <w:p>
+            <w:pPr>
+              <w:spacing w:before="40" w:after="40"/>
+            </w:pPr>
             <w:r>
               <w:rPr>
-                <w:sz w:val="17"/>
+                <w:rFonts w:ascii="Arial" w:hAnsi="Arial"/>
+                <w:b w:val="0"/>
+                <w:sz w:val="19"/>
               </w:rPr>
-              <w:t>Der Mietvertrag wird für den in Ziffer 2 genannten Zeitraum fest abgeschlossen.</w:t>
+              <w:t>§ 2 Wohnungsnutzung &amp; Lüften:</w:t>
               <w:br/>
-              <w:t>Das Recht der Parteien zur außerordentlichen Kündigung des Mietverhältnisses bleibt hiervon unberührt.</w:t>
+              <w:t>1. Nur zu Wohnzwecken gestattet.</w:t>
+              <w:br/>
+              <w:t>2. Mindestens 2x täglich Stoßlüften (5-10 Min.) zur Schimmelvermeidung. Heizkörper beim Lüften abdrehen.</w:t>
+              <w:br/>
+              <w:t>3. Internetnutzung: Keine Urheberrechtsverletzungen (Torrents).</w:t>
             </w:r>
           </w:p>
         </w:tc>
         <w:tc>
           <w:tcPr>
-            <w:tcW w:type="dxa" w:w="5040"/>
+            <w:tcW w:type="dxa" w:w="5112"/>
           </w:tcPr>
           <w:p>
+            <w:pPr>
+              <w:spacing w:before="40" w:after="40"/>
+            </w:pPr>
             <w:r>
               <w:rPr>
-                <w:sz w:val="17"/>
+                <w:rFonts w:ascii="Arial" w:hAnsi="Arial"/>
+                <w:b w:val="0"/>
+                <w:sz w:val="19"/>
               </w:rPr>
-              <w:t>The rental contract is concluded for the period specified in Section 2.</w:t>
+              <w:t>§ 2 Apartment Care &amp; Ventilation:</w:t>
               <w:br/>
-              <w:t>The right of the parties to an exceptional termination of the rent remains unaffected.</w:t>
+              <w:t>1. Residential use only.</w:t>
+              <w:br/>
+              <w:t>2. Cross-ventilate room minimum 2x daily (5-10 min) to avoid mold. Shut radiators when airing.</w:t>
+              <w:br/>
+              <w:t>3. Internet: Torrenting and piracy are strictly barred.</w:t>
             </w:r>
           </w:p>
         </w:tc>
@@ -973,29 +1471,50 @@
       <w:tr>
         <w:tc>
           <w:tcPr>
-            <w:tcW w:type="dxa" w:w="5040"/>
+            <w:tcW w:type="dxa" w:w="5112"/>
+            <w:shd w:fill="FAFBFD"/>
           </w:tcPr>
           <w:p>
+            <w:pPr>
+              <w:spacing w:before="40" w:after="40"/>
+            </w:pPr>
             <w:r>
               <w:rPr>
-                <w:b/>
-                <w:sz w:val="20"/>
+                <w:rFonts w:ascii="Arial" w:hAnsi="Arial"/>
+                <w:b w:val="0"/>
+                <w:sz w:val="19"/>
               </w:rPr>
-              <w:t>7. Nutzung der Mietsache</w:t>
+              <w:t>§ 3 Instandhaltung, Sorgfalt &amp; Kündigung:</w:t>
+              <w:br/>
+              <w:t>1. Keine Wandbohrungen, Dübel oder Klebenägel ohne Genehmigung.</w:t>
+              <w:br/>
+              <w:t>2. Abflüsse vor Fett und Speiseresten schützen.</w:t>
+              <w:br/>
+              <w:t>3. Schlüsselrückgabe: Alle 4 Schlüssel sind bei Auszug besenrein zurückzugeben.</w:t>
             </w:r>
           </w:p>
         </w:tc>
         <w:tc>
           <w:tcPr>
-            <w:tcW w:type="dxa" w:w="5040"/>
+            <w:tcW w:type="dxa" w:w="5112"/>
           </w:tcPr>
           <w:p>
+            <w:pPr>
+              <w:spacing w:before="40" w:after="40"/>
+            </w:pPr>
             <w:r>
               <w:rPr>
-                <w:b/>
-                <w:sz w:val="20"/>
+                <w:rFonts w:ascii="Arial" w:hAnsi="Arial"/>
+                <w:b w:val="0"/>
+                <w:sz w:val="19"/>
               </w:rPr>
-              <w:t>7. Use of the rental property</w:t>
+              <w:t>§ 3 Upkeep, Care &amp; Departure:</w:t>
+              <w:br/>
+              <w:t>1. No drilling, nailing or stickers on walls without permission.</w:t>
+              <w:br/>
+              <w:t>2. Keep pipes and drains clean.</w:t>
+              <w:br/>
+              <w:t>3. Handover: Return room broom-clean with all 4 issued keys.</w:t>
             </w:r>
           </w:p>
         </w:tc>
@@ -1003,629 +1522,42 @@
       <w:tr>
         <w:tc>
           <w:tcPr>
-            <w:tcW w:type="dxa" w:w="5040"/>
+            <w:tcW w:type="dxa" w:w="5112"/>
+            <w:shd w:fill="FAFBFD"/>
           </w:tcPr>
           <w:p>
+            <w:pPr>
+              <w:spacing w:before="40" w:after="40"/>
+            </w:pPr>
             <w:r>
               <w:rPr>
-                <w:sz w:val="17"/>
+                <w:rFonts w:ascii="Arial" w:hAnsi="Arial"/>
+                <w:b w:val="0"/>
+                <w:sz w:val="19"/>
               </w:rPr>
-              <w:t>(1) Eine weitere Untervermietung, sonstige Gebrauchsüberlassung an Dritte oder gewerbliche Nutzung ist dem Mieter ausdrücklich nicht gestattet.</w:t>
+              <w:t>§ 4 Salvatorische Klausel &amp; Gerichtsstand:</w:t>
               <w:br/>
-              <w:t>(2) Haustiere sind in der Wohnung nicht erlaubt</w:t>
-              <w:br/>
-              <w:t>(3) Rauchen ist in der Wohnung nicht erlaubt</w:t>
+              <w:t>Unwirksame Bestimmungen berühren die übrigen Klauseln nicht. Gerichtsstand und Erfüllungsort ist Berlin, Deutschland.</w:t>
             </w:r>
           </w:p>
         </w:tc>
         <w:tc>
           <w:tcPr>
-            <w:tcW w:type="dxa" w:w="5040"/>
+            <w:tcW w:type="dxa" w:w="5112"/>
           </w:tcPr>
           <w:p>
+            <w:pPr>
+              <w:spacing w:before="40" w:after="40"/>
+            </w:pPr>
             <w:r>
               <w:rPr>
-                <w:sz w:val="17"/>
+                <w:rFonts w:ascii="Arial" w:hAnsi="Arial"/>
+                <w:b w:val="0"/>
+                <w:sz w:val="19"/>
               </w:rPr>
-              <w:t>(1) A further subletting, other transfer of use to third parties or commercial use on behalf of the tenant is expressly prohibited.</w:t>
+              <w:t>§ 4 Severability &amp; Jurisdiction:</w:t>
               <w:br/>
-              <w:t>(2) Pets are not allowed in the apartment</w:t>
-              <w:br/>
-              <w:t>(3) Smoking in the apartment is not allowed</w:t>
-            </w:r>
-          </w:p>
-        </w:tc>
-      </w:tr>
-      <w:tr>
-        <w:tc>
-          <w:tcPr>
-            <w:tcW w:type="dxa" w:w="5040"/>
-          </w:tcPr>
-          <w:p>
-            <w:r>
-              <w:rPr>
-                <w:b/>
-                <w:sz w:val="20"/>
-              </w:rPr>
-              <w:t>8. Instandhaltungspflicht/ Bauliche Veränderungen</w:t>
-            </w:r>
-          </w:p>
-        </w:tc>
-        <w:tc>
-          <w:tcPr>
-            <w:tcW w:type="dxa" w:w="5040"/>
-          </w:tcPr>
-          <w:p>
-            <w:r>
-              <w:rPr>
-                <w:b/>
-                <w:sz w:val="20"/>
-              </w:rPr>
-              <w:t>8. Obligation to undertake maintenance/ structural modifications</w:t>
-            </w:r>
-          </w:p>
-        </w:tc>
-      </w:tr>
-      <w:tr>
-        <w:tc>
-          <w:tcPr>
-            <w:tcW w:type="dxa" w:w="5040"/>
-          </w:tcPr>
-          <w:p>
-            <w:r>
-              <w:rPr>
-                <w:sz w:val="17"/>
-              </w:rPr>
-              <w:t>(1) Der Mieter ist verpflichtet, die Mietsache sowie die überlassenen Möbel, Einrichtungen und Anlagen schonend und pfleglich zu behandeln. Er hat für eine ordnungsgemäße Reinigung der Mietsache und für eine ausreichende Lüftung und Beheizung des ihm überlassenen Hauses zu sorgen.</w:t>
-              <w:br/>
-              <w:t>(2) Zeigt sich ein wesentlicher Mangel der Mietsache oder wird eine Vorkehrung zum Schutz der Mietsache oder des Anwesens gegen eine nicht vorhergesehene Gefahr erforderlich, so hat der Mieter dies dem Vermieter unverzüglich mitzuteilen und ihm Gelegenheit zu geben, innerhalb angemessener Frist für Abhilfe zu sorgen. Der Mieter hat keinen Anspruch auf Ersatz seiner Aufwendungen, wenn er nicht dem Vermieter vorher diese Gelegenheit gegeben hat, es sei denn, es bestand Gefahr im Verzug.</w:t>
-              <w:br/>
-              <w:t>(3) Den Mieter trifft die Beweislast für den Umstand, dass er einen Schaden nicht zu vertreten hat, wenn die Schadensursache in einem Bereich der Mietsache liegt, der nur ihm als Mietpartei zugänglich ist.</w:t>
-              <w:br/>
-              <w:t>(4) Hat der Mieter einen Schaden zu vertreten, ist er verpflichtet, diesen sofort zu beseitigen. Das bedeutet eine angemessene Schadensersatzzahlung oder der Austausch des beschädigten Inventars.</w:t>
-              <w:br/>
-              <w:t>(5) Der Mieter ist nicht berechtigt, an den gemieteten Räumen bauliche Veränderungen vorzunehmen.</w:t>
-            </w:r>
-          </w:p>
-        </w:tc>
-        <w:tc>
-          <w:tcPr>
-            <w:tcW w:type="dxa" w:w="5040"/>
-          </w:tcPr>
-          <w:p>
-            <w:r>
-              <w:rPr>
-                <w:sz w:val="17"/>
-              </w:rPr>
-              <w:t>(1) The tenant is obliged to treat the rental property, as well as the furniture, furnishings and equipment with respect and care. The tenant shall ensure proper cleaning and sufficient ventilation and heating of the rental property.</w:t>
-              <w:br/>
-              <w:t>(2) If a substantial defect of the rental property becomes apparent or if a precautionary measure is necessary to protect the rental property or the premises against an unforeseen hazard, the tenant shall immediately inform the landlord and grant the opportunity to remedy the situation within a reasonable period of time. The tenant is not entitled to compensation for his/her expenses if no notice was given to the landlord concerning this opportunity, unless an imminent danger was present.</w:t>
-              <w:br/>
-              <w:t>(3) The burden of proof, stating that he/she is not responsible for damage, is borne by the tenant if the cause of the damage is located in an area of the rental property that is solely accessible to him/her as a rental party.</w:t>
-              <w:br/>
-              <w:t>(4) If the tenant is responsible for damage, he/she is obliged to remedy it immediately. This means an appropriate compensation or the replacement of the damaged inventory.</w:t>
-              <w:br/>
-              <w:t>(5) The tenant is not entitled to make structural modifications to the rented rooms.</w:t>
-            </w:r>
-          </w:p>
-        </w:tc>
-      </w:tr>
-    </w:tbl>
-    <w:p>
-      <w:r>
-        <w:br w:type="page"/>
-      </w:r>
-    </w:p>
-    <w:tbl>
-      <w:tblPr>
-        <w:tblW w:type="auto" w:w="0"/>
-        <w:jc w:val="center"/>
-        <w:tblLook w:firstColumn="1" w:firstRow="1" w:lastColumn="0" w:lastRow="0" w:noHBand="0" w:noVBand="1" w:val="04A0"/>
-      </w:tblPr>
-      <w:tblGrid>
-        <w:gridCol w:w="5184"/>
-        <w:gridCol w:w="5184"/>
-      </w:tblGrid>
-      <w:tr>
-        <w:tc>
-          <w:tcPr>
-            <w:tcW w:type="dxa" w:w="5040"/>
-          </w:tcPr>
-          <w:p>
-            <w:r>
-              <w:rPr>
-                <w:b/>
-                <w:sz w:val="20"/>
-              </w:rPr>
-              <w:t>9. Betreten der Mietsache durch den Vermieter</w:t>
-            </w:r>
-          </w:p>
-        </w:tc>
-        <w:tc>
-          <w:tcPr>
-            <w:tcW w:type="dxa" w:w="5040"/>
-          </w:tcPr>
-          <w:p>
-            <w:r>
-              <w:rPr>
-                <w:b/>
-                <w:sz w:val="20"/>
-              </w:rPr>
-              <w:t>9. Entitlement of the landlord to enter the rental property</w:t>
-            </w:r>
-          </w:p>
-        </w:tc>
-      </w:tr>
-      <w:tr>
-        <w:tc>
-          <w:tcPr>
-            <w:tcW w:type="dxa" w:w="5040"/>
-          </w:tcPr>
-          <w:p>
-            <w:r>
-              <w:rPr>
-                <w:sz w:val="17"/>
-              </w:rPr>
-              <w:t>(1) Zur Überprüfung des Wohnungszustandes, der Feststellung der Notwendigkeit unaufschiebbarer Arbeiten, dem Ablesen der Messgeräte oder zum Zwecke des Verkaufs des Anwesens, ist der Vermieter berechtigt, die Mietsache zusammen mit Handwerkern bzw. Miet- oder Kaufinteressenten nach rechtzeitiger vorheriger Abstimmung mit dem Mieter, zu betreten.</w:t>
-              <w:br/>
-              <w:t>(2) Der Vermieter darf die Wohnung darüber hinaus betreten, wenn eine konkrete Gefahr für die Mietsache oder andere Mieter besteht.</w:t>
-              <w:br/>
-              <w:t>(3) Der Mieter hat dafür Sorge zu tragen, dass der Vermieter diese Rechte auch bei längerer Abwesenheit wahrnehmen kann.</w:t>
-            </w:r>
-          </w:p>
-        </w:tc>
-        <w:tc>
-          <w:tcPr>
-            <w:tcW w:type="dxa" w:w="5040"/>
-          </w:tcPr>
-          <w:p>
-            <w:r>
-              <w:rPr>
-                <w:sz w:val="17"/>
-              </w:rPr>
-              <w:t>(1) In order to check the condition of the apartment, to determine the necessity of work that cannot be postponed, to read the counters, or for the purpose of selling the property, the landlord is entitled to enter the rental property together with craftspeople, prospective tenants or purchasers after timely prior consultation with the tenant.</w:t>
-              <w:br/>
-              <w:t>(2) Furthermore, the landlord may enter the apartment in case of concrete danger to the rental property or other tenants.</w:t>
-              <w:br/>
-              <w:t>(3) The tenant must ensure that the landlord can exercise these rights even in case of an extended absence.</w:t>
-            </w:r>
-          </w:p>
-        </w:tc>
-      </w:tr>
-      <w:tr>
-        <w:tc>
-          <w:tcPr>
-            <w:tcW w:type="dxa" w:w="5040"/>
-          </w:tcPr>
-          <w:p>
-            <w:r>
-              <w:rPr>
-                <w:b/>
-                <w:sz w:val="20"/>
-              </w:rPr>
-              <w:t>10. Rückgabe der Mietsache</w:t>
-            </w:r>
-          </w:p>
-        </w:tc>
-        <w:tc>
-          <w:tcPr>
-            <w:tcW w:type="dxa" w:w="5040"/>
-          </w:tcPr>
-          <w:p>
-            <w:r>
-              <w:rPr>
-                <w:b/>
-                <w:sz w:val="20"/>
-              </w:rPr>
-              <w:t>10. Return of the rental property</w:t>
-            </w:r>
-          </w:p>
-        </w:tc>
-      </w:tr>
-      <w:tr>
-        <w:tc>
-          <w:tcPr>
-            <w:tcW w:type="dxa" w:w="5040"/>
-          </w:tcPr>
-          <w:p>
-            <w:r>
-              <w:rPr>
-                <w:sz w:val="17"/>
-              </w:rPr>
-              <w:t>(1) Bei Ende des Mietvertrages hat der Mieter die vollständig möblierte Mietsache mit sämtlichen Schlüsseln – auch den vom Mieter zusätzlich beschafften – von privaten Gegenständen geräumt und besenrein zu übergeben.</w:t>
-              <w:br/>
-              <w:t>(2) Vom Mieter mitgebrachte Gegenstände sind zu entfernen.</w:t>
-            </w:r>
-          </w:p>
-        </w:tc>
-        <w:tc>
-          <w:tcPr>
-            <w:tcW w:type="dxa" w:w="5040"/>
-          </w:tcPr>
-          <w:p>
-            <w:r>
-              <w:rPr>
-                <w:sz w:val="17"/>
-              </w:rPr>
-              <w:t>(1) Upon termination of the rental agreement, the tenant must return the fully furnished rental property with all keys (including those additionally produced by the tenant), cleared of any private items and swept clean.</w:t>
-              <w:br/>
-              <w:t>(2) Objects brought by the tenant must be removed.</w:t>
-            </w:r>
-          </w:p>
-        </w:tc>
-      </w:tr>
-      <w:tr>
-        <w:tc>
-          <w:tcPr>
-            <w:tcW w:type="dxa" w:w="5040"/>
-          </w:tcPr>
-          <w:p>
-            <w:r>
-              <w:rPr>
-                <w:b/>
-                <w:sz w:val="20"/>
-              </w:rPr>
-              <w:t>11. Erfüllungsort und Gerichtsstand</w:t>
-            </w:r>
-          </w:p>
-        </w:tc>
-        <w:tc>
-          <w:tcPr>
-            <w:tcW w:type="dxa" w:w="5040"/>
-          </w:tcPr>
-          <w:p>
-            <w:r>
-              <w:rPr>
-                <w:b/>
-                <w:sz w:val="20"/>
-              </w:rPr>
-              <w:t>11. Place of performance and jurisdiction</w:t>
-            </w:r>
-          </w:p>
-        </w:tc>
-      </w:tr>
-      <w:tr>
-        <w:tc>
-          <w:tcPr>
-            <w:tcW w:type="dxa" w:w="5040"/>
-          </w:tcPr>
-          <w:p>
-            <w:r>
-              <w:rPr>
-                <w:sz w:val="17"/>
-              </w:rPr>
-              <w:t>Erfüllungsort und Gerichtsstand für alle sich aus diesem Vertrag ergebenden Verpflichtungen ist der Ort der Wohnung.</w:t>
-            </w:r>
-          </w:p>
-        </w:tc>
-        <w:tc>
-          <w:tcPr>
-            <w:tcW w:type="dxa" w:w="5040"/>
-          </w:tcPr>
-          <w:p>
-            <w:r>
-              <w:rPr>
-                <w:sz w:val="17"/>
-              </w:rPr>
-              <w:t>The place of performance and the jurisdiction for all obligations arising from this contract is the location of the apartment.</w:t>
-            </w:r>
-          </w:p>
-        </w:tc>
-      </w:tr>
-      <w:tr>
-        <w:tc>
-          <w:tcPr>
-            <w:tcW w:type="dxa" w:w="5040"/>
-          </w:tcPr>
-          <w:p>
-            <w:r>
-              <w:rPr>
-                <w:b/>
-                <w:sz w:val="20"/>
-              </w:rPr>
-              <w:t>12. Datenschutz</w:t>
-            </w:r>
-          </w:p>
-        </w:tc>
-        <w:tc>
-          <w:tcPr>
-            <w:tcW w:type="dxa" w:w="5040"/>
-          </w:tcPr>
-          <w:p>
-            <w:r>
-              <w:rPr>
-                <w:b/>
-                <w:sz w:val="20"/>
-              </w:rPr>
-              <w:t>12. Data protection</w:t>
-            </w:r>
-          </w:p>
-        </w:tc>
-      </w:tr>
-      <w:tr>
-        <w:tc>
-          <w:tcPr>
-            <w:tcW w:type="dxa" w:w="5040"/>
-          </w:tcPr>
-          <w:p>
-            <w:r>
-              <w:rPr>
-                <w:sz w:val="17"/>
-              </w:rPr>
-              <w:t>Der Mieter hat davon Kenntnis genommen, dass die Daten, die zur ordnungsgemäßen Durchführung der vertraglichen Bestimmungen oder zur üblichen Betreuung des Mieters erforderlich sind, auf Datenträger gespeichert und nach den Bestimmungen der Datenschutzgrundverordnung (DSGVO) bearbeitet werden. Der Mieter erklärt sich mit der Einholung einer Auskunft über seine Zahlungsfähigkeit einverstanden.</w:t>
-            </w:r>
-          </w:p>
-        </w:tc>
-        <w:tc>
-          <w:tcPr>
-            <w:tcW w:type="dxa" w:w="5040"/>
-          </w:tcPr>
-          <w:p>
-            <w:r>
-              <w:rPr>
-                <w:sz w:val="17"/>
-              </w:rPr>
-              <w:t>The tenant is aware that the data required for the proper execution of the contractual provisions or for the regular support of the tenant will be stored on data carriers and processed in accordance with the provisions of the General Data Protection Regulations (GDPR). The tenant agrees to obtain information about his/her solvency.</w:t>
-            </w:r>
-          </w:p>
-        </w:tc>
-      </w:tr>
-      <w:tr>
-        <w:tc>
-          <w:tcPr>
-            <w:tcW w:type="dxa" w:w="5040"/>
-          </w:tcPr>
-          <w:p>
-            <w:r>
-              <w:rPr>
-                <w:b/>
-                <w:sz w:val="20"/>
-              </w:rPr>
-              <w:t>13. Individuelle Vereinbarungen</w:t>
-            </w:r>
-          </w:p>
-        </w:tc>
-        <w:tc>
-          <w:tcPr>
-            <w:tcW w:type="dxa" w:w="5040"/>
-          </w:tcPr>
-          <w:p>
-            <w:r>
-              <w:rPr>
-                <w:b/>
-                <w:sz w:val="20"/>
-              </w:rPr>
-              <w:t>13. Individual stipulations</w:t>
-            </w:r>
-          </w:p>
-        </w:tc>
-      </w:tr>
-      <w:tr>
-        <w:tc>
-          <w:tcPr>
-            <w:tcW w:type="dxa" w:w="5040"/>
-          </w:tcPr>
-          <w:p>
-            <w:r>
-              <w:rPr>
-                <w:sz w:val="17"/>
-              </w:rPr>
-              <w:t>5 % Erhöhung der Miete pro Jahr</w:t>
-              <w:br/>
-              <w:t>Wenn Sie es mit anderen Personen teilen, müssen Sie den Kauf gemeinsamer Gegenstände wie WC-Reinigungsflüssigkeit unter den Mietern einplanen.</w:t>
-            </w:r>
-          </w:p>
-        </w:tc>
-        <w:tc>
-          <w:tcPr>
-            <w:tcW w:type="dxa" w:w="5040"/>
-          </w:tcPr>
-          <w:p>
-            <w:r>
-              <w:rPr>
-                <w:sz w:val="17"/>
-              </w:rPr>
-              <w:t>5% increase on rent/year</w:t>
-              <w:br/>
-              <w:t>if shared with other people, need to plan buying common items like wc cleaning liquid among tenants.</w:t>
-            </w:r>
-          </w:p>
-        </w:tc>
-      </w:tr>
-    </w:tbl>
-    <w:p>
-      <w:r>
-        <w:br w:type="page"/>
-      </w:r>
-    </w:p>
-    <w:tbl>
-      <w:tblPr>
-        <w:tblW w:type="auto" w:w="0"/>
-        <w:jc w:val="center"/>
-        <w:tblLook w:firstColumn="1" w:firstRow="1" w:lastColumn="0" w:lastRow="0" w:noHBand="0" w:noVBand="1" w:val="04A0"/>
-      </w:tblPr>
-      <w:tblGrid>
-        <w:gridCol w:w="5184"/>
-        <w:gridCol w:w="5184"/>
-      </w:tblGrid>
-      <w:tr>
-        <w:tc>
-          <w:tcPr>
-            <w:tcW w:type="dxa" w:w="5040"/>
-          </w:tcPr>
-          <w:p>
-            <w:r>
-              <w:rPr>
-                <w:b/>
-                <w:sz w:val="20"/>
-              </w:rPr>
-              <w:t>14. Salvatorische Klausel</w:t>
-            </w:r>
-          </w:p>
-        </w:tc>
-        <w:tc>
-          <w:tcPr>
-            <w:tcW w:type="dxa" w:w="5040"/>
-          </w:tcPr>
-          <w:p>
-            <w:r>
-              <w:rPr>
-                <w:b/>
-                <w:sz w:val="20"/>
-              </w:rPr>
-              <w:t>14. Severability clause</w:t>
-            </w:r>
-          </w:p>
-        </w:tc>
-      </w:tr>
-      <w:tr>
-        <w:tc>
-          <w:tcPr>
-            <w:tcW w:type="dxa" w:w="5040"/>
-          </w:tcPr>
-          <w:p>
-            <w:r>
-              <w:rPr>
-                <w:sz w:val="17"/>
-              </w:rPr>
-              <w:t>Soweit eine der Bestimmungen dieses Mietvertrages, gleich aus welchem Grund, unwirksam sein sollte, gelten die übrigen Bestimmungen unverändert fort. Die Vertragspartner vereinbaren jedoch bereits jetzt eine unwirksame Bestimmung durch eine gültige Bestimmung zu ersetzen, die dem gewollten Zweck in gesetzlich zulässiger Weise am nächsten kommt.</w:t>
-            </w:r>
-          </w:p>
-        </w:tc>
-        <w:tc>
-          <w:tcPr>
-            <w:tcW w:type="dxa" w:w="5040"/>
-          </w:tcPr>
-          <w:p>
-            <w:r>
-              <w:rPr>
-                <w:sz w:val="17"/>
-              </w:rPr>
-              <w:t>Should one of the provisions of this rental agreement be invalid for any reason whatsoever, the remaining provisions shall continue to apply, unchanged. Nevertheless, the contracting parties hereby agree to replace an invalid provision with a valid provision which comes closest to the intended purpose in a lawful manner.</w:t>
-            </w:r>
-          </w:p>
-        </w:tc>
-      </w:tr>
-    </w:tbl>
-    <w:p/>
-    <w:tbl>
-      <w:tblPr>
-        <w:tblW w:type="auto" w:w="0"/>
-        <w:jc w:val="center"/>
-        <w:tblLook w:firstColumn="1" w:firstRow="1" w:lastColumn="0" w:lastRow="0" w:noHBand="0" w:noVBand="1" w:val="04A0"/>
-      </w:tblPr>
-      <w:tblGrid>
-        <w:gridCol w:w="5040"/>
-        <w:gridCol w:w="5040"/>
-      </w:tblGrid>
-      <w:tr>
-        <w:tc>
-          <w:tcPr>
-            <w:tcW w:type="dxa" w:w="5184"/>
-          </w:tcPr>
-          <w:p>
-            <w:r>
-              <w:rPr>
-                <w:b/>
-              </w:rPr>
-              <w:t>Kylasam Nallagoundanpalayam Arruchamy</w:t>
-            </w:r>
-          </w:p>
-        </w:tc>
-        <w:tc>
-          <w:tcPr>
-            <w:tcW w:type="dxa" w:w="5184"/>
-          </w:tcPr>
-          <w:p>
-            <w:r>
-              <w:rPr>
-                <w:b/>
-              </w:rPr>
-              <w:t>Bhargavi Mangesh Ayare</w:t>
-            </w:r>
-          </w:p>
-        </w:tc>
-      </w:tr>
-      <w:tr>
-        <w:tc>
-          <w:tcPr>
-            <w:tcW w:type="dxa" w:w="5184"/>
-          </w:tcPr>
-          <w:p>
-            <w:r>
-              <w:rPr>
-                <w:sz w:val="17"/>
-              </w:rPr>
-              <w:t>20 Mar 2025, 10:39 GMT</w:t>
-            </w:r>
-          </w:p>
-        </w:tc>
-        <w:tc>
-          <w:tcPr>
-            <w:tcW w:type="dxa" w:w="5184"/>
-          </w:tcPr>
-          <w:p>
-            <w:r>
-              <w:rPr>
-                <w:sz w:val="17"/>
-              </w:rPr>
-              <w:t>21 Mar 2025, 12:36 GMT</w:t>
-            </w:r>
-          </w:p>
-        </w:tc>
-      </w:tr>
-      <w:tr>
-        <w:tc>
-          <w:tcPr>
-            <w:tcW w:type="dxa" w:w="5184"/>
-          </w:tcPr>
-          <w:p>
-            <w:r>
-              <w:rPr>
-                <w:b/>
-              </w:rPr>
-              <w:t>Vom Vermieter akzeptiert</w:t>
-            </w:r>
-          </w:p>
-        </w:tc>
-        <w:tc>
-          <w:tcPr>
-            <w:tcW w:type="dxa" w:w="5184"/>
-          </w:tcPr>
-          <w:p>
-            <w:r>
-              <w:rPr>
-                <w:b/>
-              </w:rPr>
-              <w:t>Vom Mieter akzeptiert</w:t>
-            </w:r>
-          </w:p>
-        </w:tc>
-      </w:tr>
-      <w:tr>
-        <w:tc>
-          <w:tcPr>
-            <w:tcW w:type="dxa" w:w="5184"/>
-          </w:tcPr>
-          <w:p>
-            <w:r>
-              <w:rPr>
-                <w:sz w:val="17"/>
-              </w:rPr>
-              <w:t>Accepted by Landlord</w:t>
-            </w:r>
-          </w:p>
-        </w:tc>
-        <w:tc>
-          <w:tcPr>
-            <w:tcW w:type="dxa" w:w="5184"/>
-          </w:tcPr>
-          <w:p>
-            <w:r>
-              <w:rPr>
-                <w:sz w:val="17"/>
-              </w:rPr>
-              <w:t>Accepted by Tenant</w:t>
+              <w:t>Invalid clauses do not affect the remaining agreement. Sole legal jurisdiction is Berlin, Germany.</w:t>
             </w:r>
           </w:p>
         </w:tc>
@@ -1633,7 +1565,7 @@
     </w:tbl>
     <w:sectPr>
       <w:pgSz w:w="12240" w:h="15840"/>
-      <w:pgMar w:top="864" w:right="936" w:bottom="864" w:left="936" w:header="720" w:footer="720" w:gutter="0"/>
+      <w:pgMar w:top="1008" w:right="1008" w:bottom="1008" w:left="1008" w:header="720" w:footer="720" w:gutter="0"/>
       <w:cols w:space="720"/>
       <w:docGrid w:linePitch="360"/>
     </w:sectPr>

</xml_diff>